<commit_message>
Adding new ZSight documentation realted to Geolocation Reference
</commit_message>
<xml_diff>
--- a/2026/UpdatedPolicies/DevSec_CI_CD_Hardening_Policy_v1.0.docx
+++ b/2026/UpdatedPolicies/DevSec_CI_CD_Hardening_Policy_v1.0.docx
@@ -1,6 +1,6 @@
 
 <file path=word/document.xml><?xml version="1.0" encoding="utf-8"?>
-<w:document xmlns:wpc="http://schemas.microsoft.com/office/word/2010/wordprocessingCanvas" xmlns:cx="http://schemas.microsoft.com/office/drawing/2014/chartex" xmlns:cx1="http://schemas.microsoft.com/office/drawing/2015/9/8/chartex" xmlns:cx2="http://schemas.microsoft.com/office/drawing/2015/10/21/chartex" xmlns:cx3="http://schemas.microsoft.com/office/drawing/2016/5/9/chartex" xmlns:cx4="http://schemas.microsoft.com/office/drawing/2016/5/10/chartex" xmlns:cx5="http://schemas.microsoft.com/office/drawing/2016/5/11/chartex" xmlns:cx6="http://schemas.microsoft.com/office/drawing/2016/5/12/chartex" xmlns:cx7="http://schemas.microsoft.com/office/drawing/2016/5/13/chartex" xmlns:cx8="http://schemas.microsoft.com/office/drawing/2016/5/14/chartex" xmlns:mc="http://schemas.openxmlformats.org/markup-compatibility/2006" xmlns:aink="http://schemas.microsoft.com/office/drawing/2016/ink" xmlns:am3d="http://schemas.microsoft.com/office/drawing/2017/model3d" xmlns:o="urn:schemas-microsoft-com:office:office" xmlns:oel="http://schemas.microsoft.com/office/2019/extlst" xmlns:r="http://schemas.openxmlformats.org/officeDocument/2006/relationships" xmlns:m="http://schemas.openxmlformats.org/officeDocument/2006/math" xmlns:v="urn:schemas-microsoft-com:vml" xmlns:wp14="http://schemas.microsoft.com/office/word/2010/wordprocessingDrawing" xmlns:wp="http://schemas.openxmlformats.org/drawingml/2006/wordprocessingDrawing" xmlns:w10="urn:schemas-microsoft-com:office:word" xmlns:w="http://schemas.openxmlformats.org/wordprocessingml/2006/main" xmlns:w14="http://schemas.microsoft.com/office/word/2010/wordml" xmlns:w15="http://schemas.microsoft.com/office/word/2012/wordml" xmlns:w16cex="http://schemas.microsoft.com/office/word/2018/wordml/cex" xmlns:w16cid="http://schemas.microsoft.com/office/word/2016/wordml/cid" xmlns:w16="http://schemas.microsoft.com/office/word/2018/wordml" xmlns:w16du="http://schemas.microsoft.com/office/word/2023/wordml/word16du" xmlns:w16sdtdh="http://schemas.microsoft.com/office/word/2020/wordml/sdtdatahash" xmlns:w16sdtfl="http://schemas.microsoft.com/office/word/2024/wordml/sdtformatlock" xmlns:w16se="http://schemas.microsoft.com/office/word/2015/wordml/symex" xmlns:wpg="http://schemas.microsoft.com/office/word/2010/wordprocessingGroup" xmlns:wpi="http://schemas.microsoft.com/office/word/2010/wordprocessingInk" xmlns:wne="http://schemas.microsoft.com/office/word/2006/wordml" xmlns:wps="http://schemas.microsoft.com/office/word/2010/wordprocessingShape" mc:Ignorable="w14 w15 w16se w16cid w16 w16cex w16sdtdh w16sdtfl w16du wp14">
+<w:document xmlns:wpc="http://schemas.microsoft.com/office/word/2010/wordprocessingCanvas" xmlns:cx="http://schemas.microsoft.com/office/drawing/2014/chartex" xmlns:cx1="http://schemas.microsoft.com/office/drawing/2015/9/8/chartex" xmlns:cx2="http://schemas.microsoft.com/office/drawing/2015/10/21/chartex" xmlns:cx3="http://schemas.microsoft.com/office/drawing/2016/5/9/chartex" xmlns:cx4="http://schemas.microsoft.com/office/drawing/2016/5/10/chartex" xmlns:cx5="http://schemas.microsoft.com/office/drawing/2016/5/11/chartex" xmlns:cx6="http://schemas.microsoft.com/office/drawing/2016/5/12/chartex" xmlns:cx7="http://schemas.microsoft.com/office/drawing/2016/5/13/chartex" xmlns:cx8="http://schemas.microsoft.com/office/drawing/2016/5/14/chartex" xmlns:mc="http://schemas.openxmlformats.org/markup-compatibility/2006" xmlns:aink="http://schemas.microsoft.com/office/drawing/2016/ink" xmlns:am3d="http://schemas.microsoft.com/office/drawing/2017/model3d" xmlns:o="urn:schemas-microsoft-com:office:office" xmlns:oel="http://schemas.microsoft.com/office/2019/extlst" xmlns:r="http://schemas.openxmlformats.org/officeDocument/2006/relationships" xmlns:m="http://schemas.openxmlformats.org/officeDocument/2006/math" xmlns:v="urn:schemas-microsoft-com:vml" xmlns:wp14="http://schemas.microsoft.com/office/word/2010/wordprocessingDrawing" xmlns:wp="http://schemas.openxmlformats.org/drawingml/2006/wordprocessingDrawing" xmlns:w10="urn:schemas-microsoft-com:office:word" xmlns:w="http://schemas.openxmlformats.org/wordprocessingml/2006/main" xmlns:w14="http://schemas.microsoft.com/office/word/2010/wordml" xmlns:w15="http://schemas.microsoft.com/office/word/2012/wordml" xmlns:w16cei="http://schemas.microsoft.com/office/word/2026/wordml/cei" xmlns:w16cex="http://schemas.microsoft.com/office/word/2018/wordml/cex" xmlns:w16cid="http://schemas.microsoft.com/office/word/2016/wordml/cid" xmlns:w16="http://schemas.microsoft.com/office/word/2018/wordml" xmlns:w16du="http://schemas.microsoft.com/office/word/2023/wordml/word16du" xmlns:w16sdtdh="http://schemas.microsoft.com/office/word/2020/wordml/sdtdatahash" xmlns:w16sdtfl="http://schemas.microsoft.com/office/word/2024/wordml/sdtformatlock" xmlns:w16se="http://schemas.microsoft.com/office/word/2015/wordml/symex" xmlns:wpg="http://schemas.microsoft.com/office/word/2010/wordprocessingGroup" xmlns:wpi="http://schemas.microsoft.com/office/word/2010/wordprocessingInk" xmlns:wne="http://schemas.microsoft.com/office/word/2006/wordml" xmlns:wps="http://schemas.microsoft.com/office/word/2010/wordprocessingShape" mc:Ignorable="w14 w15 w16se w16cid w16 w16cex w16sdtdh w16sdtfl w16du wp14">
   <w:body>
     <w:p/>
     <w:p/>
@@ -11,19 +11,9 @@
         <w:pStyle w:val="ZTERSTitle"/>
       </w:pPr>
       <w:r>
-        <w:t>deployment hardening policy</w:t>
+        <w:t>deployment hardening policy (policy)</w:t>
       </w:r>
-      <w:r>
-        <w:t xml:space="preserve"> (</w:t>
-      </w:r>
-      <w:r>
-        <w:t>policy</w:t>
-      </w:r>
-      <w:r>
-        <w:t>)</w:t>
-      </w:r>
-    </w:p>
-    <w:p/>
+    </w:p>
     <w:p/>
     <w:p/>
     <w:p/>
@@ -111,7 +101,7 @@
       </w:tblPr>
       <w:tblGrid>
         <w:gridCol w:w="2250"/>
-        <w:gridCol w:w="3240"/>
+        <w:gridCol w:w="3796"/>
       </w:tblGrid>
       <w:tr>
         <w:tc>
@@ -136,49 +126,49 @@
         </w:tc>
         <w:tc>
           <w:tcPr>
-            <w:tcW w:w="3240" w:type="dxa"/>
-          </w:tcPr>
-          <w:p>
-            <w:pPr>
-              <w:rPr>
-                <w:sz w:val="20"/>
-                <w:szCs w:val="20"/>
-              </w:rPr>
-            </w:pPr>
-            <w:r>
-              <w:rPr>
-                <w:sz w:val="20"/>
-                <w:szCs w:val="20"/>
-              </w:rPr>
-              <w:t>DEV</w:t>
-            </w:r>
-            <w:r>
-              <w:rPr>
-                <w:sz w:val="20"/>
-                <w:szCs w:val="20"/>
-              </w:rPr>
-              <w:t>-</w:t>
-            </w:r>
-            <w:r>
-              <w:rPr>
-                <w:sz w:val="20"/>
-                <w:szCs w:val="20"/>
-              </w:rPr>
-              <w:t>SEC-POL</w:t>
-            </w:r>
-            <w:r>
-              <w:rPr>
-                <w:sz w:val="20"/>
-                <w:szCs w:val="20"/>
-              </w:rPr>
-              <w:t>-001</w:t>
-            </w:r>
-            <w:r>
-              <w:rPr>
-                <w:sz w:val="20"/>
-                <w:szCs w:val="20"/>
-              </w:rPr>
-              <w:t>-v1.0</w:t>
+            <w:tcW w:w="3510" w:type="dxa"/>
+          </w:tcPr>
+          <w:p>
+            <w:pPr>
+              <w:rPr>
+                <w:sz w:val="20"/>
+                <w:szCs w:val="20"/>
+              </w:rPr>
+            </w:pPr>
+            <w:r>
+              <w:rPr>
+                <w:sz w:val="20"/>
+                <w:szCs w:val="20"/>
+              </w:rPr>
+              <w:t>DevSec_</w:t>
+            </w:r>
+            <w:r>
+              <w:rPr>
+                <w:sz w:val="20"/>
+                <w:szCs w:val="20"/>
+              </w:rPr>
+              <w:t>CI_CD</w:t>
+            </w:r>
+            <w:r>
+              <w:rPr>
+                <w:sz w:val="20"/>
+                <w:szCs w:val="20"/>
+              </w:rPr>
+              <w:t>_</w:t>
+            </w:r>
+            <w:r>
+              <w:rPr>
+                <w:sz w:val="20"/>
+                <w:szCs w:val="20"/>
+              </w:rPr>
+              <w:t>Hardening_</w:t>
+            </w:r>
+            <w:r>
+              <w:rPr>
+                <w:sz w:val="20"/>
+                <w:szCs w:val="20"/>
+              </w:rPr>
+              <w:t>Policy_v1.0</w:t>
             </w:r>
           </w:p>
         </w:tc>
@@ -206,21 +196,21 @@
         </w:tc>
         <w:tc>
           <w:tcPr>
-            <w:tcW w:w="3240" w:type="dxa"/>
-          </w:tcPr>
-          <w:p>
-            <w:pPr>
-              <w:rPr>
-                <w:sz w:val="20"/>
-                <w:szCs w:val="20"/>
-              </w:rPr>
-            </w:pPr>
-            <w:r>
-              <w:rPr>
-                <w:sz w:val="20"/>
-                <w:szCs w:val="20"/>
-              </w:rPr>
-              <w:t>SEC</w:t>
+            <w:tcW w:w="3510" w:type="dxa"/>
+          </w:tcPr>
+          <w:p>
+            <w:pPr>
+              <w:rPr>
+                <w:sz w:val="20"/>
+                <w:szCs w:val="20"/>
+              </w:rPr>
+            </w:pPr>
+            <w:r>
+              <w:rPr>
+                <w:sz w:val="20"/>
+                <w:szCs w:val="20"/>
+              </w:rPr>
+              <w:t>Sec</w:t>
             </w:r>
           </w:p>
         </w:tc>
@@ -248,21 +238,21 @@
         </w:tc>
         <w:tc>
           <w:tcPr>
-            <w:tcW w:w="3240" w:type="dxa"/>
-          </w:tcPr>
-          <w:p>
-            <w:pPr>
-              <w:rPr>
-                <w:sz w:val="20"/>
-                <w:szCs w:val="20"/>
-              </w:rPr>
-            </w:pPr>
-            <w:r>
-              <w:rPr>
-                <w:sz w:val="20"/>
-                <w:szCs w:val="20"/>
-              </w:rPr>
-              <w:t>ALL</w:t>
+            <w:tcW w:w="3510" w:type="dxa"/>
+          </w:tcPr>
+          <w:p>
+            <w:pPr>
+              <w:rPr>
+                <w:sz w:val="20"/>
+                <w:szCs w:val="20"/>
+              </w:rPr>
+            </w:pPr>
+            <w:r>
+              <w:rPr>
+                <w:sz w:val="20"/>
+                <w:szCs w:val="20"/>
+              </w:rPr>
+              <w:t>All</w:t>
             </w:r>
           </w:p>
         </w:tc>
@@ -290,21 +280,21 @@
         </w:tc>
         <w:tc>
           <w:tcPr>
-            <w:tcW w:w="3240" w:type="dxa"/>
-          </w:tcPr>
-          <w:p>
-            <w:pPr>
-              <w:rPr>
-                <w:sz w:val="20"/>
-                <w:szCs w:val="20"/>
-              </w:rPr>
-            </w:pPr>
-            <w:r>
-              <w:rPr>
-                <w:sz w:val="20"/>
-                <w:szCs w:val="20"/>
-              </w:rPr>
-              <w:t>Internal / Confidential</w:t>
+            <w:tcW w:w="3510" w:type="dxa"/>
+          </w:tcPr>
+          <w:p>
+            <w:pPr>
+              <w:rPr>
+                <w:sz w:val="20"/>
+                <w:szCs w:val="20"/>
+              </w:rPr>
+            </w:pPr>
+            <w:r>
+              <w:rPr>
+                <w:sz w:val="20"/>
+                <w:szCs w:val="20"/>
+              </w:rPr>
+              <w:t>Internal / Restricted / Confidential</w:t>
             </w:r>
           </w:p>
         </w:tc>
@@ -316,13 +306,21 @@
       </w:r>
     </w:p>
     <w:p/>
-    <w:p/>
-    <w:p/>
-    <w:p/>
+    <w:p>
+      <w:pPr>
+        <w:pStyle w:val="NoSpacing"/>
+      </w:pPr>
+    </w:p>
+    <w:p>
+      <w:pPr>
+        <w:pStyle w:val="NoSpacing"/>
+      </w:pPr>
+    </w:p>
     <w:sdt>
       <w:sdtPr>
         <w:rPr>
           <w:rFonts w:ascii="Arial" w:eastAsiaTheme="minorHAnsi" w:hAnsi="Arial" w:cstheme="minorBidi"/>
+          <w:b w:val="0"/>
           <w:caps w:val="0"/>
           <w:color w:val="auto"/>
           <w:kern w:val="2"/>
@@ -330,7 +328,7 @@
           <w:szCs w:val="22"/>
           <w14:ligatures w14:val="standardContextual"/>
         </w:rPr>
-        <w:id w:val="-2027396413"/>
+        <w:id w:val="-1655524919"/>
         <w:docPartObj>
           <w:docPartGallery w:val="Table of Contents"/>
           <w:docPartUnique/>
@@ -338,7 +336,6 @@
       </w:sdtPr>
       <w:sdtEndPr>
         <w:rPr>
-          <w:b/>
           <w:bCs/>
           <w:noProof/>
         </w:rPr>
@@ -347,54 +344,35 @@
         <w:p>
           <w:pPr>
             <w:pStyle w:val="TOCHeading"/>
-            <w:spacing w:before="60" w:after="360"/>
-            <w:ind w:right="-360"/>
-            <w:rPr>
-              <w:rFonts w:ascii="Arial" w:hAnsi="Arial" w:cs="Arial"/>
-              <w:b/>
-              <w:bCs/>
-              <w:color w:val="4F7ABA"/>
-              <w:sz w:val="36"/>
-              <w:szCs w:val="36"/>
-            </w:rPr>
           </w:pPr>
           <w:r>
-            <w:rPr>
-              <w:rFonts w:ascii="Arial" w:hAnsi="Arial" w:cs="Arial"/>
-              <w:b/>
-              <w:bCs/>
-              <w:color w:val="4F7ABA"/>
-              <w:sz w:val="36"/>
-              <w:szCs w:val="36"/>
-            </w:rPr>
-            <w:t>CONTENTS</w:t>
+            <w:t>Contents</w:t>
           </w:r>
         </w:p>
         <w:p>
           <w:pPr>
             <w:pStyle w:val="TOC1"/>
+            <w:tabs>
+              <w:tab w:val="right" w:leader="dot" w:pos="10530"/>
+            </w:tabs>
             <w:rPr>
               <w:rFonts w:asciiTheme="minorHAnsi" w:eastAsiaTheme="minorEastAsia" w:hAnsiTheme="minorHAnsi"/>
+              <w:b w:val="0"/>
+              <w:caps w:val="0"/>
               <w:sz w:val="24"/>
               <w:szCs w:val="24"/>
             </w:rPr>
           </w:pPr>
           <w:r>
-            <w:rPr>
-              <w:noProof w:val="0"/>
-            </w:rPr>
             <w:fldChar w:fldCharType="begin"/>
           </w:r>
           <w:r>
             <w:instrText xml:space="preserve"> TOC \o "1-3" \h \z \u </w:instrText>
           </w:r>
           <w:r>
-            <w:rPr>
-              <w:noProof w:val="0"/>
-            </w:rPr>
             <w:fldChar w:fldCharType="separate"/>
           </w:r>
-          <w:hyperlink w:anchor="_Toc221453971" w:history="1">
+          <w:hyperlink w:anchor="_Toc237288107" w:history="1">
             <w:r>
               <w:rPr>
                 <w:rStyle w:val="Hyperlink"/>
@@ -404,6 +382,8 @@
             <w:r>
               <w:rPr>
                 <w:rFonts w:asciiTheme="minorHAnsi" w:eastAsiaTheme="minorEastAsia" w:hAnsiTheme="minorHAnsi"/>
+                <w:b w:val="0"/>
+                <w:caps w:val="0"/>
                 <w:sz w:val="24"/>
                 <w:szCs w:val="24"/>
               </w:rPr>
@@ -431,7 +411,7 @@
               <w:rPr>
                 <w:webHidden/>
               </w:rPr>
-              <w:instrText xml:space="preserve"> PAGEREF _Toc221453971 \h </w:instrText>
+              <w:instrText xml:space="preserve"> PAGEREF _Toc237288107 \h </w:instrText>
             </w:r>
             <w:r>
               <w:rPr>
@@ -461,6 +441,10 @@
         <w:p>
           <w:pPr>
             <w:pStyle w:val="TOC2"/>
+            <w:tabs>
+              <w:tab w:val="left" w:pos="960"/>
+              <w:tab w:val="right" w:leader="dot" w:pos="10530"/>
+            </w:tabs>
             <w:rPr>
               <w:rFonts w:asciiTheme="minorHAnsi" w:eastAsiaTheme="minorEastAsia" w:hAnsiTheme="minorHAnsi"/>
               <w:noProof/>
@@ -468,7 +452,7 @@
               <w:szCs w:val="24"/>
             </w:rPr>
           </w:pPr>
-          <w:hyperlink w:anchor="_Toc221453972" w:history="1">
+          <w:hyperlink w:anchor="_Toc237288108" w:history="1">
             <w:r>
               <w:rPr>
                 <w:rStyle w:val="Hyperlink"/>
@@ -511,7 +495,7 @@
                 <w:noProof/>
                 <w:webHidden/>
               </w:rPr>
-              <w:instrText xml:space="preserve"> PAGEREF _Toc221453972 \h </w:instrText>
+              <w:instrText xml:space="preserve"> PAGEREF _Toc237288108 \h </w:instrText>
             </w:r>
             <w:r>
               <w:rPr>
@@ -545,6 +529,10 @@
         <w:p>
           <w:pPr>
             <w:pStyle w:val="TOC2"/>
+            <w:tabs>
+              <w:tab w:val="left" w:pos="960"/>
+              <w:tab w:val="right" w:leader="dot" w:pos="10530"/>
+            </w:tabs>
             <w:rPr>
               <w:rFonts w:asciiTheme="minorHAnsi" w:eastAsiaTheme="minorEastAsia" w:hAnsiTheme="minorHAnsi"/>
               <w:noProof/>
@@ -552,7 +540,7 @@
               <w:szCs w:val="24"/>
             </w:rPr>
           </w:pPr>
-          <w:hyperlink w:anchor="_Toc221453973" w:history="1">
+          <w:hyperlink w:anchor="_Toc237288109" w:history="1">
             <w:r>
               <w:rPr>
                 <w:rStyle w:val="Hyperlink"/>
@@ -595,7 +583,7 @@
                 <w:noProof/>
                 <w:webHidden/>
               </w:rPr>
-              <w:instrText xml:space="preserve"> PAGEREF _Toc221453973 \h </w:instrText>
+              <w:instrText xml:space="preserve"> PAGEREF _Toc237288109 \h </w:instrText>
             </w:r>
             <w:r>
               <w:rPr>
@@ -629,6 +617,10 @@
         <w:p>
           <w:pPr>
             <w:pStyle w:val="TOC2"/>
+            <w:tabs>
+              <w:tab w:val="left" w:pos="960"/>
+              <w:tab w:val="right" w:leader="dot" w:pos="10530"/>
+            </w:tabs>
             <w:rPr>
               <w:rFonts w:asciiTheme="minorHAnsi" w:eastAsiaTheme="minorEastAsia" w:hAnsiTheme="minorHAnsi"/>
               <w:noProof/>
@@ -636,7 +628,7 @@
               <w:szCs w:val="24"/>
             </w:rPr>
           </w:pPr>
-          <w:hyperlink w:anchor="_Toc221453974" w:history="1">
+          <w:hyperlink w:anchor="_Toc237288110" w:history="1">
             <w:r>
               <w:rPr>
                 <w:rStyle w:val="Hyperlink"/>
@@ -679,7 +671,7 @@
                 <w:noProof/>
                 <w:webHidden/>
               </w:rPr>
-              <w:instrText xml:space="preserve"> PAGEREF _Toc221453974 \h </w:instrText>
+              <w:instrText xml:space="preserve"> PAGEREF _Toc237288110 \h </w:instrText>
             </w:r>
             <w:r>
               <w:rPr>
@@ -713,13 +705,18 @@
         <w:p>
           <w:pPr>
             <w:pStyle w:val="TOC1"/>
+            <w:tabs>
+              <w:tab w:val="right" w:leader="dot" w:pos="10530"/>
+            </w:tabs>
             <w:rPr>
               <w:rFonts w:asciiTheme="minorHAnsi" w:eastAsiaTheme="minorEastAsia" w:hAnsiTheme="minorHAnsi"/>
+              <w:b w:val="0"/>
+              <w:caps w:val="0"/>
               <w:sz w:val="24"/>
               <w:szCs w:val="24"/>
             </w:rPr>
           </w:pPr>
-          <w:hyperlink w:anchor="_Toc221453975" w:history="1">
+          <w:hyperlink w:anchor="_Toc237288111" w:history="1">
             <w:r>
               <w:rPr>
                 <w:rStyle w:val="Hyperlink"/>
@@ -729,6 +726,8 @@
             <w:r>
               <w:rPr>
                 <w:rFonts w:asciiTheme="minorHAnsi" w:eastAsiaTheme="minorEastAsia" w:hAnsiTheme="minorHAnsi"/>
+                <w:b w:val="0"/>
+                <w:caps w:val="0"/>
                 <w:sz w:val="24"/>
                 <w:szCs w:val="24"/>
               </w:rPr>
@@ -756,7 +755,7 @@
               <w:rPr>
                 <w:webHidden/>
               </w:rPr>
-              <w:instrText xml:space="preserve"> PAGEREF _Toc221453975 \h </w:instrText>
+              <w:instrText xml:space="preserve"> PAGEREF _Toc237288111 \h </w:instrText>
             </w:r>
             <w:r>
               <w:rPr>
@@ -786,6 +785,10 @@
         <w:p>
           <w:pPr>
             <w:pStyle w:val="TOC2"/>
+            <w:tabs>
+              <w:tab w:val="left" w:pos="960"/>
+              <w:tab w:val="right" w:leader="dot" w:pos="10530"/>
+            </w:tabs>
             <w:rPr>
               <w:rFonts w:asciiTheme="minorHAnsi" w:eastAsiaTheme="minorEastAsia" w:hAnsiTheme="minorHAnsi"/>
               <w:noProof/>
@@ -793,7 +796,7 @@
               <w:szCs w:val="24"/>
             </w:rPr>
           </w:pPr>
-          <w:hyperlink w:anchor="_Toc221453976" w:history="1">
+          <w:hyperlink w:anchor="_Toc237288112" w:history="1">
             <w:r>
               <w:rPr>
                 <w:rStyle w:val="Hyperlink"/>
@@ -836,7 +839,7 @@
                 <w:noProof/>
                 <w:webHidden/>
               </w:rPr>
-              <w:instrText xml:space="preserve"> PAGEREF _Toc221453976 \h </w:instrText>
+              <w:instrText xml:space="preserve"> PAGEREF _Toc237288112 \h </w:instrText>
             </w:r>
             <w:r>
               <w:rPr>
@@ -870,6 +873,10 @@
         <w:p>
           <w:pPr>
             <w:pStyle w:val="TOC2"/>
+            <w:tabs>
+              <w:tab w:val="left" w:pos="960"/>
+              <w:tab w:val="right" w:leader="dot" w:pos="10530"/>
+            </w:tabs>
             <w:rPr>
               <w:rFonts w:asciiTheme="minorHAnsi" w:eastAsiaTheme="minorEastAsia" w:hAnsiTheme="minorHAnsi"/>
               <w:noProof/>
@@ -877,7 +884,7 @@
               <w:szCs w:val="24"/>
             </w:rPr>
           </w:pPr>
-          <w:hyperlink w:anchor="_Toc221453977" w:history="1">
+          <w:hyperlink w:anchor="_Toc237288113" w:history="1">
             <w:r>
               <w:rPr>
                 <w:rStyle w:val="Hyperlink"/>
@@ -920,7 +927,7 @@
                 <w:noProof/>
                 <w:webHidden/>
               </w:rPr>
-              <w:instrText xml:space="preserve"> PAGEREF _Toc221453977 \h </w:instrText>
+              <w:instrText xml:space="preserve"> PAGEREF _Toc237288113 \h </w:instrText>
             </w:r>
             <w:r>
               <w:rPr>
@@ -954,6 +961,10 @@
         <w:p>
           <w:pPr>
             <w:pStyle w:val="TOC2"/>
+            <w:tabs>
+              <w:tab w:val="left" w:pos="960"/>
+              <w:tab w:val="right" w:leader="dot" w:pos="10530"/>
+            </w:tabs>
             <w:rPr>
               <w:rFonts w:asciiTheme="minorHAnsi" w:eastAsiaTheme="minorEastAsia" w:hAnsiTheme="minorHAnsi"/>
               <w:noProof/>
@@ -961,7 +972,7 @@
               <w:szCs w:val="24"/>
             </w:rPr>
           </w:pPr>
-          <w:hyperlink w:anchor="_Toc221453978" w:history="1">
+          <w:hyperlink w:anchor="_Toc237288114" w:history="1">
             <w:r>
               <w:rPr>
                 <w:rStyle w:val="Hyperlink"/>
@@ -1004,7 +1015,7 @@
                 <w:noProof/>
                 <w:webHidden/>
               </w:rPr>
-              <w:instrText xml:space="preserve"> PAGEREF _Toc221453978 \h </w:instrText>
+              <w:instrText xml:space="preserve"> PAGEREF _Toc237288114 \h </w:instrText>
             </w:r>
             <w:r>
               <w:rPr>
@@ -1038,6 +1049,10 @@
         <w:p>
           <w:pPr>
             <w:pStyle w:val="TOC2"/>
+            <w:tabs>
+              <w:tab w:val="left" w:pos="960"/>
+              <w:tab w:val="right" w:leader="dot" w:pos="10530"/>
+            </w:tabs>
             <w:rPr>
               <w:rFonts w:asciiTheme="minorHAnsi" w:eastAsiaTheme="minorEastAsia" w:hAnsiTheme="minorHAnsi"/>
               <w:noProof/>
@@ -1045,7 +1060,7 @@
               <w:szCs w:val="24"/>
             </w:rPr>
           </w:pPr>
-          <w:hyperlink w:anchor="_Toc221453979" w:history="1">
+          <w:hyperlink w:anchor="_Toc237288115" w:history="1">
             <w:r>
               <w:rPr>
                 <w:rStyle w:val="Hyperlink"/>
@@ -1088,7 +1103,7 @@
                 <w:noProof/>
                 <w:webHidden/>
               </w:rPr>
-              <w:instrText xml:space="preserve"> PAGEREF _Toc221453979 \h </w:instrText>
+              <w:instrText xml:space="preserve"> PAGEREF _Toc237288115 \h </w:instrText>
             </w:r>
             <w:r>
               <w:rPr>
@@ -1122,6 +1137,10 @@
         <w:p>
           <w:pPr>
             <w:pStyle w:val="TOC2"/>
+            <w:tabs>
+              <w:tab w:val="left" w:pos="960"/>
+              <w:tab w:val="right" w:leader="dot" w:pos="10530"/>
+            </w:tabs>
             <w:rPr>
               <w:rFonts w:asciiTheme="minorHAnsi" w:eastAsiaTheme="minorEastAsia" w:hAnsiTheme="minorHAnsi"/>
               <w:noProof/>
@@ -1129,7 +1148,7 @@
               <w:szCs w:val="24"/>
             </w:rPr>
           </w:pPr>
-          <w:hyperlink w:anchor="_Toc221453980" w:history="1">
+          <w:hyperlink w:anchor="_Toc237288116" w:history="1">
             <w:r>
               <w:rPr>
                 <w:rStyle w:val="Hyperlink"/>
@@ -1172,7 +1191,7 @@
                 <w:noProof/>
                 <w:webHidden/>
               </w:rPr>
-              <w:instrText xml:space="preserve"> PAGEREF _Toc221453980 \h </w:instrText>
+              <w:instrText xml:space="preserve"> PAGEREF _Toc237288116 \h </w:instrText>
             </w:r>
             <w:r>
               <w:rPr>
@@ -1192,7 +1211,7 @@
                 <w:noProof/>
                 <w:webHidden/>
               </w:rPr>
-              <w:t>5</w:t>
+              <w:t>4</w:t>
             </w:r>
             <w:r>
               <w:rPr>
@@ -1206,13 +1225,18 @@
         <w:p>
           <w:pPr>
             <w:pStyle w:val="TOC1"/>
+            <w:tabs>
+              <w:tab w:val="right" w:leader="dot" w:pos="10530"/>
+            </w:tabs>
             <w:rPr>
               <w:rFonts w:asciiTheme="minorHAnsi" w:eastAsiaTheme="minorEastAsia" w:hAnsiTheme="minorHAnsi"/>
+              <w:b w:val="0"/>
+              <w:caps w:val="0"/>
               <w:sz w:val="24"/>
               <w:szCs w:val="24"/>
             </w:rPr>
           </w:pPr>
-          <w:hyperlink w:anchor="_Toc221453981" w:history="1">
+          <w:hyperlink w:anchor="_Toc237288117" w:history="1">
             <w:r>
               <w:rPr>
                 <w:rStyle w:val="Hyperlink"/>
@@ -1222,6 +1246,8 @@
             <w:r>
               <w:rPr>
                 <w:rFonts w:asciiTheme="minorHAnsi" w:eastAsiaTheme="minorEastAsia" w:hAnsiTheme="minorHAnsi"/>
+                <w:b w:val="0"/>
+                <w:caps w:val="0"/>
                 <w:sz w:val="24"/>
                 <w:szCs w:val="24"/>
               </w:rPr>
@@ -1231,7 +1257,7 @@
               <w:rPr>
                 <w:rStyle w:val="Hyperlink"/>
               </w:rPr>
-              <w:t>POLICY REQUIREMENTS</w:t>
+              <w:t>policy requirements</w:t>
             </w:r>
             <w:r>
               <w:rPr>
@@ -1249,7 +1275,7 @@
               <w:rPr>
                 <w:webHidden/>
               </w:rPr>
-              <w:instrText xml:space="preserve"> PAGEREF _Toc221453981 \h </w:instrText>
+              <w:instrText xml:space="preserve"> PAGEREF _Toc237288117 \h </w:instrText>
             </w:r>
             <w:r>
               <w:rPr>
@@ -1279,6 +1305,10 @@
         <w:p>
           <w:pPr>
             <w:pStyle w:val="TOC2"/>
+            <w:tabs>
+              <w:tab w:val="left" w:pos="960"/>
+              <w:tab w:val="right" w:leader="dot" w:pos="10530"/>
+            </w:tabs>
             <w:rPr>
               <w:rFonts w:asciiTheme="minorHAnsi" w:eastAsiaTheme="minorEastAsia" w:hAnsiTheme="minorHAnsi"/>
               <w:noProof/>
@@ -1286,7 +1316,7 @@
               <w:szCs w:val="24"/>
             </w:rPr>
           </w:pPr>
-          <w:hyperlink w:anchor="_Toc221453982" w:history="1">
+          <w:hyperlink w:anchor="_Toc237288118" w:history="1">
             <w:r>
               <w:rPr>
                 <w:rStyle w:val="Hyperlink"/>
@@ -1329,7 +1359,7 @@
                 <w:noProof/>
                 <w:webHidden/>
               </w:rPr>
-              <w:instrText xml:space="preserve"> PAGEREF _Toc221453982 \h </w:instrText>
+              <w:instrText xml:space="preserve"> PAGEREF _Toc237288118 \h </w:instrText>
             </w:r>
             <w:r>
               <w:rPr>
@@ -1363,6 +1393,10 @@
         <w:p>
           <w:pPr>
             <w:pStyle w:val="TOC2"/>
+            <w:tabs>
+              <w:tab w:val="left" w:pos="960"/>
+              <w:tab w:val="right" w:leader="dot" w:pos="10530"/>
+            </w:tabs>
             <w:rPr>
               <w:rFonts w:asciiTheme="minorHAnsi" w:eastAsiaTheme="minorEastAsia" w:hAnsiTheme="minorHAnsi"/>
               <w:noProof/>
@@ -1370,7 +1404,7 @@
               <w:szCs w:val="24"/>
             </w:rPr>
           </w:pPr>
-          <w:hyperlink w:anchor="_Toc221453983" w:history="1">
+          <w:hyperlink w:anchor="_Toc237288119" w:history="1">
             <w:r>
               <w:rPr>
                 <w:rStyle w:val="Hyperlink"/>
@@ -1413,7 +1447,7 @@
                 <w:noProof/>
                 <w:webHidden/>
               </w:rPr>
-              <w:instrText xml:space="preserve"> PAGEREF _Toc221453983 \h </w:instrText>
+              <w:instrText xml:space="preserve"> PAGEREF _Toc237288119 \h </w:instrText>
             </w:r>
             <w:r>
               <w:rPr>
@@ -1447,6 +1481,10 @@
         <w:p>
           <w:pPr>
             <w:pStyle w:val="TOC2"/>
+            <w:tabs>
+              <w:tab w:val="left" w:pos="960"/>
+              <w:tab w:val="right" w:leader="dot" w:pos="10530"/>
+            </w:tabs>
             <w:rPr>
               <w:rFonts w:asciiTheme="minorHAnsi" w:eastAsiaTheme="minorEastAsia" w:hAnsiTheme="minorHAnsi"/>
               <w:noProof/>
@@ -1454,7 +1492,7 @@
               <w:szCs w:val="24"/>
             </w:rPr>
           </w:pPr>
-          <w:hyperlink w:anchor="_Toc221453984" w:history="1">
+          <w:hyperlink w:anchor="_Toc237288120" w:history="1">
             <w:r>
               <w:rPr>
                 <w:rStyle w:val="Hyperlink"/>
@@ -1497,7 +1535,7 @@
                 <w:noProof/>
                 <w:webHidden/>
               </w:rPr>
-              <w:instrText xml:space="preserve"> PAGEREF _Toc221453984 \h </w:instrText>
+              <w:instrText xml:space="preserve"> PAGEREF _Toc237288120 \h </w:instrText>
             </w:r>
             <w:r>
               <w:rPr>
@@ -1531,6 +1569,10 @@
         <w:p>
           <w:pPr>
             <w:pStyle w:val="TOC2"/>
+            <w:tabs>
+              <w:tab w:val="left" w:pos="960"/>
+              <w:tab w:val="right" w:leader="dot" w:pos="10530"/>
+            </w:tabs>
             <w:rPr>
               <w:rFonts w:asciiTheme="minorHAnsi" w:eastAsiaTheme="minorEastAsia" w:hAnsiTheme="minorHAnsi"/>
               <w:noProof/>
@@ -1538,7 +1580,7 @@
               <w:szCs w:val="24"/>
             </w:rPr>
           </w:pPr>
-          <w:hyperlink w:anchor="_Toc221453985" w:history="1">
+          <w:hyperlink w:anchor="_Toc237288121" w:history="1">
             <w:r>
               <w:rPr>
                 <w:rStyle w:val="Hyperlink"/>
@@ -1581,7 +1623,7 @@
                 <w:noProof/>
                 <w:webHidden/>
               </w:rPr>
-              <w:instrText xml:space="preserve"> PAGEREF _Toc221453985 \h </w:instrText>
+              <w:instrText xml:space="preserve"> PAGEREF _Toc237288121 \h </w:instrText>
             </w:r>
             <w:r>
               <w:rPr>
@@ -1615,6 +1657,10 @@
         <w:p>
           <w:pPr>
             <w:pStyle w:val="TOC2"/>
+            <w:tabs>
+              <w:tab w:val="left" w:pos="960"/>
+              <w:tab w:val="right" w:leader="dot" w:pos="10530"/>
+            </w:tabs>
             <w:rPr>
               <w:rFonts w:asciiTheme="minorHAnsi" w:eastAsiaTheme="minorEastAsia" w:hAnsiTheme="minorHAnsi"/>
               <w:noProof/>
@@ -1622,7 +1668,7 @@
               <w:szCs w:val="24"/>
             </w:rPr>
           </w:pPr>
-          <w:hyperlink w:anchor="_Toc221453986" w:history="1">
+          <w:hyperlink w:anchor="_Toc237288122" w:history="1">
             <w:r>
               <w:rPr>
                 <w:rStyle w:val="Hyperlink"/>
@@ -1665,7 +1711,7 @@
                 <w:noProof/>
                 <w:webHidden/>
               </w:rPr>
-              <w:instrText xml:space="preserve"> PAGEREF _Toc221453986 \h </w:instrText>
+              <w:instrText xml:space="preserve"> PAGEREF _Toc237288122 \h </w:instrText>
             </w:r>
             <w:r>
               <w:rPr>
@@ -1699,13 +1745,18 @@
         <w:p>
           <w:pPr>
             <w:pStyle w:val="TOC1"/>
+            <w:tabs>
+              <w:tab w:val="right" w:leader="dot" w:pos="10530"/>
+            </w:tabs>
             <w:rPr>
               <w:rFonts w:asciiTheme="minorHAnsi" w:eastAsiaTheme="minorEastAsia" w:hAnsiTheme="minorHAnsi"/>
+              <w:b w:val="0"/>
+              <w:caps w:val="0"/>
               <w:sz w:val="24"/>
               <w:szCs w:val="24"/>
             </w:rPr>
           </w:pPr>
-          <w:hyperlink w:anchor="_Toc221453987" w:history="1">
+          <w:hyperlink w:anchor="_Toc237288123" w:history="1">
             <w:r>
               <w:rPr>
                 <w:rStyle w:val="Hyperlink"/>
@@ -1715,6 +1766,8 @@
             <w:r>
               <w:rPr>
                 <w:rFonts w:asciiTheme="minorHAnsi" w:eastAsiaTheme="minorEastAsia" w:hAnsiTheme="minorHAnsi"/>
+                <w:b w:val="0"/>
+                <w:caps w:val="0"/>
                 <w:sz w:val="24"/>
                 <w:szCs w:val="24"/>
               </w:rPr>
@@ -1742,7 +1795,7 @@
               <w:rPr>
                 <w:webHidden/>
               </w:rPr>
-              <w:instrText xml:space="preserve"> PAGEREF _Toc221453987 \h </w:instrText>
+              <w:instrText xml:space="preserve"> PAGEREF _Toc237288123 \h </w:instrText>
             </w:r>
             <w:r>
               <w:rPr>
@@ -1772,13 +1825,18 @@
         <w:p>
           <w:pPr>
             <w:pStyle w:val="TOC1"/>
+            <w:tabs>
+              <w:tab w:val="right" w:leader="dot" w:pos="10530"/>
+            </w:tabs>
             <w:rPr>
               <w:rFonts w:asciiTheme="minorHAnsi" w:eastAsiaTheme="minorEastAsia" w:hAnsiTheme="minorHAnsi"/>
+              <w:b w:val="0"/>
+              <w:caps w:val="0"/>
               <w:sz w:val="24"/>
               <w:szCs w:val="24"/>
             </w:rPr>
           </w:pPr>
-          <w:hyperlink w:anchor="_Toc221453988" w:history="1">
+          <w:hyperlink w:anchor="_Toc237288124" w:history="1">
             <w:r>
               <w:rPr>
                 <w:rStyle w:val="Hyperlink"/>
@@ -1788,6 +1846,8 @@
             <w:r>
               <w:rPr>
                 <w:rFonts w:asciiTheme="minorHAnsi" w:eastAsiaTheme="minorEastAsia" w:hAnsiTheme="minorHAnsi"/>
+                <w:b w:val="0"/>
+                <w:caps w:val="0"/>
                 <w:sz w:val="24"/>
                 <w:szCs w:val="24"/>
               </w:rPr>
@@ -1815,7 +1875,7 @@
               <w:rPr>
                 <w:webHidden/>
               </w:rPr>
-              <w:instrText xml:space="preserve"> PAGEREF _Toc221453988 \h </w:instrText>
+              <w:instrText xml:space="preserve"> PAGEREF _Toc237288124 \h </w:instrText>
             </w:r>
             <w:r>
               <w:rPr>
@@ -1843,13 +1903,6 @@
           </w:hyperlink>
         </w:p>
         <w:p>
-          <w:pPr>
-            <w:rPr>
-              <w:b/>
-              <w:bCs/>
-              <w:noProof/>
-            </w:rPr>
-          </w:pPr>
           <w:r>
             <w:rPr>
               <w:b/>
@@ -1943,20 +1996,10 @@
     </w:p>
     <w:p>
       <w:pPr>
-        <w:pStyle w:val="NoSpacing"/>
-      </w:pPr>
-    </w:p>
-    <w:p>
-      <w:pPr>
-        <w:pStyle w:val="NoSpacing"/>
-      </w:pPr>
-    </w:p>
-    <w:p>
-      <w:pPr>
         <w:pStyle w:val="Heading1"/>
         <w:spacing w:after="360"/>
       </w:pPr>
-      <w:bookmarkStart w:id="0" w:name="_Toc221453971"/>
+      <w:bookmarkStart w:id="0" w:name="_Toc237288107"/>
       <w:r>
         <w:lastRenderedPageBreak/>
         <w:t>DOCUMENT INFORMATION</w:t>
@@ -1967,7 +2010,7 @@
       <w:pPr>
         <w:pStyle w:val="Heading2"/>
       </w:pPr>
-      <w:bookmarkStart w:id="1" w:name="_Toc221453972"/>
+      <w:bookmarkStart w:id="1" w:name="_Toc237288108"/>
       <w:r>
         <w:t>Validation</w:t>
       </w:r>
@@ -1990,8 +2033,8 @@
       <w:tblGrid>
         <w:gridCol w:w="1765"/>
         <w:gridCol w:w="2190"/>
-        <w:gridCol w:w="2970"/>
-        <w:gridCol w:w="1890"/>
+        <w:gridCol w:w="4500"/>
+        <w:gridCol w:w="2070"/>
       </w:tblGrid>
       <w:tr>
         <w:tc>
@@ -2024,7 +2067,7 @@
         </w:tc>
         <w:tc>
           <w:tcPr>
-            <w:tcW w:w="2970" w:type="dxa"/>
+            <w:tcW w:w="4500" w:type="dxa"/>
             <w:shd w:val="clear" w:color="auto" w:fill="4F7ABA"/>
           </w:tcPr>
           <w:p>
@@ -2051,7 +2094,7 @@
         </w:tc>
         <w:tc>
           <w:tcPr>
-            <w:tcW w:w="1890" w:type="dxa"/>
+            <w:tcW w:w="2070" w:type="dxa"/>
             <w:shd w:val="clear" w:color="auto" w:fill="4F7ABA"/>
           </w:tcPr>
           <w:p>
@@ -2121,7 +2164,7 @@
         </w:tc>
         <w:tc>
           <w:tcPr>
-            <w:tcW w:w="2970" w:type="dxa"/>
+            <w:tcW w:w="4500" w:type="dxa"/>
           </w:tcPr>
           <w:p>
             <w:pPr>
@@ -2142,28 +2185,21 @@
         </w:tc>
         <w:tc>
           <w:tcPr>
-            <w:tcW w:w="1890" w:type="dxa"/>
-          </w:tcPr>
-          <w:p>
-            <w:pPr>
-              <w:rPr>
-                <w:sz w:val="20"/>
-                <w:szCs w:val="20"/>
-              </w:rPr>
-            </w:pPr>
-            <w:r>
-              <w:rPr>
-                <w:sz w:val="20"/>
-                <w:szCs w:val="20"/>
-              </w:rPr>
-              <w:t>0</w:t>
-            </w:r>
-            <w:r>
-              <w:rPr>
-                <w:sz w:val="20"/>
-                <w:szCs w:val="20"/>
-              </w:rPr>
-              <w:t>2</w:t>
+            <w:tcW w:w="2070" w:type="dxa"/>
+          </w:tcPr>
+          <w:p>
+            <w:pPr>
+              <w:rPr>
+                <w:sz w:val="20"/>
+                <w:szCs w:val="20"/>
+              </w:rPr>
+            </w:pPr>
+            <w:r>
+              <w:rPr>
+                <w:sz w:val="20"/>
+                <w:szCs w:val="20"/>
+              </w:rPr>
+              <w:t>02</w:t>
             </w:r>
             <w:r>
               <w:rPr>
@@ -2240,7 +2276,7 @@
         </w:tc>
         <w:tc>
           <w:tcPr>
-            <w:tcW w:w="2970" w:type="dxa"/>
+            <w:tcW w:w="4500" w:type="dxa"/>
           </w:tcPr>
           <w:p>
             <w:pPr>
@@ -2260,7 +2296,7 @@
         </w:tc>
         <w:tc>
           <w:tcPr>
-            <w:tcW w:w="1890" w:type="dxa"/>
+            <w:tcW w:w="2070" w:type="dxa"/>
           </w:tcPr>
           <w:p>
             <w:pPr>
@@ -2344,7 +2380,7 @@
         </w:tc>
         <w:tc>
           <w:tcPr>
-            <w:tcW w:w="2970" w:type="dxa"/>
+            <w:tcW w:w="4500" w:type="dxa"/>
           </w:tcPr>
           <w:p>
             <w:pPr>
@@ -2364,7 +2400,7 @@
         </w:tc>
         <w:tc>
           <w:tcPr>
-            <w:tcW w:w="1890" w:type="dxa"/>
+            <w:tcW w:w="2070" w:type="dxa"/>
           </w:tcPr>
           <w:p>
             <w:pPr>
@@ -2441,20 +2477,20 @@
         </w:tc>
         <w:tc>
           <w:tcPr>
-            <w:tcW w:w="2970" w:type="dxa"/>
-          </w:tcPr>
-          <w:p>
-            <w:pPr>
-              <w:rPr>
-                <w:sz w:val="20"/>
-                <w:szCs w:val="20"/>
-              </w:rPr>
-            </w:pPr>
-          </w:p>
-        </w:tc>
-        <w:tc>
-          <w:tcPr>
-            <w:tcW w:w="1890" w:type="dxa"/>
+            <w:tcW w:w="4500" w:type="dxa"/>
+          </w:tcPr>
+          <w:p>
+            <w:pPr>
+              <w:rPr>
+                <w:sz w:val="20"/>
+                <w:szCs w:val="20"/>
+              </w:rPr>
+            </w:pPr>
+          </w:p>
+        </w:tc>
+        <w:tc>
+          <w:tcPr>
+            <w:tcW w:w="2070" w:type="dxa"/>
           </w:tcPr>
           <w:p>
             <w:pPr>
@@ -2510,7 +2546,7 @@
         </w:tc>
         <w:tc>
           <w:tcPr>
-            <w:tcW w:w="2970" w:type="dxa"/>
+            <w:tcW w:w="4500" w:type="dxa"/>
           </w:tcPr>
           <w:p>
             <w:pPr>
@@ -2530,7 +2566,7 @@
         </w:tc>
         <w:tc>
           <w:tcPr>
-            <w:tcW w:w="1890" w:type="dxa"/>
+            <w:tcW w:w="2070" w:type="dxa"/>
           </w:tcPr>
           <w:p>
             <w:pPr>
@@ -2607,20 +2643,20 @@
         </w:tc>
         <w:tc>
           <w:tcPr>
-            <w:tcW w:w="2970" w:type="dxa"/>
-          </w:tcPr>
-          <w:p>
-            <w:pPr>
-              <w:rPr>
-                <w:sz w:val="20"/>
-                <w:szCs w:val="20"/>
-              </w:rPr>
-            </w:pPr>
-          </w:p>
-        </w:tc>
-        <w:tc>
-          <w:tcPr>
-            <w:tcW w:w="1890" w:type="dxa"/>
+            <w:tcW w:w="4500" w:type="dxa"/>
+          </w:tcPr>
+          <w:p>
+            <w:pPr>
+              <w:rPr>
+                <w:sz w:val="20"/>
+                <w:szCs w:val="20"/>
+              </w:rPr>
+            </w:pPr>
+          </w:p>
+        </w:tc>
+        <w:tc>
+          <w:tcPr>
+            <w:tcW w:w="2070" w:type="dxa"/>
           </w:tcPr>
           <w:p>
             <w:pPr>
@@ -2638,7 +2674,7 @@
       <w:pPr>
         <w:pStyle w:val="Heading2"/>
       </w:pPr>
-      <w:bookmarkStart w:id="2" w:name="_Toc221453973"/>
+      <w:bookmarkStart w:id="2" w:name="_Toc237288109"/>
       <w:r>
         <w:t>Document Distribution</w:t>
       </w:r>
@@ -2660,7 +2696,7 @@
       </w:tblPr>
       <w:tblGrid>
         <w:gridCol w:w="3955"/>
-        <w:gridCol w:w="4860"/>
+        <w:gridCol w:w="6570"/>
       </w:tblGrid>
       <w:tr>
         <w:tc>
@@ -2692,7 +2728,7 @@
         </w:tc>
         <w:tc>
           <w:tcPr>
-            <w:tcW w:w="4860" w:type="dxa"/>
+            <w:tcW w:w="6570" w:type="dxa"/>
             <w:shd w:val="clear" w:color="auto" w:fill="4F7ABA"/>
           </w:tcPr>
           <w:p>
@@ -2742,7 +2778,7 @@
         </w:tc>
         <w:tc>
           <w:tcPr>
-            <w:tcW w:w="4860" w:type="dxa"/>
+            <w:tcW w:w="6570" w:type="dxa"/>
           </w:tcPr>
           <w:p>
             <w:pPr>
@@ -2785,7 +2821,7 @@
         </w:tc>
         <w:tc>
           <w:tcPr>
-            <w:tcW w:w="4860" w:type="dxa"/>
+            <w:tcW w:w="6570" w:type="dxa"/>
           </w:tcPr>
           <w:p>
             <w:pPr>
@@ -2820,7 +2856,7 @@
         </w:tc>
         <w:tc>
           <w:tcPr>
-            <w:tcW w:w="4860" w:type="dxa"/>
+            <w:tcW w:w="6570" w:type="dxa"/>
           </w:tcPr>
           <w:p>
             <w:pPr>
@@ -2838,7 +2874,7 @@
       <w:pPr>
         <w:pStyle w:val="Heading2"/>
       </w:pPr>
-      <w:bookmarkStart w:id="3" w:name="_Toc221453974"/>
+      <w:bookmarkStart w:id="3" w:name="_Toc237288110"/>
       <w:r>
         <w:t>Version Control</w:t>
       </w:r>
@@ -2862,7 +2898,7 @@
         <w:gridCol w:w="985"/>
         <w:gridCol w:w="1260"/>
         <w:gridCol w:w="1710"/>
-        <w:gridCol w:w="4873"/>
+        <w:gridCol w:w="6570"/>
       </w:tblGrid>
       <w:tr>
         <w:tc>
@@ -2948,7 +2984,7 @@
         </w:tc>
         <w:tc>
           <w:tcPr>
-            <w:tcW w:w="4873" w:type="dxa"/>
+            <w:tcW w:w="6570" w:type="dxa"/>
             <w:shd w:val="clear" w:color="auto" w:fill="4F7ABA"/>
           </w:tcPr>
           <w:p>
@@ -3079,7 +3115,7 @@
         </w:tc>
         <w:tc>
           <w:tcPr>
-            <w:tcW w:w="4873" w:type="dxa"/>
+            <w:tcW w:w="6570" w:type="dxa"/>
           </w:tcPr>
           <w:p>
             <w:pPr>
@@ -3095,15 +3131,16 @@
                 <w:sz w:val="20"/>
                 <w:szCs w:val="20"/>
               </w:rPr>
-              <w:t xml:space="preserve">First version of the </w:t>
+              <w:t>1</w:t>
             </w:r>
             <w:r>
               <w:rPr>
                 <w:rFonts w:cs="Arial"/>
                 <w:sz w:val="20"/>
                 <w:szCs w:val="20"/>
-              </w:rPr>
-              <w:t xml:space="preserve">DevSec </w:t>
+                <w:vertAlign w:val="superscript"/>
+              </w:rPr>
+              <w:t>st</w:t>
             </w:r>
             <w:r>
               <w:rPr>
@@ -3111,7 +3148,7 @@
                 <w:sz w:val="20"/>
                 <w:szCs w:val="20"/>
               </w:rPr>
-              <w:t>P</w:t>
+              <w:t xml:space="preserve"> </w:t>
             </w:r>
             <w:r>
               <w:rPr>
@@ -3119,7 +3156,15 @@
                 <w:sz w:val="20"/>
                 <w:szCs w:val="20"/>
               </w:rPr>
-              <w:t xml:space="preserve">olicy </w:t>
+              <w:t xml:space="preserve">version of the </w:t>
+            </w:r>
+            <w:r>
+              <w:rPr>
+                <w:rFonts w:cs="Arial"/>
+                <w:sz w:val="20"/>
+                <w:szCs w:val="20"/>
+              </w:rPr>
+              <w:t xml:space="preserve">DevSec Policy </w:t>
             </w:r>
             <w:r>
               <w:rPr>
@@ -3178,7 +3223,7 @@
         </w:tc>
         <w:tc>
           <w:tcPr>
-            <w:tcW w:w="4873" w:type="dxa"/>
+            <w:tcW w:w="6570" w:type="dxa"/>
           </w:tcPr>
           <w:p>
             <w:pPr>
@@ -3237,7 +3282,7 @@
         </w:tc>
         <w:tc>
           <w:tcPr>
-            <w:tcW w:w="4873" w:type="dxa"/>
+            <w:tcW w:w="6570" w:type="dxa"/>
           </w:tcPr>
           <w:p>
             <w:pPr>
@@ -3276,7 +3321,7 @@
           <w:headerReference w:type="default" r:id="rId9"/>
           <w:footerReference w:type="default" r:id="rId10"/>
           <w:pgSz w:w="12240" w:h="15840"/>
-          <w:pgMar w:top="1417" w:right="1701" w:bottom="1417" w:left="1701" w:header="720" w:footer="720" w:gutter="0"/>
+          <w:pgMar w:top="1411" w:right="850" w:bottom="1411" w:left="850" w:header="576" w:footer="720" w:gutter="0"/>
           <w:pgNumType w:chapSep="period"/>
           <w:cols w:space="720"/>
           <w:docGrid w:linePitch="360"/>
@@ -3288,7 +3333,7 @@
         <w:pStyle w:val="Heading1"/>
         <w:spacing w:after="360"/>
       </w:pPr>
-      <w:bookmarkStart w:id="4" w:name="_Toc221453975"/>
+      <w:bookmarkStart w:id="4" w:name="_Toc237288111"/>
       <w:r>
         <w:lastRenderedPageBreak/>
         <w:t>P</w:t>
@@ -3305,7 +3350,7 @@
       <w:pPr>
         <w:pStyle w:val="Heading2"/>
       </w:pPr>
-      <w:bookmarkStart w:id="5" w:name="_Toc221453976"/>
+      <w:bookmarkStart w:id="5" w:name="_Toc237288112"/>
       <w:r>
         <w:t>About this document</w:t>
       </w:r>
@@ -3321,21 +3366,15 @@
       </w:r>
       <w:proofErr w:type="spellEnd"/>
       <w:r>
-        <w:t xml:space="preserve">, GitHub Actions, etc.) operate securely, follow </w:t>
+        <w:t>, GitHub Actions, etc.) operate securely, follow least privilege principles, prevent secret leaks, and protect production systems from unauthorized or malicious deployments.</w:t>
       </w:r>
-      <w:r>
-        <w:t>least privilege</w:t>
-      </w:r>
-      <w:r>
-        <w:t xml:space="preserve"> principles, prevent secret leaks, and protect production systems from unauthorized or malicious deployments.</w:t>
-      </w:r>
     </w:p>
     <w:p/>
     <w:p>
       <w:pPr>
         <w:pStyle w:val="Heading2"/>
       </w:pPr>
-      <w:bookmarkStart w:id="6" w:name="_Toc221453977"/>
+      <w:bookmarkStart w:id="6" w:name="_Toc237288113"/>
       <w:r>
         <w:t>Scope</w:t>
       </w:r>
@@ -3343,10 +3382,7 @@
     </w:p>
     <w:p>
       <w:r>
-        <w:t>This policy applies to the following systems, environments, tools, and personnel</w:t>
-      </w:r>
-      <w:r>
-        <w:t>.</w:t>
+        <w:t>This policy applies to the following systems, environments, tools, and personnel.</w:t>
       </w:r>
     </w:p>
     <w:p>
@@ -3369,9 +3405,8 @@
         <w:pStyle w:val="ListParagraph"/>
         <w:numPr>
           <w:ilvl w:val="0"/>
-          <w:numId w:val="15"/>
+          <w:numId w:val="3"/>
         </w:numPr>
-        <w:spacing w:line="360" w:lineRule="auto"/>
       </w:pPr>
       <w:r>
         <w:t>Deployment tools (</w:t>
@@ -3382,10 +3417,7 @@
       </w:r>
       <w:proofErr w:type="spellEnd"/>
       <w:r>
-        <w:t>, GitHub Actions, pipelines)</w:t>
-      </w:r>
-      <w:r>
-        <w:t>.</w:t>
+        <w:t>, GitHub Actions, pipelines).</w:t>
       </w:r>
     </w:p>
     <w:p>
@@ -3393,15 +3425,11 @@
         <w:pStyle w:val="ListParagraph"/>
         <w:numPr>
           <w:ilvl w:val="0"/>
-          <w:numId w:val="15"/>
+          <w:numId w:val="3"/>
         </w:numPr>
-        <w:spacing w:line="360" w:lineRule="auto"/>
       </w:pPr>
       <w:r>
-        <w:t>Production, staging, and development environments</w:t>
-      </w:r>
-      <w:r>
-        <w:t>.</w:t>
+        <w:t>Production, staging, and development environments.</w:t>
       </w:r>
     </w:p>
     <w:p>
@@ -3409,20 +3437,15 @@
         <w:pStyle w:val="ListParagraph"/>
         <w:numPr>
           <w:ilvl w:val="0"/>
-          <w:numId w:val="15"/>
+          <w:numId w:val="3"/>
         </w:numPr>
-        <w:spacing w:line="360" w:lineRule="auto"/>
       </w:pPr>
       <w:r>
-        <w:t>Developers, DevOps, contractors, and anyone triggering deployments</w:t>
+        <w:t>Developers, DevOps, contractors, and anyone triggering deployments.</w:t>
       </w:r>
-      <w:r>
-        <w:t>.</w:t>
-      </w:r>
-    </w:p>
-    <w:p>
-      <w:pPr>
-        <w:spacing w:line="360" w:lineRule="auto"/>
+    </w:p>
+    <w:p>
+      <w:pPr>
         <w:rPr>
           <w:b/>
           <w:bCs/>
@@ -3433,14 +3456,7 @@
           <w:b/>
           <w:bCs/>
         </w:rPr>
-        <w:t>Out of</w:t>
-      </w:r>
-      <w:r>
-        <w:rPr>
-          <w:b/>
-          <w:bCs/>
-        </w:rPr>
-        <w:t xml:space="preserve"> scope:</w:t>
+        <w:t>Out of scope:</w:t>
       </w:r>
     </w:p>
     <w:p>
@@ -3448,18 +3464,11 @@
         <w:pStyle w:val="ListParagraph"/>
         <w:numPr>
           <w:ilvl w:val="0"/>
-          <w:numId w:val="15"/>
+          <w:numId w:val="4"/>
         </w:numPr>
-        <w:spacing w:line="360" w:lineRule="auto"/>
       </w:pPr>
       <w:r>
-        <w:t>I</w:t>
-      </w:r>
-      <w:r>
-        <w:t>ncident response procedures after a security breach</w:t>
-      </w:r>
-      <w:r>
-        <w:t>.</w:t>
+        <w:t>Incident response procedures after a security breach.</w:t>
       </w:r>
     </w:p>
     <w:p>
@@ -3467,23 +3476,23 @@
         <w:pStyle w:val="ListParagraph"/>
         <w:numPr>
           <w:ilvl w:val="0"/>
-          <w:numId w:val="15"/>
+          <w:numId w:val="4"/>
         </w:numPr>
-        <w:spacing w:line="360" w:lineRule="auto"/>
       </w:pPr>
       <w:r>
-        <w:t>Application code security practices</w:t>
+        <w:t>Application code security practices.</w:t>
       </w:r>
-      <w:r>
-        <w:t>.</w:t>
-      </w:r>
-    </w:p>
-    <w:p/>
+    </w:p>
+    <w:p>
+      <w:pPr>
+        <w:pStyle w:val="ListParagraph"/>
+      </w:pPr>
+    </w:p>
     <w:p>
       <w:pPr>
         <w:pStyle w:val="Heading2"/>
       </w:pPr>
-      <w:bookmarkStart w:id="7" w:name="_Toc221453978"/>
+      <w:bookmarkStart w:id="7" w:name="_Toc237288114"/>
       <w:r>
         <w:t>Roles &amp; Responsibilities</w:t>
       </w:r>
@@ -3505,7 +3514,7 @@
       </w:tblPr>
       <w:tblGrid>
         <w:gridCol w:w="1525"/>
-        <w:gridCol w:w="7290"/>
+        <w:gridCol w:w="9000"/>
       </w:tblGrid>
       <w:tr>
         <w:trPr>
@@ -3540,7 +3549,7 @@
         </w:tc>
         <w:tc>
           <w:tcPr>
-            <w:tcW w:w="7290" w:type="dxa"/>
+            <w:tcW w:w="9000" w:type="dxa"/>
             <w:shd w:val="clear" w:color="auto" w:fill="4F7ABA"/>
           </w:tcPr>
           <w:p>
@@ -3589,7 +3598,7 @@
         </w:tc>
         <w:tc>
           <w:tcPr>
-            <w:tcW w:w="7290" w:type="dxa"/>
+            <w:tcW w:w="9000" w:type="dxa"/>
           </w:tcPr>
           <w:p>
             <w:pPr>
@@ -3631,7 +3640,7 @@
         </w:tc>
         <w:tc>
           <w:tcPr>
-            <w:tcW w:w="7290" w:type="dxa"/>
+            <w:tcW w:w="9000" w:type="dxa"/>
           </w:tcPr>
           <w:p>
             <w:pPr>
@@ -3673,7 +3682,7 @@
         </w:tc>
         <w:tc>
           <w:tcPr>
-            <w:tcW w:w="7290" w:type="dxa"/>
+            <w:tcW w:w="9000" w:type="dxa"/>
           </w:tcPr>
           <w:p>
             <w:pPr>
@@ -3715,7 +3724,7 @@
         </w:tc>
         <w:tc>
           <w:tcPr>
-            <w:tcW w:w="7290" w:type="dxa"/>
+            <w:tcW w:w="9000" w:type="dxa"/>
           </w:tcPr>
           <w:p>
             <w:pPr>
@@ -3736,7 +3745,7 @@
       </w:tr>
       <w:tr>
         <w:trPr>
-          <w:trHeight w:val="283"/>
+          <w:trHeight w:val="280"/>
         </w:trPr>
         <w:tc>
           <w:tcPr>
@@ -3760,7 +3769,7 @@
         </w:tc>
         <w:tc>
           <w:tcPr>
-            <w:tcW w:w="7290" w:type="dxa"/>
+            <w:tcW w:w="9000" w:type="dxa"/>
           </w:tcPr>
           <w:p>
             <w:pPr>
@@ -3785,7 +3794,7 @@
       <w:pPr>
         <w:pStyle w:val="Heading2"/>
       </w:pPr>
-      <w:bookmarkStart w:id="8" w:name="_Toc221453979"/>
+      <w:bookmarkStart w:id="8" w:name="_Toc237288115"/>
       <w:r>
         <w:t>Terminology</w:t>
       </w:r>
@@ -3807,7 +3816,7 @@
       </w:tblPr>
       <w:tblGrid>
         <w:gridCol w:w="1525"/>
-        <w:gridCol w:w="7290"/>
+        <w:gridCol w:w="9000"/>
       </w:tblGrid>
       <w:tr>
         <w:trPr>
@@ -3842,7 +3851,7 @@
         </w:tc>
         <w:tc>
           <w:tcPr>
-            <w:tcW w:w="7290" w:type="dxa"/>
+            <w:tcW w:w="9000" w:type="dxa"/>
             <w:shd w:val="clear" w:color="auto" w:fill="4F7ABA"/>
           </w:tcPr>
           <w:p>
@@ -3876,8 +3885,6 @@
           <w:p>
             <w:pPr>
               <w:rPr>
-                <w:b/>
-                <w:bCs/>
                 <w:sz w:val="20"/>
                 <w:szCs w:val="20"/>
               </w:rPr>
@@ -3896,7 +3903,7 @@
         </w:tc>
         <w:tc>
           <w:tcPr>
-            <w:tcW w:w="7290" w:type="dxa"/>
+            <w:tcW w:w="9000" w:type="dxa"/>
           </w:tcPr>
           <w:p>
             <w:pPr>
@@ -3945,7 +3952,7 @@
         </w:tc>
         <w:tc>
           <w:tcPr>
-            <w:tcW w:w="7290" w:type="dxa"/>
+            <w:tcW w:w="9000" w:type="dxa"/>
           </w:tcPr>
           <w:p>
             <w:pPr>
@@ -3994,7 +4001,7 @@
         </w:tc>
         <w:tc>
           <w:tcPr>
-            <w:tcW w:w="7290" w:type="dxa"/>
+            <w:tcW w:w="9000" w:type="dxa"/>
           </w:tcPr>
           <w:p>
             <w:pPr>
@@ -4050,7 +4057,7 @@
         </w:tc>
         <w:tc>
           <w:tcPr>
-            <w:tcW w:w="7290" w:type="dxa"/>
+            <w:tcW w:w="9000" w:type="dxa"/>
           </w:tcPr>
           <w:p>
             <w:pPr>
@@ -4099,7 +4106,7 @@
         </w:tc>
         <w:tc>
           <w:tcPr>
-            <w:tcW w:w="7290" w:type="dxa"/>
+            <w:tcW w:w="9000" w:type="dxa"/>
           </w:tcPr>
           <w:p>
             <w:pPr>
@@ -4131,22 +4138,30 @@
       <w:pPr>
         <w:pStyle w:val="Heading2"/>
       </w:pPr>
-      <w:bookmarkStart w:id="9" w:name="_Toc221453980"/>
+      <w:bookmarkStart w:id="9" w:name="_Toc237288116"/>
       <w:r>
-        <w:lastRenderedPageBreak/>
         <w:t>Conventions Used</w:t>
       </w:r>
       <w:bookmarkEnd w:id="9"/>
     </w:p>
     <w:p>
       <w:r>
-        <w:t>The following structures are used as recommendations.</w:t>
+        <w:t xml:space="preserve">The following </w:t>
+      </w:r>
+      <w:r>
+        <w:rPr>
+          <w:vanish/>
+        </w:rPr>
+        <w:t xml:space="preserve">structures </w:t>
+      </w:r>
+      <w:r>
+        <w:t>are used as recommendations.</w:t>
       </w:r>
     </w:p>
     <w:tbl>
       <w:tblPr>
         <w:tblStyle w:val="TableGrid"/>
-        <w:tblW w:w="0" w:type="auto"/>
+        <w:tblW w:w="10612" w:type="dxa"/>
         <w:tblBorders>
           <w:top w:val="single" w:sz="6" w:space="0" w:color="0C3512" w:themeColor="accent3" w:themeShade="80"/>
           <w:left w:val="single" w:sz="6" w:space="0" w:color="0C3512" w:themeColor="accent3" w:themeShade="80"/>
@@ -4158,7 +4173,7 @@
         <w:tblLook w:val="04A0" w:firstRow="1" w:lastRow="0" w:firstColumn="1" w:lastColumn="0" w:noHBand="0" w:noVBand="1"/>
       </w:tblPr>
       <w:tblGrid>
-        <w:gridCol w:w="8822"/>
+        <w:gridCol w:w="10612"/>
       </w:tblGrid>
       <w:tr>
         <w:trPr>
@@ -4166,18 +4181,85 @@
         </w:trPr>
         <w:tc>
           <w:tcPr>
-            <w:tcW w:w="8828" w:type="dxa"/>
-            <w:shd w:val="clear" w:color="auto" w:fill="D9F2D0" w:themeFill="accent6" w:themeFillTint="33"/>
+            <w:tcW w:w="10612" w:type="dxa"/>
+            <w:tcBorders>
+              <w:top w:val="single" w:sz="4" w:space="0" w:color="9CA6D2"/>
+              <w:left w:val="single" w:sz="4" w:space="0" w:color="9CA6D2"/>
+              <w:bottom w:val="single" w:sz="4" w:space="0" w:color="9CA6D2"/>
+              <w:right w:val="single" w:sz="4" w:space="0" w:color="9CA6D2"/>
+            </w:tcBorders>
+            <w:shd w:val="clear" w:color="auto" w:fill="DFEFFD"/>
           </w:tcPr>
           <w:p>
             <w:r>
               <w:rPr>
                 <w:b/>
                 <w:bCs/>
+                <w:sz w:val="20"/>
+                <w:szCs w:val="20"/>
+              </w:rPr>
+              <w:lastRenderedPageBreak/>
+              <w:t>Info:</w:t>
+            </w:r>
+            <w:r>
+              <w:rPr>
+                <w:sz w:val="20"/>
+                <w:szCs w:val="20"/>
+              </w:rPr>
+              <w:t xml:space="preserve"> Supplementary Information</w:t>
+            </w:r>
+          </w:p>
+        </w:tc>
+      </w:tr>
+    </w:tbl>
+    <w:p/>
+    <w:tbl>
+      <w:tblPr>
+        <w:tblStyle w:val="TableGrid"/>
+        <w:tblW w:w="10612" w:type="dxa"/>
+        <w:tblBorders>
+          <w:top w:val="single" w:sz="6" w:space="0" w:color="0C3512" w:themeColor="accent3" w:themeShade="80"/>
+          <w:left w:val="single" w:sz="6" w:space="0" w:color="0C3512" w:themeColor="accent3" w:themeShade="80"/>
+          <w:bottom w:val="single" w:sz="6" w:space="0" w:color="0C3512" w:themeColor="accent3" w:themeShade="80"/>
+          <w:right w:val="single" w:sz="6" w:space="0" w:color="0C3512" w:themeColor="accent3" w:themeShade="80"/>
+          <w:insideH w:val="single" w:sz="6" w:space="0" w:color="0C3512" w:themeColor="accent3" w:themeShade="80"/>
+          <w:insideV w:val="single" w:sz="6" w:space="0" w:color="0C3512" w:themeColor="accent3" w:themeShade="80"/>
+        </w:tblBorders>
+        <w:tblLook w:val="04A0" w:firstRow="1" w:lastRow="0" w:firstColumn="1" w:lastColumn="0" w:noHBand="0" w:noVBand="1"/>
+      </w:tblPr>
+      <w:tblGrid>
+        <w:gridCol w:w="10612"/>
+      </w:tblGrid>
+      <w:tr>
+        <w:trPr>
+          <w:trHeight w:val="413"/>
+        </w:trPr>
+        <w:tc>
+          <w:tcPr>
+            <w:tcW w:w="10612" w:type="dxa"/>
+            <w:tcBorders>
+              <w:top w:val="single" w:sz="4" w:space="0" w:color="9CC4A2"/>
+              <w:left w:val="single" w:sz="4" w:space="0" w:color="9CC4A2"/>
+              <w:bottom w:val="single" w:sz="4" w:space="0" w:color="9CC4A2"/>
+              <w:right w:val="single" w:sz="4" w:space="0" w:color="9CC4A2"/>
+            </w:tcBorders>
+            <w:shd w:val="clear" w:color="auto" w:fill="DEFAE0"/>
+          </w:tcPr>
+          <w:p>
+            <w:r>
+              <w:rPr>
+                <w:b/>
+                <w:bCs/>
+                <w:sz w:val="20"/>
+                <w:szCs w:val="20"/>
               </w:rPr>
               <w:t>Tip:</w:t>
             </w:r>
             <w:r>
+              <w:rPr>
+                <w:sz w:val="20"/>
+                <w:szCs w:val="20"/>
+              </w:rPr>
               <w:t xml:space="preserve"> A recommendation or useful advice</w:t>
             </w:r>
           </w:p>
@@ -4196,7 +4278,7 @@
     <w:tbl>
       <w:tblPr>
         <w:tblStyle w:val="TableGrid"/>
-        <w:tblW w:w="0" w:type="auto"/>
+        <w:tblW w:w="10612" w:type="dxa"/>
         <w:tblBorders>
           <w:top w:val="single" w:sz="6" w:space="0" w:color="C00000"/>
           <w:left w:val="single" w:sz="6" w:space="0" w:color="C00000"/>
@@ -4209,7 +4291,7 @@
         <w:tblLook w:val="04A0" w:firstRow="1" w:lastRow="0" w:firstColumn="1" w:lastColumn="0" w:noHBand="0" w:noVBand="1"/>
       </w:tblPr>
       <w:tblGrid>
-        <w:gridCol w:w="8822"/>
+        <w:gridCol w:w="10612"/>
       </w:tblGrid>
       <w:tr>
         <w:trPr>
@@ -4217,18 +4299,30 @@
         </w:trPr>
         <w:tc>
           <w:tcPr>
-            <w:tcW w:w="8822" w:type="dxa"/>
-            <w:shd w:val="clear" w:color="auto" w:fill="FAE2D5" w:themeFill="accent2" w:themeFillTint="33"/>
+            <w:tcW w:w="10612" w:type="dxa"/>
+            <w:tcBorders>
+              <w:top w:val="single" w:sz="4" w:space="0" w:color="E29898"/>
+              <w:left w:val="single" w:sz="4" w:space="0" w:color="E29898"/>
+              <w:bottom w:val="single" w:sz="4" w:space="0" w:color="E29898"/>
+              <w:right w:val="single" w:sz="4" w:space="0" w:color="E29898"/>
+            </w:tcBorders>
+            <w:shd w:val="clear" w:color="auto" w:fill="FFE7E7"/>
           </w:tcPr>
           <w:p>
             <w:r>
               <w:rPr>
                 <w:b/>
                 <w:bCs/>
+                <w:sz w:val="20"/>
+                <w:szCs w:val="20"/>
               </w:rPr>
               <w:t>Warning:</w:t>
             </w:r>
             <w:r>
+              <w:rPr>
+                <w:sz w:val="20"/>
+                <w:szCs w:val="20"/>
+              </w:rPr>
               <w:t xml:space="preserve"> A warning or important notice</w:t>
             </w:r>
           </w:p>
@@ -4247,7 +4341,7 @@
     <w:tbl>
       <w:tblPr>
         <w:tblStyle w:val="TableGrid"/>
-        <w:tblW w:w="0" w:type="auto"/>
+        <w:tblW w:w="10612" w:type="dxa"/>
         <w:tblBorders>
           <w:top w:val="single" w:sz="6" w:space="0" w:color="FFC000"/>
           <w:left w:val="single" w:sz="6" w:space="0" w:color="FFC000"/>
@@ -4260,7 +4354,7 @@
         <w:tblLook w:val="04A0" w:firstRow="1" w:lastRow="0" w:firstColumn="1" w:lastColumn="0" w:noHBand="0" w:noVBand="1"/>
       </w:tblPr>
       <w:tblGrid>
-        <w:gridCol w:w="8822"/>
+        <w:gridCol w:w="10612"/>
       </w:tblGrid>
       <w:tr>
         <w:trPr>
@@ -4268,18 +4362,30 @@
         </w:trPr>
         <w:tc>
           <w:tcPr>
-            <w:tcW w:w="8822" w:type="dxa"/>
-            <w:shd w:val="clear" w:color="auto" w:fill="FFFFCC"/>
+            <w:tcW w:w="10612" w:type="dxa"/>
+            <w:tcBorders>
+              <w:top w:val="single" w:sz="4" w:space="0" w:color="F9DF99"/>
+              <w:left w:val="single" w:sz="4" w:space="0" w:color="F9DF99"/>
+              <w:bottom w:val="single" w:sz="4" w:space="0" w:color="F9DF99"/>
+              <w:right w:val="single" w:sz="4" w:space="0" w:color="F9DF99"/>
+            </w:tcBorders>
+            <w:shd w:val="clear" w:color="auto" w:fill="FFFFE0"/>
           </w:tcPr>
           <w:p>
             <w:r>
               <w:rPr>
                 <w:b/>
                 <w:bCs/>
+                <w:sz w:val="20"/>
+                <w:szCs w:val="20"/>
               </w:rPr>
               <w:t>Note:</w:t>
             </w:r>
             <w:r>
+              <w:rPr>
+                <w:sz w:val="20"/>
+                <w:szCs w:val="20"/>
+              </w:rPr>
               <w:t xml:space="preserve"> A notice. </w:t>
             </w:r>
           </w:p>
@@ -4288,41 +4394,31 @@
     </w:tbl>
     <w:p>
       <w:pPr>
-        <w:spacing w:line="278" w:lineRule="auto"/>
-        <w:rPr>
-          <w:b/>
-          <w:bCs/>
-        </w:rPr>
-      </w:pPr>
-    </w:p>
-    <w:p/>
-    <w:p>
-      <w:pPr>
-        <w:pStyle w:val="Heading1"/>
-        <w:numPr>
-          <w:ilvl w:val="0"/>
-          <w:numId w:val="0"/>
-        </w:numPr>
-        <w:spacing w:after="360"/>
+        <w:tabs>
+          <w:tab w:val="left" w:pos="2377"/>
+        </w:tabs>
         <w:sectPr>
           <w:headerReference w:type="default" r:id="rId11"/>
           <w:pgSz w:w="12240" w:h="15840"/>
-          <w:pgMar w:top="1417" w:right="1701" w:bottom="1417" w:left="1701" w:header="720" w:footer="720" w:gutter="0"/>
+          <w:pgMar w:top="1411" w:right="850" w:bottom="1411" w:left="850" w:header="576" w:footer="720" w:gutter="0"/>
           <w:pgNumType w:chapSep="period"/>
           <w:cols w:space="720"/>
           <w:docGrid w:linePitch="360"/>
         </w:sectPr>
       </w:pPr>
+      <w:r>
+        <w:tab/>
+      </w:r>
     </w:p>
     <w:p>
       <w:pPr>
         <w:pStyle w:val="Heading1"/>
         <w:spacing w:after="360"/>
       </w:pPr>
-      <w:bookmarkStart w:id="10" w:name="_Toc221453981"/>
+      <w:bookmarkStart w:id="10" w:name="_Toc237288117"/>
       <w:r>
         <w:lastRenderedPageBreak/>
-        <w:t>POLICY REQUIREMENTS</w:t>
+        <w:t>policy requirements</w:t>
       </w:r>
       <w:bookmarkEnd w:id="10"/>
     </w:p>
@@ -4337,17 +4433,19 @@
         <w:pStyle w:val="Heading2"/>
       </w:pPr>
       <w:bookmarkStart w:id="11" w:name="_Toc221453982"/>
+      <w:bookmarkStart w:id="12" w:name="_Toc237288118"/>
       <w:r>
         <w:t>Access Control</w:t>
       </w:r>
       <w:bookmarkEnd w:id="11"/>
+      <w:bookmarkEnd w:id="12"/>
     </w:p>
     <w:p>
       <w:pPr>
         <w:pStyle w:val="ListParagraph"/>
         <w:numPr>
           <w:ilvl w:val="0"/>
-          <w:numId w:val="16"/>
+          <w:numId w:val="15"/>
         </w:numPr>
         <w:spacing w:line="360" w:lineRule="auto"/>
       </w:pPr>
@@ -4370,7 +4468,7 @@
         <w:pStyle w:val="ListParagraph"/>
         <w:numPr>
           <w:ilvl w:val="0"/>
-          <w:numId w:val="16"/>
+          <w:numId w:val="15"/>
         </w:numPr>
         <w:spacing w:line="360" w:lineRule="auto"/>
       </w:pPr>
@@ -4393,19 +4491,28 @@
         <w:pStyle w:val="ListParagraph"/>
         <w:numPr>
           <w:ilvl w:val="0"/>
-          <w:numId w:val="16"/>
+          <w:numId w:val="15"/>
         </w:numPr>
         <w:spacing w:line="360" w:lineRule="auto"/>
       </w:pPr>
       <w:r>
         <w:t xml:space="preserve">All deployment credentials must be </w:t>
       </w:r>
+      <w:proofErr w:type="gramStart"/>
       <w:r>
         <w:rPr>
           <w:b/>
           <w:bCs/>
         </w:rPr>
-        <w:t>unique per environment</w:t>
+        <w:t>unique per</w:t>
+      </w:r>
+      <w:proofErr w:type="gramEnd"/>
+      <w:r>
+        <w:rPr>
+          <w:b/>
+          <w:bCs/>
+        </w:rPr>
+        <w:t xml:space="preserve"> environment</w:t>
       </w:r>
       <w:r>
         <w:t>.</w:t>
@@ -4416,7 +4523,7 @@
         <w:pStyle w:val="ListParagraph"/>
         <w:numPr>
           <w:ilvl w:val="0"/>
-          <w:numId w:val="16"/>
+          <w:numId w:val="15"/>
         </w:numPr>
         <w:spacing w:line="360" w:lineRule="auto"/>
       </w:pPr>
@@ -4427,7 +4534,7 @@
     <w:tbl>
       <w:tblPr>
         <w:tblStyle w:val="TableGrid"/>
-        <w:tblW w:w="0" w:type="auto"/>
+        <w:tblW w:w="10612" w:type="dxa"/>
         <w:tblBorders>
           <w:top w:val="single" w:sz="6" w:space="0" w:color="FFC000"/>
           <w:left w:val="single" w:sz="6" w:space="0" w:color="FFC000"/>
@@ -4440,48 +4547,46 @@
         <w:tblLook w:val="04A0" w:firstRow="1" w:lastRow="0" w:firstColumn="1" w:lastColumn="0" w:noHBand="0" w:noVBand="1"/>
       </w:tblPr>
       <w:tblGrid>
-        <w:gridCol w:w="8822"/>
+        <w:gridCol w:w="10612"/>
       </w:tblGrid>
       <w:tr>
         <w:trPr>
-          <w:trHeight w:val="845"/>
+          <w:trHeight w:val="577"/>
         </w:trPr>
         <w:tc>
           <w:tcPr>
-            <w:tcW w:w="8822" w:type="dxa"/>
-            <w:shd w:val="clear" w:color="auto" w:fill="FFFFCC"/>
+            <w:tcW w:w="10612" w:type="dxa"/>
+            <w:tcBorders>
+              <w:top w:val="single" w:sz="4" w:space="0" w:color="F9DF99"/>
+              <w:left w:val="single" w:sz="4" w:space="0" w:color="F9DF99"/>
+              <w:bottom w:val="single" w:sz="4" w:space="0" w:color="F9DF99"/>
+              <w:right w:val="single" w:sz="4" w:space="0" w:color="F9DF99"/>
+            </w:tcBorders>
+            <w:shd w:val="clear" w:color="auto" w:fill="FFFFE0"/>
           </w:tcPr>
           <w:p>
             <w:r>
               <w:rPr>
                 <w:b/>
                 <w:bCs/>
+                <w:sz w:val="20"/>
+                <w:szCs w:val="20"/>
               </w:rPr>
               <w:t>Note:</w:t>
             </w:r>
             <w:r>
+              <w:rPr>
+                <w:sz w:val="20"/>
+                <w:szCs w:val="20"/>
+              </w:rPr>
               <w:t xml:space="preserve"> </w:t>
             </w:r>
             <w:r>
-              <w:t xml:space="preserve">All developers </w:t>
-            </w:r>
-            <w:r>
-              <w:t>are granted</w:t>
-            </w:r>
-            <w:r>
-              <w:t xml:space="preserve"> access</w:t>
-            </w:r>
-            <w:r>
-              <w:t xml:space="preserve"> to</w:t>
-            </w:r>
-            <w:r>
-              <w:t xml:space="preserve"> DEV, QA, and UAT environments.</w:t>
-            </w:r>
-            <w:r>
-              <w:t xml:space="preserve"> However, </w:t>
-            </w:r>
-            <w:r>
-              <w:t>Production (PROD) access is strictly limited to authorized personnel and must be explicitly approved and documented.</w:t>
+              <w:rPr>
+                <w:sz w:val="20"/>
+                <w:szCs w:val="20"/>
+              </w:rPr>
+              <w:t>All developers are granted access to DEV, QA, and UAT environments. However, Production (PROD) access is strictly limited to authorized personnel and must be explicitly approved and documented.</w:t>
             </w:r>
           </w:p>
         </w:tc>
@@ -4492,11 +4597,91 @@
       <w:pPr>
         <w:pStyle w:val="Heading2"/>
       </w:pPr>
-      <w:bookmarkStart w:id="12" w:name="_Toc221453983"/>
+      <w:bookmarkStart w:id="13" w:name="_Toc221453983"/>
+      <w:bookmarkStart w:id="14" w:name="_Toc237288119"/>
       <w:r>
         <w:t>Secret Management</w:t>
       </w:r>
-      <w:bookmarkEnd w:id="12"/>
+      <w:bookmarkEnd w:id="13"/>
+      <w:bookmarkEnd w:id="14"/>
+    </w:p>
+    <w:p>
+      <w:pPr>
+        <w:pStyle w:val="ListParagraph"/>
+        <w:numPr>
+          <w:ilvl w:val="0"/>
+          <w:numId w:val="17"/>
+        </w:numPr>
+        <w:spacing w:line="360" w:lineRule="auto"/>
+      </w:pPr>
+      <w:r>
+        <w:t>Deployment tools must never store live secrets unless:</w:t>
+      </w:r>
+    </w:p>
+    <w:p>
+      <w:pPr>
+        <w:pStyle w:val="ListParagraph"/>
+        <w:numPr>
+          <w:ilvl w:val="0"/>
+          <w:numId w:val="16"/>
+        </w:numPr>
+        <w:spacing w:line="360" w:lineRule="auto"/>
+      </w:pPr>
+      <w:r>
+        <w:t>Stored in an encrypted vault</w:t>
+      </w:r>
+    </w:p>
+    <w:p>
+      <w:pPr>
+        <w:pStyle w:val="ListParagraph"/>
+        <w:numPr>
+          <w:ilvl w:val="0"/>
+          <w:numId w:val="16"/>
+        </w:numPr>
+        <w:spacing w:line="360" w:lineRule="auto"/>
+      </w:pPr>
+      <w:r>
+        <w:t>Access is restricted via role-based access</w:t>
+      </w:r>
+    </w:p>
+    <w:p>
+      <w:pPr>
+        <w:pStyle w:val="ListParagraph"/>
+        <w:numPr>
+          <w:ilvl w:val="0"/>
+          <w:numId w:val="17"/>
+        </w:numPr>
+        <w:spacing w:line="360" w:lineRule="auto"/>
+      </w:pPr>
+      <w:r>
+        <w:t>Secrets must be masked in logs and never printed in console output.</w:t>
+      </w:r>
+    </w:p>
+    <w:p>
+      <w:pPr>
+        <w:pStyle w:val="ListParagraph"/>
+        <w:numPr>
+          <w:ilvl w:val="0"/>
+          <w:numId w:val="17"/>
+        </w:numPr>
+        <w:spacing w:line="360" w:lineRule="auto"/>
+      </w:pPr>
+      <w:r>
+        <w:t>Secrets must be rotated every 90 days or immediately upon suspicion.</w:t>
+      </w:r>
+    </w:p>
+    <w:p/>
+    <w:p>
+      <w:pPr>
+        <w:pStyle w:val="Heading2"/>
+      </w:pPr>
+      <w:bookmarkStart w:id="15" w:name="_Toc221453984"/>
+      <w:bookmarkStart w:id="16" w:name="_Toc237288120"/>
+      <w:r>
+        <w:t>Pipeline Integrity</w:t>
+      </w:r>
+      <w:bookmarkEnd w:id="15"/>
+      <w:bookmarkEnd w:id="16"/>
     </w:p>
     <w:p>
       <w:pPr>
@@ -4508,33 +4693,7 @@
         <w:spacing w:line="360" w:lineRule="auto"/>
       </w:pPr>
       <w:r>
-        <w:t>Deployment tools must never store live secrets unless:</w:t>
-      </w:r>
-    </w:p>
-    <w:p>
-      <w:pPr>
-        <w:pStyle w:val="ListParagraph"/>
-        <w:numPr>
-          <w:ilvl w:val="0"/>
-          <w:numId w:val="17"/>
-        </w:numPr>
-        <w:spacing w:line="360" w:lineRule="auto"/>
-      </w:pPr>
-      <w:r>
-        <w:t>Stored in an encrypted vault</w:t>
-      </w:r>
-    </w:p>
-    <w:p>
-      <w:pPr>
-        <w:pStyle w:val="ListParagraph"/>
-        <w:numPr>
-          <w:ilvl w:val="0"/>
-          <w:numId w:val="17"/>
-        </w:numPr>
-        <w:spacing w:line="360" w:lineRule="auto"/>
-      </w:pPr>
-      <w:r>
-        <w:t>Access is restricted via role-based access</w:t>
+        <w:t>Require code review before any deployment action can be triggered.</w:t>
       </w:r>
     </w:p>
     <w:p>
@@ -4547,7 +4706,7 @@
         <w:spacing w:line="360" w:lineRule="auto"/>
       </w:pPr>
       <w:r>
-        <w:t>Secrets must be masked in logs and never printed in console output.</w:t>
+        <w:t>All pipeline changes must be approved by Security or DevOps.</w:t>
       </w:r>
     </w:p>
     <w:p>
@@ -4560,22 +4719,8 @@
         <w:spacing w:line="360" w:lineRule="auto"/>
       </w:pPr>
       <w:r>
-        <w:t>Secrets must be rotated every 90 days or immediately upon suspicion.</w:t>
+        <w:t>Lock down pipeline tools so only approved users can modify:</w:t>
       </w:r>
-    </w:p>
-    <w:p/>
-    <w:p>
-      <w:pPr>
-        <w:pStyle w:val="Heading2"/>
-      </w:pPr>
-      <w:bookmarkStart w:id="13" w:name="_Toc221453984"/>
-      <w:r>
-        <w:t>P</w:t>
-      </w:r>
-      <w:r>
-        <w:t>ipeline Integrity</w:t>
-      </w:r>
-      <w:bookmarkEnd w:id="13"/>
     </w:p>
     <w:p>
       <w:pPr>
@@ -4587,7 +4732,7 @@
         <w:spacing w:line="360" w:lineRule="auto"/>
       </w:pPr>
       <w:r>
-        <w:t>Require code review before any deployment action can be triggered.</w:t>
+        <w:t>Build scripts</w:t>
       </w:r>
     </w:p>
     <w:p>
@@ -4600,7 +4745,7 @@
         <w:spacing w:line="360" w:lineRule="auto"/>
       </w:pPr>
       <w:r>
-        <w:t>All pipeline changes must be approved by Security or DevOps.</w:t>
+        <w:t>Deployment commands</w:t>
       </w:r>
     </w:p>
     <w:p>
@@ -4613,8 +4758,21 @@
         <w:spacing w:line="360" w:lineRule="auto"/>
       </w:pPr>
       <w:r>
-        <w:t>Lock down pipeline tools so only approved users can modify:</w:t>
+        <w:t>Server credentials</w:t>
       </w:r>
+    </w:p>
+    <w:p/>
+    <w:p>
+      <w:pPr>
+        <w:pStyle w:val="Heading2"/>
+      </w:pPr>
+      <w:bookmarkStart w:id="17" w:name="_Toc221453985"/>
+      <w:bookmarkStart w:id="18" w:name="_Toc237288121"/>
+      <w:r>
+        <w:t>GitHub Actions/Third-Party Pipelines</w:t>
+      </w:r>
+      <w:bookmarkEnd w:id="17"/>
+      <w:bookmarkEnd w:id="18"/>
     </w:p>
     <w:p>
       <w:pPr>
@@ -4622,56 +4780,6 @@
         <w:numPr>
           <w:ilvl w:val="0"/>
           <w:numId w:val="20"/>
-        </w:numPr>
-        <w:spacing w:line="360" w:lineRule="auto"/>
-      </w:pPr>
-      <w:r>
-        <w:t>Build scripts</w:t>
-      </w:r>
-    </w:p>
-    <w:p>
-      <w:pPr>
-        <w:pStyle w:val="ListParagraph"/>
-        <w:numPr>
-          <w:ilvl w:val="0"/>
-          <w:numId w:val="20"/>
-        </w:numPr>
-        <w:spacing w:line="360" w:lineRule="auto"/>
-      </w:pPr>
-      <w:r>
-        <w:t>Deployment commands</w:t>
-      </w:r>
-    </w:p>
-    <w:p>
-      <w:pPr>
-        <w:pStyle w:val="ListParagraph"/>
-        <w:numPr>
-          <w:ilvl w:val="0"/>
-          <w:numId w:val="20"/>
-        </w:numPr>
-        <w:spacing w:line="360" w:lineRule="auto"/>
-      </w:pPr>
-      <w:r>
-        <w:t>Server credentials</w:t>
-      </w:r>
-    </w:p>
-    <w:p/>
-    <w:p>
-      <w:pPr>
-        <w:pStyle w:val="Heading2"/>
-      </w:pPr>
-      <w:bookmarkStart w:id="14" w:name="_Toc221453985"/>
-      <w:r>
-        <w:t>GitHub Actions/Third-Party Pipelines</w:t>
-      </w:r>
-      <w:bookmarkEnd w:id="14"/>
-    </w:p>
-    <w:p>
-      <w:pPr>
-        <w:pStyle w:val="ListParagraph"/>
-        <w:numPr>
-          <w:ilvl w:val="0"/>
-          <w:numId w:val="21"/>
         </w:numPr>
         <w:spacing w:line="360" w:lineRule="auto"/>
       </w:pPr>
@@ -4694,7 +4802,7 @@
         <w:pStyle w:val="ListParagraph"/>
         <w:numPr>
           <w:ilvl w:val="0"/>
-          <w:numId w:val="21"/>
+          <w:numId w:val="20"/>
         </w:numPr>
         <w:spacing w:line="360" w:lineRule="auto"/>
       </w:pPr>
@@ -4717,73 +4825,13 @@
         <w:pStyle w:val="ListParagraph"/>
         <w:numPr>
           <w:ilvl w:val="0"/>
-          <w:numId w:val="21"/>
+          <w:numId w:val="20"/>
         </w:numPr>
         <w:spacing w:line="360" w:lineRule="auto"/>
       </w:pPr>
       <w:r>
-        <w:lastRenderedPageBreak/>
-        <w:t>Regular security reviews must be conducted for all third-party tools</w:t>
+        <w:t>Regular security reviews must be conducted for all third-party tools:</w:t>
       </w:r>
-      <w:r>
-        <w:t>:</w:t>
-      </w:r>
-    </w:p>
-    <w:p>
-      <w:pPr>
-        <w:pStyle w:val="ListParagraph"/>
-        <w:numPr>
-          <w:ilvl w:val="0"/>
-          <w:numId w:val="23"/>
-        </w:numPr>
-        <w:spacing w:line="360" w:lineRule="auto"/>
-      </w:pPr>
-      <w:r>
-        <w:t>Playwright</w:t>
-      </w:r>
-    </w:p>
-    <w:p>
-      <w:pPr>
-        <w:pStyle w:val="ListParagraph"/>
-        <w:numPr>
-          <w:ilvl w:val="0"/>
-          <w:numId w:val="23"/>
-        </w:numPr>
-        <w:spacing w:line="360" w:lineRule="auto"/>
-      </w:pPr>
-      <w:proofErr w:type="spellStart"/>
-      <w:r>
-        <w:t>Testpad</w:t>
-      </w:r>
-      <w:proofErr w:type="spellEnd"/>
-    </w:p>
-    <w:p>
-      <w:pPr>
-        <w:pStyle w:val="ListParagraph"/>
-        <w:numPr>
-          <w:ilvl w:val="0"/>
-          <w:numId w:val="23"/>
-        </w:numPr>
-        <w:spacing w:line="360" w:lineRule="auto"/>
-      </w:pPr>
-      <w:r>
-        <w:t>GitHub</w:t>
-      </w:r>
-    </w:p>
-    <w:p>
-      <w:pPr>
-        <w:spacing w:line="360" w:lineRule="auto"/>
-      </w:pPr>
-    </w:p>
-    <w:p>
-      <w:pPr>
-        <w:pStyle w:val="Heading2"/>
-      </w:pPr>
-      <w:bookmarkStart w:id="15" w:name="_Toc221453986"/>
-      <w:r>
-        <w:t>Logs &amp; Monitoring</w:t>
-      </w:r>
-      <w:bookmarkEnd w:id="15"/>
     </w:p>
     <w:p>
       <w:pPr>
@@ -4795,7 +4843,7 @@
         <w:spacing w:line="360" w:lineRule="auto"/>
       </w:pPr>
       <w:r>
-        <w:t>Pipeline logs must be retained for ≥ 180 days.</w:t>
+        <w:t>Playwright</w:t>
       </w:r>
     </w:p>
     <w:p>
@@ -4807,9 +4855,12 @@
         </w:numPr>
         <w:spacing w:line="360" w:lineRule="auto"/>
       </w:pPr>
+      <w:proofErr w:type="spellStart"/>
       <w:r>
-        <w:t>Any failed deployment attempts must trigger a review.</w:t>
+        <w:lastRenderedPageBreak/>
+        <w:t>Testpad</w:t>
       </w:r>
+      <w:proofErr w:type="spellEnd"/>
     </w:p>
     <w:p>
       <w:pPr>
@@ -4821,6 +4872,62 @@
         <w:spacing w:line="360" w:lineRule="auto"/>
       </w:pPr>
       <w:r>
+        <w:t>GitHub</w:t>
+      </w:r>
+    </w:p>
+    <w:p>
+      <w:pPr>
+        <w:spacing w:line="360" w:lineRule="auto"/>
+      </w:pPr>
+    </w:p>
+    <w:p>
+      <w:pPr>
+        <w:pStyle w:val="Heading2"/>
+      </w:pPr>
+      <w:bookmarkStart w:id="19" w:name="_Toc221453986"/>
+      <w:bookmarkStart w:id="20" w:name="_Toc237288122"/>
+      <w:r>
+        <w:t>Logs &amp; Monitoring</w:t>
+      </w:r>
+      <w:bookmarkEnd w:id="19"/>
+      <w:bookmarkEnd w:id="20"/>
+    </w:p>
+    <w:p>
+      <w:pPr>
+        <w:pStyle w:val="ListParagraph"/>
+        <w:numPr>
+          <w:ilvl w:val="0"/>
+          <w:numId w:val="21"/>
+        </w:numPr>
+        <w:spacing w:line="360" w:lineRule="auto"/>
+      </w:pPr>
+      <w:r>
+        <w:t>Pipeline logs must be retained for ≥ 180 days.</w:t>
+      </w:r>
+    </w:p>
+    <w:p>
+      <w:pPr>
+        <w:pStyle w:val="ListParagraph"/>
+        <w:numPr>
+          <w:ilvl w:val="0"/>
+          <w:numId w:val="21"/>
+        </w:numPr>
+        <w:spacing w:line="360" w:lineRule="auto"/>
+      </w:pPr>
+      <w:r>
+        <w:t>Any failed deployment attempts must trigger a review.</w:t>
+      </w:r>
+    </w:p>
+    <w:p>
+      <w:pPr>
+        <w:pStyle w:val="ListParagraph"/>
+        <w:numPr>
+          <w:ilvl w:val="0"/>
+          <w:numId w:val="21"/>
+        </w:numPr>
+        <w:spacing w:line="360" w:lineRule="auto"/>
+      </w:pPr>
+      <w:r>
         <w:t>Deployment logs must be centralized and monitored.</w:t>
       </w:r>
     </w:p>
@@ -4846,101 +4953,45 @@
     </w:p>
     <w:p>
       <w:pPr>
-        <w:spacing w:line="360" w:lineRule="auto"/>
-      </w:pPr>
-    </w:p>
-    <w:p>
-      <w:pPr>
-        <w:spacing w:line="360" w:lineRule="auto"/>
-      </w:pPr>
-    </w:p>
-    <w:p>
-      <w:pPr>
-        <w:spacing w:line="360" w:lineRule="auto"/>
-      </w:pPr>
-    </w:p>
-    <w:p>
-      <w:pPr>
-        <w:spacing w:line="360" w:lineRule="auto"/>
-      </w:pPr>
-    </w:p>
-    <w:p>
-      <w:pPr>
-        <w:spacing w:line="360" w:lineRule="auto"/>
-      </w:pPr>
-    </w:p>
-    <w:p>
-      <w:pPr>
-        <w:spacing w:line="360" w:lineRule="auto"/>
-      </w:pPr>
-    </w:p>
-    <w:p>
-      <w:pPr>
-        <w:spacing w:line="360" w:lineRule="auto"/>
-      </w:pPr>
-    </w:p>
-    <w:p>
-      <w:pPr>
-        <w:spacing w:line="360" w:lineRule="auto"/>
-      </w:pPr>
-    </w:p>
-    <w:p>
-      <w:pPr>
-        <w:spacing w:line="360" w:lineRule="auto"/>
-      </w:pPr>
-    </w:p>
-    <w:p>
-      <w:pPr>
-        <w:spacing w:line="360" w:lineRule="auto"/>
-      </w:pPr>
-    </w:p>
-    <w:p>
-      <w:pPr>
-        <w:spacing w:line="360" w:lineRule="auto"/>
-      </w:pPr>
-    </w:p>
-    <w:p>
-      <w:pPr>
-        <w:spacing w:line="360" w:lineRule="auto"/>
-      </w:pPr>
-    </w:p>
-    <w:p>
-      <w:pPr>
-        <w:spacing w:line="360" w:lineRule="auto"/>
-      </w:pPr>
-    </w:p>
-    <w:p>
-      <w:pPr>
         <w:pStyle w:val="Heading1"/>
       </w:pPr>
-      <w:bookmarkStart w:id="16" w:name="_Toc221453987"/>
+      <w:bookmarkStart w:id="21" w:name="_Toc237288123"/>
       <w:r>
         <w:lastRenderedPageBreak/>
         <w:t>VIOLATIONS</w:t>
       </w:r>
-      <w:bookmarkEnd w:id="16"/>
-    </w:p>
+      <w:bookmarkEnd w:id="21"/>
+    </w:p>
+    <w:p>
+      <w:r>
+        <w:t>Any violation requires immediate investigation and potential revocation of Deployment access.</w:t>
+      </w:r>
+    </w:p>
+    <w:p>
+      <w:pPr>
+        <w:spacing w:line="360" w:lineRule="auto"/>
+      </w:pPr>
+    </w:p>
+    <w:p/>
+    <w:p/>
     <w:p>
       <w:pPr>
         <w:sectPr>
           <w:headerReference w:type="default" r:id="rId12"/>
           <w:pgSz w:w="12240" w:h="15840"/>
-          <w:pgMar w:top="1417" w:right="1701" w:bottom="1417" w:left="1701" w:header="720" w:footer="720" w:gutter="0"/>
+          <w:pgMar w:top="1411" w:right="850" w:bottom="1411" w:left="850" w:header="576" w:footer="720" w:gutter="0"/>
           <w:pgNumType w:chapSep="period"/>
           <w:cols w:space="720"/>
           <w:docGrid w:linePitch="360"/>
         </w:sectPr>
       </w:pPr>
-      <w:r>
-        <w:t>Any violation requires immediate investigation and potential revocation of Deployment access.</w:t>
-      </w:r>
     </w:p>
     <w:p>
       <w:pPr>
         <w:pStyle w:val="Heading1"/>
         <w:spacing w:after="360"/>
       </w:pPr>
-      <w:bookmarkStart w:id="17" w:name="_Toc221453988"/>
+      <w:bookmarkStart w:id="22" w:name="_Toc237288124"/>
       <w:r>
         <w:lastRenderedPageBreak/>
         <w:t xml:space="preserve">POLICY </w:t>
@@ -4948,7 +4999,7 @@
       <w:r>
         <w:t>APPROVAL SIGNATURES</w:t>
       </w:r>
-      <w:bookmarkEnd w:id="17"/>
+      <w:bookmarkEnd w:id="22"/>
     </w:p>
     <w:p>
       <w:pPr>
@@ -4973,7 +5024,7 @@
     <w:tbl>
       <w:tblPr>
         <w:tblStyle w:val="TableGrid"/>
-        <w:tblW w:w="0" w:type="auto"/>
+        <w:tblW w:w="10615" w:type="dxa"/>
         <w:tblBorders>
           <w:top w:val="single" w:sz="4" w:space="0" w:color="D1D1D1" w:themeColor="background2" w:themeShade="E6"/>
           <w:left w:val="single" w:sz="4" w:space="0" w:color="D1D1D1" w:themeColor="background2" w:themeShade="E6"/>
@@ -4987,7 +5038,7 @@
       <w:tblGrid>
         <w:gridCol w:w="1765"/>
         <w:gridCol w:w="2190"/>
-        <w:gridCol w:w="2970"/>
+        <w:gridCol w:w="4770"/>
         <w:gridCol w:w="1890"/>
       </w:tblGrid>
       <w:tr>
@@ -5047,7 +5098,7 @@
         </w:tc>
         <w:tc>
           <w:tcPr>
-            <w:tcW w:w="2970" w:type="dxa"/>
+            <w:tcW w:w="4770" w:type="dxa"/>
             <w:shd w:val="clear" w:color="auto" w:fill="4F7ABA"/>
           </w:tcPr>
           <w:p>
@@ -5148,7 +5199,7 @@
         </w:tc>
         <w:tc>
           <w:tcPr>
-            <w:tcW w:w="2970" w:type="dxa"/>
+            <w:tcW w:w="4770" w:type="dxa"/>
           </w:tcPr>
           <w:p>
             <w:pPr>
@@ -5248,7 +5299,7 @@
         </w:tc>
         <w:tc>
           <w:tcPr>
-            <w:tcW w:w="2970" w:type="dxa"/>
+            <w:tcW w:w="4770" w:type="dxa"/>
           </w:tcPr>
           <w:p>
             <w:pPr>
@@ -5310,7 +5361,7 @@
         </w:tc>
         <w:tc>
           <w:tcPr>
-            <w:tcW w:w="2970" w:type="dxa"/>
+            <w:tcW w:w="4770" w:type="dxa"/>
           </w:tcPr>
           <w:p>
             <w:pPr>
@@ -5428,16 +5479,16 @@
     <w:tbl>
       <w:tblPr>
         <w:tblStyle w:val="TableGrid"/>
-        <w:tblW w:w="0" w:type="auto"/>
+        <w:tblW w:w="10615" w:type="dxa"/>
         <w:tblLook w:val="04A0" w:firstRow="1" w:lastRow="0" w:firstColumn="1" w:lastColumn="0" w:noHBand="0" w:noVBand="1"/>
       </w:tblPr>
       <w:tblGrid>
-        <w:gridCol w:w="8828"/>
+        <w:gridCol w:w="10615"/>
       </w:tblGrid>
       <w:tr>
         <w:tc>
           <w:tcPr>
-            <w:tcW w:w="8828" w:type="dxa"/>
+            <w:tcW w:w="10615" w:type="dxa"/>
           </w:tcPr>
           <w:p>
             <w:pPr>
@@ -5454,7 +5505,7 @@
     <w:sectPr>
       <w:headerReference w:type="default" r:id="rId13"/>
       <w:pgSz w:w="12240" w:h="15840"/>
-      <w:pgMar w:top="1417" w:right="1701" w:bottom="1417" w:left="1701" w:header="720" w:footer="720" w:gutter="0"/>
+      <w:pgMar w:top="1411" w:right="850" w:bottom="1411" w:left="850" w:header="576" w:footer="720" w:gutter="0"/>
       <w:pgNumType w:chapSep="period"/>
       <w:cols w:space="720"/>
       <w:docGrid w:linePitch="360"/>
@@ -5464,7 +5515,7 @@
 </file>
 
 <file path=word/endnotes.xml><?xml version="1.0" encoding="utf-8"?>
-<w:endnotes xmlns:wpc="http://schemas.microsoft.com/office/word/2010/wordprocessingCanvas" xmlns:cx="http://schemas.microsoft.com/office/drawing/2014/chartex" xmlns:cx1="http://schemas.microsoft.com/office/drawing/2015/9/8/chartex" xmlns:cx2="http://schemas.microsoft.com/office/drawing/2015/10/21/chartex" xmlns:cx3="http://schemas.microsoft.com/office/drawing/2016/5/9/chartex" xmlns:cx4="http://schemas.microsoft.com/office/drawing/2016/5/10/chartex" xmlns:cx5="http://schemas.microsoft.com/office/drawing/2016/5/11/chartex" xmlns:cx6="http://schemas.microsoft.com/office/drawing/2016/5/12/chartex" xmlns:cx7="http://schemas.microsoft.com/office/drawing/2016/5/13/chartex" xmlns:cx8="http://schemas.microsoft.com/office/drawing/2016/5/14/chartex" xmlns:mc="http://schemas.openxmlformats.org/markup-compatibility/2006" xmlns:aink="http://schemas.microsoft.com/office/drawing/2016/ink" xmlns:am3d="http://schemas.microsoft.com/office/drawing/2017/model3d" xmlns:o="urn:schemas-microsoft-com:office:office" xmlns:oel="http://schemas.microsoft.com/office/2019/extlst" xmlns:r="http://schemas.openxmlformats.org/officeDocument/2006/relationships" xmlns:m="http://schemas.openxmlformats.org/officeDocument/2006/math" xmlns:v="urn:schemas-microsoft-com:vml" xmlns:wp14="http://schemas.microsoft.com/office/word/2010/wordprocessingDrawing" xmlns:wp="http://schemas.openxmlformats.org/drawingml/2006/wordprocessingDrawing" xmlns:w10="urn:schemas-microsoft-com:office:word" xmlns:w="http://schemas.openxmlformats.org/wordprocessingml/2006/main" xmlns:w14="http://schemas.microsoft.com/office/word/2010/wordml" xmlns:w15="http://schemas.microsoft.com/office/word/2012/wordml" xmlns:w16cex="http://schemas.microsoft.com/office/word/2018/wordml/cex" xmlns:w16cid="http://schemas.microsoft.com/office/word/2016/wordml/cid" xmlns:w16="http://schemas.microsoft.com/office/word/2018/wordml" xmlns:w16du="http://schemas.microsoft.com/office/word/2023/wordml/word16du" xmlns:w16sdtdh="http://schemas.microsoft.com/office/word/2020/wordml/sdtdatahash" xmlns:w16sdtfl="http://schemas.microsoft.com/office/word/2024/wordml/sdtformatlock" xmlns:w16se="http://schemas.microsoft.com/office/word/2015/wordml/symex" xmlns:wpg="http://schemas.microsoft.com/office/word/2010/wordprocessingGroup" xmlns:wpi="http://schemas.microsoft.com/office/word/2010/wordprocessingInk" xmlns:wne="http://schemas.microsoft.com/office/word/2006/wordml" xmlns:wps="http://schemas.microsoft.com/office/word/2010/wordprocessingShape" mc:Ignorable="w14 w15 w16se w16cid w16 w16cex w16sdtdh w16sdtfl w16du wp14">
+<w:endnotes xmlns:wpc="http://schemas.microsoft.com/office/word/2010/wordprocessingCanvas" xmlns:cx="http://schemas.microsoft.com/office/drawing/2014/chartex" xmlns:cx1="http://schemas.microsoft.com/office/drawing/2015/9/8/chartex" xmlns:cx2="http://schemas.microsoft.com/office/drawing/2015/10/21/chartex" xmlns:cx3="http://schemas.microsoft.com/office/drawing/2016/5/9/chartex" xmlns:cx4="http://schemas.microsoft.com/office/drawing/2016/5/10/chartex" xmlns:cx5="http://schemas.microsoft.com/office/drawing/2016/5/11/chartex" xmlns:cx6="http://schemas.microsoft.com/office/drawing/2016/5/12/chartex" xmlns:cx7="http://schemas.microsoft.com/office/drawing/2016/5/13/chartex" xmlns:cx8="http://schemas.microsoft.com/office/drawing/2016/5/14/chartex" xmlns:mc="http://schemas.openxmlformats.org/markup-compatibility/2006" xmlns:aink="http://schemas.microsoft.com/office/drawing/2016/ink" xmlns:am3d="http://schemas.microsoft.com/office/drawing/2017/model3d" xmlns:o="urn:schemas-microsoft-com:office:office" xmlns:oel="http://schemas.microsoft.com/office/2019/extlst" xmlns:r="http://schemas.openxmlformats.org/officeDocument/2006/relationships" xmlns:m="http://schemas.openxmlformats.org/officeDocument/2006/math" xmlns:v="urn:schemas-microsoft-com:vml" xmlns:wp14="http://schemas.microsoft.com/office/word/2010/wordprocessingDrawing" xmlns:wp="http://schemas.openxmlformats.org/drawingml/2006/wordprocessingDrawing" xmlns:w10="urn:schemas-microsoft-com:office:word" xmlns:w="http://schemas.openxmlformats.org/wordprocessingml/2006/main" xmlns:w14="http://schemas.microsoft.com/office/word/2010/wordml" xmlns:w15="http://schemas.microsoft.com/office/word/2012/wordml" xmlns:w16cei="http://schemas.microsoft.com/office/word/2026/wordml/cei" xmlns:w16cex="http://schemas.microsoft.com/office/word/2018/wordml/cex" xmlns:w16cid="http://schemas.microsoft.com/office/word/2016/wordml/cid" xmlns:w16="http://schemas.microsoft.com/office/word/2018/wordml" xmlns:w16du="http://schemas.microsoft.com/office/word/2023/wordml/word16du" xmlns:w16sdtdh="http://schemas.microsoft.com/office/word/2020/wordml/sdtdatahash" xmlns:w16sdtfl="http://schemas.microsoft.com/office/word/2024/wordml/sdtformatlock" xmlns:w16se="http://schemas.microsoft.com/office/word/2015/wordml/symex" xmlns:wpg="http://schemas.microsoft.com/office/word/2010/wordprocessingGroup" xmlns:wpi="http://schemas.microsoft.com/office/word/2010/wordprocessingInk" xmlns:wne="http://schemas.microsoft.com/office/word/2006/wordml" xmlns:wps="http://schemas.microsoft.com/office/word/2010/wordprocessingShape" mc:Ignorable="w14 w15 w16se w16cid w16 w16cex w16sdtdh w16sdtfl w16du wp14">
   <w:endnote w:type="separator" w:id="-1">
     <w:p>
       <w:pPr>
@@ -5489,203 +5540,336 @@
 </file>
 
 <file path=word/footer1.xml><?xml version="1.0" encoding="utf-8"?>
-<w:ftr xmlns:wpc="http://schemas.microsoft.com/office/word/2010/wordprocessingCanvas" xmlns:cx="http://schemas.microsoft.com/office/drawing/2014/chartex" xmlns:cx1="http://schemas.microsoft.com/office/drawing/2015/9/8/chartex" xmlns:cx2="http://schemas.microsoft.com/office/drawing/2015/10/21/chartex" xmlns:cx3="http://schemas.microsoft.com/office/drawing/2016/5/9/chartex" xmlns:cx4="http://schemas.microsoft.com/office/drawing/2016/5/10/chartex" xmlns:cx5="http://schemas.microsoft.com/office/drawing/2016/5/11/chartex" xmlns:cx6="http://schemas.microsoft.com/office/drawing/2016/5/12/chartex" xmlns:cx7="http://schemas.microsoft.com/office/drawing/2016/5/13/chartex" xmlns:cx8="http://schemas.microsoft.com/office/drawing/2016/5/14/chartex" xmlns:mc="http://schemas.openxmlformats.org/markup-compatibility/2006" xmlns:aink="http://schemas.microsoft.com/office/drawing/2016/ink" xmlns:am3d="http://schemas.microsoft.com/office/drawing/2017/model3d" xmlns:o="urn:schemas-microsoft-com:office:office" xmlns:oel="http://schemas.microsoft.com/office/2019/extlst" xmlns:r="http://schemas.openxmlformats.org/officeDocument/2006/relationships" xmlns:m="http://schemas.openxmlformats.org/officeDocument/2006/math" xmlns:v="urn:schemas-microsoft-com:vml" xmlns:wp14="http://schemas.microsoft.com/office/word/2010/wordprocessingDrawing" xmlns:wp="http://schemas.openxmlformats.org/drawingml/2006/wordprocessingDrawing" xmlns:w10="urn:schemas-microsoft-com:office:word" xmlns:w="http://schemas.openxmlformats.org/wordprocessingml/2006/main" xmlns:w14="http://schemas.microsoft.com/office/word/2010/wordml" xmlns:w15="http://schemas.microsoft.com/office/word/2012/wordml" xmlns:w16cex="http://schemas.microsoft.com/office/word/2018/wordml/cex" xmlns:w16cid="http://schemas.microsoft.com/office/word/2016/wordml/cid" xmlns:w16="http://schemas.microsoft.com/office/word/2018/wordml" xmlns:w16du="http://schemas.microsoft.com/office/word/2023/wordml/word16du" xmlns:w16sdtdh="http://schemas.microsoft.com/office/word/2020/wordml/sdtdatahash" xmlns:w16sdtfl="http://schemas.microsoft.com/office/word/2024/wordml/sdtformatlock" xmlns:w16se="http://schemas.microsoft.com/office/word/2015/wordml/symex" xmlns:wpg="http://schemas.microsoft.com/office/word/2010/wordprocessingGroup" xmlns:wpi="http://schemas.microsoft.com/office/word/2010/wordprocessingInk" xmlns:wne="http://schemas.microsoft.com/office/word/2006/wordml" xmlns:wps="http://schemas.microsoft.com/office/word/2010/wordprocessingShape" mc:Ignorable="w14 w15 w16se w16cid w16 w16cex w16sdtdh w16sdtfl w16du wp14">
-  <w:sdt>
-    <w:sdtPr>
-      <w:id w:val="-1885865277"/>
-      <w:docPartObj>
-        <w:docPartGallery w:val="Page Numbers (Bottom of Page)"/>
-        <w:docPartUnique/>
-      </w:docPartObj>
-    </w:sdtPr>
-    <w:sdtEndPr>
-      <w:rPr>
-        <w:noProof/>
-        <w:color w:val="4F7ABA"/>
-        <w:sz w:val="16"/>
-        <w:szCs w:val="16"/>
-      </w:rPr>
-    </w:sdtEndPr>
-    <w:sdtContent>
-      <w:p>
-        <w:pPr>
-          <w:pStyle w:val="Footer"/>
-          <w:jc w:val="right"/>
-          <w:rPr>
-            <w:color w:val="4F7ABA"/>
-            <w:sz w:val="16"/>
-            <w:szCs w:val="16"/>
-          </w:rPr>
-        </w:pPr>
-        <w:r>
-          <w:rPr>
-            <w:color w:val="4F7ABA"/>
-            <w:sz w:val="16"/>
-            <w:szCs w:val="16"/>
-          </w:rPr>
-          <w:fldChar w:fldCharType="begin"/>
-        </w:r>
-        <w:r>
-          <w:rPr>
-            <w:color w:val="4F7ABA"/>
-            <w:sz w:val="16"/>
-            <w:szCs w:val="16"/>
-          </w:rPr>
-          <w:instrText xml:space="preserve"> PAGE   \* MERGEFORMAT </w:instrText>
-        </w:r>
-        <w:r>
-          <w:rPr>
-            <w:color w:val="4F7ABA"/>
-            <w:sz w:val="16"/>
-            <w:szCs w:val="16"/>
-          </w:rPr>
-          <w:fldChar w:fldCharType="separate"/>
-        </w:r>
-        <w:r>
-          <w:rPr>
-            <w:noProof/>
-            <w:color w:val="4F7ABA"/>
-            <w:sz w:val="16"/>
-            <w:szCs w:val="16"/>
-          </w:rPr>
-          <w:t>2</w:t>
-        </w:r>
-        <w:r>
-          <w:rPr>
-            <w:noProof/>
-            <w:color w:val="4F7ABA"/>
-            <w:sz w:val="16"/>
-            <w:szCs w:val="16"/>
-          </w:rPr>
-          <w:fldChar w:fldCharType="end"/>
-        </w:r>
-      </w:p>
-    </w:sdtContent>
-  </w:sdt>
+<w:ftr xmlns:wpc="http://schemas.microsoft.com/office/word/2010/wordprocessingCanvas" xmlns:cx="http://schemas.microsoft.com/office/drawing/2014/chartex" xmlns:cx1="http://schemas.microsoft.com/office/drawing/2015/9/8/chartex" xmlns:cx2="http://schemas.microsoft.com/office/drawing/2015/10/21/chartex" xmlns:cx3="http://schemas.microsoft.com/office/drawing/2016/5/9/chartex" xmlns:cx4="http://schemas.microsoft.com/office/drawing/2016/5/10/chartex" xmlns:cx5="http://schemas.microsoft.com/office/drawing/2016/5/11/chartex" xmlns:cx6="http://schemas.microsoft.com/office/drawing/2016/5/12/chartex" xmlns:cx7="http://schemas.microsoft.com/office/drawing/2016/5/13/chartex" xmlns:cx8="http://schemas.microsoft.com/office/drawing/2016/5/14/chartex" xmlns:mc="http://schemas.openxmlformats.org/markup-compatibility/2006" xmlns:aink="http://schemas.microsoft.com/office/drawing/2016/ink" xmlns:am3d="http://schemas.microsoft.com/office/drawing/2017/model3d" xmlns:o="urn:schemas-microsoft-com:office:office" xmlns:oel="http://schemas.microsoft.com/office/2019/extlst" xmlns:r="http://schemas.openxmlformats.org/officeDocument/2006/relationships" xmlns:m="http://schemas.openxmlformats.org/officeDocument/2006/math" xmlns:v="urn:schemas-microsoft-com:vml" xmlns:wp14="http://schemas.microsoft.com/office/word/2010/wordprocessingDrawing" xmlns:wp="http://schemas.openxmlformats.org/drawingml/2006/wordprocessingDrawing" xmlns:w10="urn:schemas-microsoft-com:office:word" xmlns:w="http://schemas.openxmlformats.org/wordprocessingml/2006/main" xmlns:w14="http://schemas.microsoft.com/office/word/2010/wordml" xmlns:w15="http://schemas.microsoft.com/office/word/2012/wordml" xmlns:w16cei="http://schemas.microsoft.com/office/word/2026/wordml/cei" xmlns:w16cex="http://schemas.microsoft.com/office/word/2018/wordml/cex" xmlns:w16cid="http://schemas.microsoft.com/office/word/2016/wordml/cid" xmlns:w16="http://schemas.microsoft.com/office/word/2018/wordml" xmlns:w16du="http://schemas.microsoft.com/office/word/2023/wordml/word16du" xmlns:w16sdtdh="http://schemas.microsoft.com/office/word/2020/wordml/sdtdatahash" xmlns:w16sdtfl="http://schemas.microsoft.com/office/word/2024/wordml/sdtformatlock" xmlns:w16se="http://schemas.microsoft.com/office/word/2015/wordml/symex" xmlns:wpg="http://schemas.microsoft.com/office/word/2010/wordprocessingGroup" xmlns:wpi="http://schemas.microsoft.com/office/word/2010/wordprocessingInk" xmlns:wne="http://schemas.microsoft.com/office/word/2006/wordml" xmlns:wps="http://schemas.microsoft.com/office/word/2010/wordprocessingShape" mc:Ignorable="w14 w15 w16se w16cid w16 w16cex w16sdtdh w16sdtfl w16du wp14">
+  <w:tbl>
+    <w:tblPr>
+      <w:tblStyle w:val="TableGrid"/>
+      <w:tblW w:w="5000" w:type="pct"/>
+      <w:jc w:val="center"/>
+      <w:tblBorders>
+        <w:top w:val="none" w:sz="0" w:space="0" w:color="auto"/>
+        <w:left w:val="none" w:sz="0" w:space="0" w:color="auto"/>
+        <w:bottom w:val="none" w:sz="0" w:space="0" w:color="auto"/>
+        <w:right w:val="none" w:sz="0" w:space="0" w:color="auto"/>
+        <w:insideH w:val="none" w:sz="0" w:space="0" w:color="auto"/>
+        <w:insideV w:val="none" w:sz="0" w:space="0" w:color="auto"/>
+      </w:tblBorders>
+      <w:tblLook w:val="04A0" w:firstRow="1" w:lastRow="0" w:firstColumn="1" w:lastColumn="0" w:noHBand="0" w:noVBand="1"/>
+    </w:tblPr>
+    <w:tblGrid>
+      <w:gridCol w:w="2225"/>
+      <w:gridCol w:w="2226"/>
+      <w:gridCol w:w="2226"/>
+      <w:gridCol w:w="1810"/>
+      <w:gridCol w:w="946"/>
+      <w:gridCol w:w="222"/>
+      <w:gridCol w:w="222"/>
+      <w:gridCol w:w="358"/>
+      <w:gridCol w:w="305"/>
+    </w:tblGrid>
+    <w:tr>
+      <w:trPr>
+        <w:cantSplit/>
+        <w:trHeight w:val="170"/>
+        <w:jc w:val="center"/>
+      </w:trPr>
+      <w:tc>
+        <w:tcPr>
+          <w:tcW w:w="4866" w:type="pct"/>
+          <w:gridSpan w:val="8"/>
+        </w:tcPr>
+        <w:p>
+          <w:pPr>
+            <w:jc w:val="center"/>
+            <w:rPr>
+              <w:sz w:val="12"/>
+              <w:szCs w:val="12"/>
+            </w:rPr>
+          </w:pPr>
+          <w:r>
+            <w:rPr>
+              <w:sz w:val="12"/>
+              <w:szCs w:val="12"/>
+            </w:rPr>
+            <w:t xml:space="preserve">© </w:t>
+          </w:r>
+          <w:r>
+            <w:rPr>
+              <w:bCs/>
+              <w:sz w:val="12"/>
+              <w:szCs w:val="12"/>
+            </w:rPr>
+            <w:t>202</w:t>
+          </w:r>
+          <w:r>
+            <w:rPr>
+              <w:bCs/>
+              <w:sz w:val="12"/>
+              <w:szCs w:val="12"/>
+            </w:rPr>
+            <w:t>6</w:t>
+          </w:r>
+          <w:r>
+            <w:rPr>
+              <w:bCs/>
+              <w:sz w:val="12"/>
+              <w:szCs w:val="12"/>
+            </w:rPr>
+            <w:t xml:space="preserve"> </w:t>
+          </w:r>
+          <w:r>
+            <w:rPr>
+              <w:sz w:val="12"/>
+              <w:szCs w:val="12"/>
+            </w:rPr>
+            <w:t>ZTERS</w:t>
+          </w:r>
+          <w:r>
+            <w:rPr>
+              <w:sz w:val="12"/>
+              <w:szCs w:val="12"/>
+            </w:rPr>
+            <w:t xml:space="preserve"> All rights reserved</w:t>
+          </w:r>
+        </w:p>
+        <w:p>
+          <w:pPr>
+            <w:jc w:val="center"/>
+            <w:rPr>
+              <w:sz w:val="12"/>
+              <w:szCs w:val="12"/>
+            </w:rPr>
+          </w:pPr>
+        </w:p>
+      </w:tc>
+      <w:tc>
+        <w:tcPr>
+          <w:tcW w:w="134" w:type="pct"/>
+          <w:vMerge w:val="restart"/>
+        </w:tcPr>
+        <w:p>
+          <w:pPr>
+            <w:rPr>
+              <w:b/>
+              <w:bCs/>
+              <w:color w:val="4F81BD"/>
+              <w:sz w:val="12"/>
+              <w:szCs w:val="12"/>
+            </w:rPr>
+          </w:pPr>
+          <w:r>
+            <w:rPr>
+              <w:b/>
+              <w:bCs/>
+              <w:color w:val="4F81BD"/>
+              <w:sz w:val="16"/>
+              <w:szCs w:val="16"/>
+            </w:rPr>
+            <w:fldChar w:fldCharType="begin"/>
+          </w:r>
+          <w:r>
+            <w:rPr>
+              <w:b/>
+              <w:bCs/>
+              <w:color w:val="4F81BD"/>
+              <w:sz w:val="16"/>
+              <w:szCs w:val="16"/>
+            </w:rPr>
+            <w:instrText xml:space="preserve"> PAGE   \* MERGEFORMAT </w:instrText>
+          </w:r>
+          <w:r>
+            <w:rPr>
+              <w:b/>
+              <w:bCs/>
+              <w:color w:val="4F81BD"/>
+              <w:sz w:val="16"/>
+              <w:szCs w:val="16"/>
+            </w:rPr>
+            <w:fldChar w:fldCharType="separate"/>
+          </w:r>
+          <w:r>
+            <w:rPr>
+              <w:b/>
+              <w:bCs/>
+              <w:noProof/>
+              <w:color w:val="4F81BD"/>
+              <w:sz w:val="16"/>
+              <w:szCs w:val="16"/>
+            </w:rPr>
+            <w:t>1</w:t>
+          </w:r>
+          <w:r>
+            <w:rPr>
+              <w:b/>
+              <w:bCs/>
+              <w:noProof/>
+              <w:color w:val="4F81BD"/>
+              <w:sz w:val="16"/>
+              <w:szCs w:val="16"/>
+            </w:rPr>
+            <w:fldChar w:fldCharType="end"/>
+          </w:r>
+        </w:p>
+      </w:tc>
+    </w:tr>
+    <w:tr>
+      <w:trPr>
+        <w:cantSplit/>
+        <w:trHeight w:val="115"/>
+        <w:jc w:val="center"/>
+      </w:trPr>
+      <w:tc>
+        <w:tcPr>
+          <w:tcW w:w="1080" w:type="pct"/>
+          <w:shd w:val="clear" w:color="auto" w:fill="E3983F"/>
+        </w:tcPr>
+        <w:p>
+          <w:pPr>
+            <w:jc w:val="center"/>
+            <w:rPr>
+              <w:sz w:val="6"/>
+              <w:szCs w:val="6"/>
+            </w:rPr>
+          </w:pPr>
+        </w:p>
+      </w:tc>
+      <w:tc>
+        <w:tcPr>
+          <w:tcW w:w="1080" w:type="pct"/>
+          <w:shd w:val="clear" w:color="auto" w:fill="66686C"/>
+        </w:tcPr>
+        <w:p>
+          <w:pPr>
+            <w:jc w:val="center"/>
+            <w:rPr>
+              <w:sz w:val="6"/>
+              <w:szCs w:val="6"/>
+            </w:rPr>
+          </w:pPr>
+        </w:p>
+      </w:tc>
+      <w:tc>
+        <w:tcPr>
+          <w:tcW w:w="1080" w:type="pct"/>
+          <w:shd w:val="clear" w:color="auto" w:fill="4F7ABA"/>
+        </w:tcPr>
+        <w:p>
+          <w:pPr>
+            <w:jc w:val="center"/>
+            <w:rPr>
+              <w:sz w:val="6"/>
+              <w:szCs w:val="6"/>
+            </w:rPr>
+          </w:pPr>
+        </w:p>
+      </w:tc>
+      <w:tc>
+        <w:tcPr>
+          <w:tcW w:w="883" w:type="pct"/>
+          <w:shd w:val="clear" w:color="auto" w:fill="4B327A"/>
+        </w:tcPr>
+        <w:p>
+          <w:pPr>
+            <w:jc w:val="center"/>
+            <w:rPr>
+              <w:sz w:val="6"/>
+              <w:szCs w:val="6"/>
+            </w:rPr>
+          </w:pPr>
+        </w:p>
+      </w:tc>
+      <w:tc>
+        <w:tcPr>
+          <w:tcW w:w="473" w:type="pct"/>
+          <w:shd w:val="clear" w:color="auto" w:fill="9ABF55"/>
+        </w:tcPr>
+        <w:p>
+          <w:pPr>
+            <w:jc w:val="center"/>
+            <w:rPr>
+              <w:sz w:val="6"/>
+              <w:szCs w:val="6"/>
+            </w:rPr>
+          </w:pPr>
+        </w:p>
+      </w:tc>
+      <w:tc>
+        <w:tcPr>
+          <w:tcW w:w="105" w:type="pct"/>
+          <w:shd w:val="clear" w:color="auto" w:fill="DA7238"/>
+        </w:tcPr>
+        <w:p>
+          <w:pPr>
+            <w:jc w:val="center"/>
+            <w:rPr>
+              <w:sz w:val="6"/>
+              <w:szCs w:val="6"/>
+            </w:rPr>
+          </w:pPr>
+        </w:p>
+      </w:tc>
+      <w:tc>
+        <w:tcPr>
+          <w:tcW w:w="105" w:type="pct"/>
+          <w:shd w:val="clear" w:color="auto" w:fill="B3D9E6"/>
+        </w:tcPr>
+        <w:p>
+          <w:pPr>
+            <w:jc w:val="center"/>
+            <w:rPr>
+              <w:sz w:val="6"/>
+              <w:szCs w:val="6"/>
+            </w:rPr>
+          </w:pPr>
+        </w:p>
+      </w:tc>
+      <w:tc>
+        <w:tcPr>
+          <w:tcW w:w="723" w:type="pct"/>
+          <w:shd w:val="clear" w:color="auto" w:fill="D2D3D4"/>
+        </w:tcPr>
+        <w:p>
+          <w:pPr>
+            <w:jc w:val="center"/>
+            <w:rPr>
+              <w:sz w:val="6"/>
+              <w:szCs w:val="6"/>
+            </w:rPr>
+          </w:pPr>
+        </w:p>
+      </w:tc>
+      <w:tc>
+        <w:tcPr>
+          <w:tcW w:w="134" w:type="pct"/>
+          <w:vMerge/>
+          <w:shd w:val="clear" w:color="auto" w:fill="D9D9D9" w:themeFill="background1" w:themeFillShade="D9"/>
+        </w:tcPr>
+        <w:p>
+          <w:pPr>
+            <w:jc w:val="center"/>
+            <w:rPr>
+              <w:sz w:val="6"/>
+              <w:szCs w:val="6"/>
+            </w:rPr>
+          </w:pPr>
+        </w:p>
+      </w:tc>
+    </w:tr>
+  </w:tbl>
   <w:p>
     <w:pPr>
       <w:spacing w:after="0"/>
-      <w:jc w:val="center"/>
-      <w:rPr>
-        <w:sz w:val="12"/>
-        <w:szCs w:val="12"/>
-      </w:rPr>
-    </w:pPr>
-    <w:r>
-      <w:rPr>
-        <w:sz w:val="12"/>
-        <w:szCs w:val="12"/>
-      </w:rPr>
-      <w:t xml:space="preserve">© </w:t>
-    </w:r>
-    <w:r>
-      <w:rPr>
-        <w:bCs/>
-        <w:sz w:val="12"/>
-        <w:szCs w:val="12"/>
-      </w:rPr>
-      <w:t xml:space="preserve">2025 </w:t>
-    </w:r>
-    <w:r>
-      <w:rPr>
-        <w:sz w:val="12"/>
-        <w:szCs w:val="12"/>
-      </w:rPr>
-      <w:t>ZTERS</w:t>
-    </w:r>
-    <w:r>
-      <w:rPr>
-        <w:sz w:val="12"/>
-        <w:szCs w:val="12"/>
-      </w:rPr>
-      <w:t xml:space="preserve"> All rights reserved</w:t>
-    </w:r>
-  </w:p>
-  <w:p>
-    <w:pPr>
-      <w:spacing w:after="0"/>
-      <w:jc w:val="center"/>
       <w:rPr>
         <w:sz w:val="6"/>
         <w:szCs w:val="6"/>
       </w:rPr>
     </w:pPr>
-    <w:r>
-      <w:rPr>
-        <w:noProof/>
-        <w:sz w:val="12"/>
-        <w:szCs w:val="12"/>
-      </w:rPr>
-      <w:drawing>
-        <wp:anchor distT="0" distB="0" distL="114300" distR="114300" simplePos="0" relativeHeight="251659264" behindDoc="1" locked="0" layoutInCell="1" allowOverlap="1" wp14:anchorId="0BC4D086" wp14:editId="18806678">
-          <wp:simplePos x="0" y="0"/>
-          <wp:positionH relativeFrom="margin">
-            <wp:align>center</wp:align>
-          </wp:positionH>
-          <wp:positionV relativeFrom="paragraph">
-            <wp:posOffset>100965</wp:posOffset>
-          </wp:positionV>
-          <wp:extent cx="4974336" cy="73152"/>
-          <wp:effectExtent l="0" t="0" r="0" b="3175"/>
-          <wp:wrapThrough wrapText="bothSides">
-            <wp:wrapPolygon edited="0">
-              <wp:start x="0" y="0"/>
-              <wp:lineTo x="0" y="16904"/>
-              <wp:lineTo x="21509" y="16904"/>
-              <wp:lineTo x="21509" y="0"/>
-              <wp:lineTo x="0" y="0"/>
-            </wp:wrapPolygon>
-          </wp:wrapThrough>
-          <wp:docPr id="1804451834" name="Picture 1"/>
-          <wp:cNvGraphicFramePr>
-            <a:graphicFrameLocks xmlns:a="http://schemas.openxmlformats.org/drawingml/2006/main" noChangeAspect="1"/>
-          </wp:cNvGraphicFramePr>
-          <a:graphic xmlns:a="http://schemas.openxmlformats.org/drawingml/2006/main">
-            <a:graphicData uri="http://schemas.openxmlformats.org/drawingml/2006/picture">
-              <pic:pic xmlns:pic="http://schemas.openxmlformats.org/drawingml/2006/picture">
-                <pic:nvPicPr>
-                  <pic:cNvPr id="1663663410" name=""/>
-                  <pic:cNvPicPr/>
-                </pic:nvPicPr>
-                <pic:blipFill>
-                  <a:blip r:embed="rId1">
-                    <a:extLst>
-                      <a:ext uri="{28A0092B-C50C-407E-A947-70E740481C1C}">
-                        <a14:useLocalDpi xmlns:a14="http://schemas.microsoft.com/office/drawing/2010/main" val="0"/>
-                      </a:ext>
-                    </a:extLst>
-                  </a:blip>
-                  <a:stretch>
-                    <a:fillRect/>
-                  </a:stretch>
-                </pic:blipFill>
-                <pic:spPr>
-                  <a:xfrm>
-                    <a:off x="0" y="0"/>
-                    <a:ext cx="4974336" cy="73152"/>
-                  </a:xfrm>
-                  <a:prstGeom prst="rect">
-                    <a:avLst/>
-                  </a:prstGeom>
-                </pic:spPr>
-              </pic:pic>
-            </a:graphicData>
-          </a:graphic>
-          <wp14:sizeRelH relativeFrom="margin">
-            <wp14:pctWidth>0</wp14:pctWidth>
-          </wp14:sizeRelH>
-          <wp14:sizeRelV relativeFrom="margin">
-            <wp14:pctHeight>0</wp14:pctHeight>
-          </wp14:sizeRelV>
-        </wp:anchor>
-      </w:drawing>
-    </w:r>
   </w:p>
 </w:ftr>
 </file>
 
 <file path=word/footnotes.xml><?xml version="1.0" encoding="utf-8"?>
-<w:footnotes xmlns:wpc="http://schemas.microsoft.com/office/word/2010/wordprocessingCanvas" xmlns:cx="http://schemas.microsoft.com/office/drawing/2014/chartex" xmlns:cx1="http://schemas.microsoft.com/office/drawing/2015/9/8/chartex" xmlns:cx2="http://schemas.microsoft.com/office/drawing/2015/10/21/chartex" xmlns:cx3="http://schemas.microsoft.com/office/drawing/2016/5/9/chartex" xmlns:cx4="http://schemas.microsoft.com/office/drawing/2016/5/10/chartex" xmlns:cx5="http://schemas.microsoft.com/office/drawing/2016/5/11/chartex" xmlns:cx6="http://schemas.microsoft.com/office/drawing/2016/5/12/chartex" xmlns:cx7="http://schemas.microsoft.com/office/drawing/2016/5/13/chartex" xmlns:cx8="http://schemas.microsoft.com/office/drawing/2016/5/14/chartex" xmlns:mc="http://schemas.openxmlformats.org/markup-compatibility/2006" xmlns:aink="http://schemas.microsoft.com/office/drawing/2016/ink" xmlns:am3d="http://schemas.microsoft.com/office/drawing/2017/model3d" xmlns:o="urn:schemas-microsoft-com:office:office" xmlns:oel="http://schemas.microsoft.com/office/2019/extlst" xmlns:r="http://schemas.openxmlformats.org/officeDocument/2006/relationships" xmlns:m="http://schemas.openxmlformats.org/officeDocument/2006/math" xmlns:v="urn:schemas-microsoft-com:vml" xmlns:wp14="http://schemas.microsoft.com/office/word/2010/wordprocessingDrawing" xmlns:wp="http://schemas.openxmlformats.org/drawingml/2006/wordprocessingDrawing" xmlns:w10="urn:schemas-microsoft-com:office:word" xmlns:w="http://schemas.openxmlformats.org/wordprocessingml/2006/main" xmlns:w14="http://schemas.microsoft.com/office/word/2010/wordml" xmlns:w15="http://schemas.microsoft.com/office/word/2012/wordml" xmlns:w16cex="http://schemas.microsoft.com/office/word/2018/wordml/cex" xmlns:w16cid="http://schemas.microsoft.com/office/word/2016/wordml/cid" xmlns:w16="http://schemas.microsoft.com/office/word/2018/wordml" xmlns:w16du="http://schemas.microsoft.com/office/word/2023/wordml/word16du" xmlns:w16sdtdh="http://schemas.microsoft.com/office/word/2020/wordml/sdtdatahash" xmlns:w16sdtfl="http://schemas.microsoft.com/office/word/2024/wordml/sdtformatlock" xmlns:w16se="http://schemas.microsoft.com/office/word/2015/wordml/symex" xmlns:wpg="http://schemas.microsoft.com/office/word/2010/wordprocessingGroup" xmlns:wpi="http://schemas.microsoft.com/office/word/2010/wordprocessingInk" xmlns:wne="http://schemas.microsoft.com/office/word/2006/wordml" xmlns:wps="http://schemas.microsoft.com/office/word/2010/wordprocessingShape" mc:Ignorable="w14 w15 w16se w16cid w16 w16cex w16sdtdh w16sdtfl w16du wp14">
+<w:footnotes xmlns:wpc="http://schemas.microsoft.com/office/word/2010/wordprocessingCanvas" xmlns:cx="http://schemas.microsoft.com/office/drawing/2014/chartex" xmlns:cx1="http://schemas.microsoft.com/office/drawing/2015/9/8/chartex" xmlns:cx2="http://schemas.microsoft.com/office/drawing/2015/10/21/chartex" xmlns:cx3="http://schemas.microsoft.com/office/drawing/2016/5/9/chartex" xmlns:cx4="http://schemas.microsoft.com/office/drawing/2016/5/10/chartex" xmlns:cx5="http://schemas.microsoft.com/office/drawing/2016/5/11/chartex" xmlns:cx6="http://schemas.microsoft.com/office/drawing/2016/5/12/chartex" xmlns:cx7="http://schemas.microsoft.com/office/drawing/2016/5/13/chartex" xmlns:cx8="http://schemas.microsoft.com/office/drawing/2016/5/14/chartex" xmlns:mc="http://schemas.openxmlformats.org/markup-compatibility/2006" xmlns:aink="http://schemas.microsoft.com/office/drawing/2016/ink" xmlns:am3d="http://schemas.microsoft.com/office/drawing/2017/model3d" xmlns:o="urn:schemas-microsoft-com:office:office" xmlns:oel="http://schemas.microsoft.com/office/2019/extlst" xmlns:r="http://schemas.openxmlformats.org/officeDocument/2006/relationships" xmlns:m="http://schemas.openxmlformats.org/officeDocument/2006/math" xmlns:v="urn:schemas-microsoft-com:vml" xmlns:wp14="http://schemas.microsoft.com/office/word/2010/wordprocessingDrawing" xmlns:wp="http://schemas.openxmlformats.org/drawingml/2006/wordprocessingDrawing" xmlns:w10="urn:schemas-microsoft-com:office:word" xmlns:w="http://schemas.openxmlformats.org/wordprocessingml/2006/main" xmlns:w14="http://schemas.microsoft.com/office/word/2010/wordml" xmlns:w15="http://schemas.microsoft.com/office/word/2012/wordml" xmlns:w16cei="http://schemas.microsoft.com/office/word/2026/wordml/cei" xmlns:w16cex="http://schemas.microsoft.com/office/word/2018/wordml/cex" xmlns:w16cid="http://schemas.microsoft.com/office/word/2016/wordml/cid" xmlns:w16="http://schemas.microsoft.com/office/word/2018/wordml" xmlns:w16du="http://schemas.microsoft.com/office/word/2023/wordml/word16du" xmlns:w16sdtdh="http://schemas.microsoft.com/office/word/2020/wordml/sdtdatahash" xmlns:w16sdtfl="http://schemas.microsoft.com/office/word/2024/wordml/sdtformatlock" xmlns:w16se="http://schemas.microsoft.com/office/word/2015/wordml/symex" xmlns:wpg="http://schemas.microsoft.com/office/word/2010/wordprocessingGroup" xmlns:wpi="http://schemas.microsoft.com/office/word/2010/wordprocessingInk" xmlns:wne="http://schemas.microsoft.com/office/word/2006/wordml" xmlns:wps="http://schemas.microsoft.com/office/word/2010/wordprocessingShape" mc:Ignorable="w14 w15 w16se w16cid w16 w16cex w16sdtdh w16sdtfl w16du wp14">
   <w:footnote w:type="separator" w:id="-1">
     <w:p>
       <w:pPr>
@@ -5710,7 +5894,119 @@
 </file>
 
 <file path=word/header1.xml><?xml version="1.0" encoding="utf-8"?>
-<w:hdr xmlns:wpc="http://schemas.microsoft.com/office/word/2010/wordprocessingCanvas" xmlns:cx="http://schemas.microsoft.com/office/drawing/2014/chartex" xmlns:cx1="http://schemas.microsoft.com/office/drawing/2015/9/8/chartex" xmlns:cx2="http://schemas.microsoft.com/office/drawing/2015/10/21/chartex" xmlns:cx3="http://schemas.microsoft.com/office/drawing/2016/5/9/chartex" xmlns:cx4="http://schemas.microsoft.com/office/drawing/2016/5/10/chartex" xmlns:cx5="http://schemas.microsoft.com/office/drawing/2016/5/11/chartex" xmlns:cx6="http://schemas.microsoft.com/office/drawing/2016/5/12/chartex" xmlns:cx7="http://schemas.microsoft.com/office/drawing/2016/5/13/chartex" xmlns:cx8="http://schemas.microsoft.com/office/drawing/2016/5/14/chartex" xmlns:mc="http://schemas.openxmlformats.org/markup-compatibility/2006" xmlns:aink="http://schemas.microsoft.com/office/drawing/2016/ink" xmlns:am3d="http://schemas.microsoft.com/office/drawing/2017/model3d" xmlns:o="urn:schemas-microsoft-com:office:office" xmlns:oel="http://schemas.microsoft.com/office/2019/extlst" xmlns:r="http://schemas.openxmlformats.org/officeDocument/2006/relationships" xmlns:m="http://schemas.openxmlformats.org/officeDocument/2006/math" xmlns:v="urn:schemas-microsoft-com:vml" xmlns:wp14="http://schemas.microsoft.com/office/word/2010/wordprocessingDrawing" xmlns:wp="http://schemas.openxmlformats.org/drawingml/2006/wordprocessingDrawing" xmlns:w10="urn:schemas-microsoft-com:office:word" xmlns:w="http://schemas.openxmlformats.org/wordprocessingml/2006/main" xmlns:w14="http://schemas.microsoft.com/office/word/2010/wordml" xmlns:w15="http://schemas.microsoft.com/office/word/2012/wordml" xmlns:w16cex="http://schemas.microsoft.com/office/word/2018/wordml/cex" xmlns:w16cid="http://schemas.microsoft.com/office/word/2016/wordml/cid" xmlns:w16="http://schemas.microsoft.com/office/word/2018/wordml" xmlns:w16du="http://schemas.microsoft.com/office/word/2023/wordml/word16du" xmlns:w16sdtdh="http://schemas.microsoft.com/office/word/2020/wordml/sdtdatahash" xmlns:w16sdtfl="http://schemas.microsoft.com/office/word/2024/wordml/sdtformatlock" xmlns:w16se="http://schemas.microsoft.com/office/word/2015/wordml/symex" xmlns:wpg="http://schemas.microsoft.com/office/word/2010/wordprocessingGroup" xmlns:wpi="http://schemas.microsoft.com/office/word/2010/wordprocessingInk" xmlns:wne="http://schemas.microsoft.com/office/word/2006/wordml" xmlns:wps="http://schemas.microsoft.com/office/word/2010/wordprocessingShape" mc:Ignorable="w14 w15 w16se w16cid w16 w16cex w16sdtdh w16sdtfl w16du wp14">
+<w:hdr xmlns:wpc="http://schemas.microsoft.com/office/word/2010/wordprocessingCanvas" xmlns:cx="http://schemas.microsoft.com/office/drawing/2014/chartex" xmlns:cx1="http://schemas.microsoft.com/office/drawing/2015/9/8/chartex" xmlns:cx2="http://schemas.microsoft.com/office/drawing/2015/10/21/chartex" xmlns:cx3="http://schemas.microsoft.com/office/drawing/2016/5/9/chartex" xmlns:cx4="http://schemas.microsoft.com/office/drawing/2016/5/10/chartex" xmlns:cx5="http://schemas.microsoft.com/office/drawing/2016/5/11/chartex" xmlns:cx6="http://schemas.microsoft.com/office/drawing/2016/5/12/chartex" xmlns:cx7="http://schemas.microsoft.com/office/drawing/2016/5/13/chartex" xmlns:cx8="http://schemas.microsoft.com/office/drawing/2016/5/14/chartex" xmlns:mc="http://schemas.openxmlformats.org/markup-compatibility/2006" xmlns:aink="http://schemas.microsoft.com/office/drawing/2016/ink" xmlns:am3d="http://schemas.microsoft.com/office/drawing/2017/model3d" xmlns:o="urn:schemas-microsoft-com:office:office" xmlns:oel="http://schemas.microsoft.com/office/2019/extlst" xmlns:r="http://schemas.openxmlformats.org/officeDocument/2006/relationships" xmlns:m="http://schemas.openxmlformats.org/officeDocument/2006/math" xmlns:v="urn:schemas-microsoft-com:vml" xmlns:wp14="http://schemas.microsoft.com/office/word/2010/wordprocessingDrawing" xmlns:wp="http://schemas.openxmlformats.org/drawingml/2006/wordprocessingDrawing" xmlns:w10="urn:schemas-microsoft-com:office:word" xmlns:w="http://schemas.openxmlformats.org/wordprocessingml/2006/main" xmlns:w14="http://schemas.microsoft.com/office/word/2010/wordml" xmlns:w15="http://schemas.microsoft.com/office/word/2012/wordml" xmlns:w16cei="http://schemas.microsoft.com/office/word/2026/wordml/cei" xmlns:w16cex="http://schemas.microsoft.com/office/word/2018/wordml/cex" xmlns:w16cid="http://schemas.microsoft.com/office/word/2016/wordml/cid" xmlns:w16="http://schemas.microsoft.com/office/word/2018/wordml" xmlns:w16du="http://schemas.microsoft.com/office/word/2023/wordml/word16du" xmlns:w16sdtdh="http://schemas.microsoft.com/office/word/2020/wordml/sdtdatahash" xmlns:w16sdtfl="http://schemas.microsoft.com/office/word/2024/wordml/sdtformatlock" xmlns:w16se="http://schemas.microsoft.com/office/word/2015/wordml/symex" xmlns:wpg="http://schemas.microsoft.com/office/word/2010/wordprocessingGroup" xmlns:wpi="http://schemas.microsoft.com/office/word/2010/wordprocessingInk" xmlns:wne="http://schemas.microsoft.com/office/word/2006/wordml" xmlns:wps="http://schemas.microsoft.com/office/word/2010/wordprocessingShape" mc:Ignorable="w14 w15 w16se w16cid w16 w16cex w16sdtdh w16sdtfl w16du wp14">
+  <w:tbl>
+    <w:tblPr>
+      <w:tblStyle w:val="TableGrid"/>
+      <w:tblW w:w="0" w:type="auto"/>
+      <w:tblBorders>
+        <w:top w:val="none" w:sz="0" w:space="0" w:color="auto"/>
+        <w:left w:val="none" w:sz="0" w:space="0" w:color="auto"/>
+        <w:bottom w:val="none" w:sz="0" w:space="0" w:color="auto"/>
+        <w:right w:val="none" w:sz="0" w:space="0" w:color="auto"/>
+        <w:insideH w:val="none" w:sz="0" w:space="0" w:color="auto"/>
+        <w:insideV w:val="none" w:sz="0" w:space="0" w:color="auto"/>
+      </w:tblBorders>
+      <w:tblLook w:val="04A0" w:firstRow="1" w:lastRow="0" w:firstColumn="1" w:lastColumn="0" w:noHBand="0" w:noVBand="1"/>
+    </w:tblPr>
+    <w:tblGrid>
+      <w:gridCol w:w="9811"/>
+      <w:gridCol w:w="729"/>
+    </w:tblGrid>
+    <w:tr>
+      <w:tc>
+        <w:tcPr>
+          <w:tcW w:w="9895" w:type="dxa"/>
+        </w:tcPr>
+        <w:p>
+          <w:pPr>
+            <w:pStyle w:val="Header"/>
+            <w:tabs>
+              <w:tab w:val="clear" w:pos="4419"/>
+              <w:tab w:val="clear" w:pos="8838"/>
+              <w:tab w:val="center" w:pos="4792"/>
+            </w:tabs>
+            <w:rPr>
+              <w:sz w:val="16"/>
+              <w:szCs w:val="16"/>
+            </w:rPr>
+          </w:pPr>
+          <w:r>
+            <w:rPr>
+              <w:sz w:val="16"/>
+              <w:szCs w:val="16"/>
+            </w:rPr>
+            <w:tab/>
+          </w:r>
+        </w:p>
+      </w:tc>
+      <w:tc>
+        <w:tcPr>
+          <w:tcW w:w="635" w:type="dxa"/>
+        </w:tcPr>
+        <w:p>
+          <w:pPr>
+            <w:pStyle w:val="Header"/>
+          </w:pPr>
+          <w:r>
+            <w:rPr>
+              <w:noProof/>
+              <w:sz w:val="16"/>
+              <w:szCs w:val="16"/>
+            </w:rPr>
+            <w:drawing>
+              <wp:inline distT="0" distB="0" distL="0" distR="0" wp14:anchorId="03258910" wp14:editId="5207D3B9">
+                <wp:extent cx="326004" cy="378092"/>
+                <wp:effectExtent l="0" t="0" r="0" b="3175"/>
+                <wp:docPr id="1378002324" name="Picture 1" descr="The Site Savvy Blog - News, trends, tips, and environmental knowledge."/>
+                <wp:cNvGraphicFramePr>
+                  <a:graphicFrameLocks xmlns:a="http://schemas.openxmlformats.org/drawingml/2006/main" noChangeAspect="1"/>
+                </wp:cNvGraphicFramePr>
+                <a:graphic xmlns:a="http://schemas.openxmlformats.org/drawingml/2006/main">
+                  <a:graphicData uri="http://schemas.openxmlformats.org/drawingml/2006/picture">
+                    <pic:pic xmlns:pic="http://schemas.openxmlformats.org/drawingml/2006/picture">
+                      <pic:nvPicPr>
+                        <pic:cNvPr id="0" name="Picture 1" descr="The Site Savvy Blog - News, trends, tips, and environmental knowledge."/>
+                        <pic:cNvPicPr>
+                          <a:picLocks noChangeAspect="1" noChangeArrowheads="1"/>
+                        </pic:cNvPicPr>
+                      </pic:nvPicPr>
+                      <pic:blipFill>
+                        <a:blip r:embed="rId1">
+                          <a:extLst>
+                            <a:ext uri="{28A0092B-C50C-407E-A947-70E740481C1C}">
+                              <a14:useLocalDpi xmlns:a14="http://schemas.microsoft.com/office/drawing/2010/main" val="0"/>
+                            </a:ext>
+                          </a:extLst>
+                        </a:blip>
+                        <a:srcRect/>
+                        <a:stretch>
+                          <a:fillRect/>
+                        </a:stretch>
+                      </pic:blipFill>
+                      <pic:spPr bwMode="auto">
+                        <a:xfrm rot="10800000" flipH="1" flipV="1">
+                          <a:off x="0" y="0"/>
+                          <a:ext cx="326004" cy="378092"/>
+                        </a:xfrm>
+                        <a:prstGeom prst="rect">
+                          <a:avLst/>
+                        </a:prstGeom>
+                        <a:noFill/>
+                        <a:ln>
+                          <a:noFill/>
+                        </a:ln>
+                      </pic:spPr>
+                    </pic:pic>
+                  </a:graphicData>
+                </a:graphic>
+              </wp:inline>
+            </w:drawing>
+          </w:r>
+        </w:p>
+      </w:tc>
+    </w:tr>
+  </w:tbl>
   <w:p>
     <w:pPr>
       <w:pStyle w:val="Header"/>
@@ -5719,84 +6015,260 @@
         <w:szCs w:val="16"/>
       </w:rPr>
     </w:pPr>
-    <w:r>
-      <w:rPr>
-        <w:noProof/>
-        <w:sz w:val="16"/>
-        <w:szCs w:val="16"/>
-      </w:rPr>
-      <w:drawing>
-        <wp:anchor distT="0" distB="0" distL="114300" distR="114300" simplePos="0" relativeHeight="251658240" behindDoc="0" locked="0" layoutInCell="1" allowOverlap="1" wp14:anchorId="721155DB" wp14:editId="2090B805">
-          <wp:simplePos x="0" y="0"/>
-          <wp:positionH relativeFrom="column">
-            <wp:posOffset>5820465</wp:posOffset>
-          </wp:positionH>
-          <wp:positionV relativeFrom="paragraph">
-            <wp:posOffset>-19685</wp:posOffset>
-          </wp:positionV>
-          <wp:extent cx="326004" cy="378092"/>
-          <wp:effectExtent l="0" t="0" r="0" b="3175"/>
-          <wp:wrapThrough wrapText="bothSides">
-            <wp:wrapPolygon edited="0">
-              <wp:start x="21600" y="21600"/>
-              <wp:lineTo x="21600" y="908"/>
-              <wp:lineTo x="1389" y="908"/>
-              <wp:lineTo x="1389" y="18333"/>
-              <wp:lineTo x="2653" y="21600"/>
-              <wp:lineTo x="21600" y="21600"/>
-            </wp:wrapPolygon>
-          </wp:wrapThrough>
-          <wp:docPr id="377651636" name="Picture 1" descr="The Site Savvy Blog - News, trends, tips, and environmental knowledge."/>
-          <wp:cNvGraphicFramePr>
-            <a:graphicFrameLocks xmlns:a="http://schemas.openxmlformats.org/drawingml/2006/main" noChangeAspect="1"/>
-          </wp:cNvGraphicFramePr>
-          <a:graphic xmlns:a="http://schemas.openxmlformats.org/drawingml/2006/main">
-            <a:graphicData uri="http://schemas.openxmlformats.org/drawingml/2006/picture">
-              <pic:pic xmlns:pic="http://schemas.openxmlformats.org/drawingml/2006/picture">
-                <pic:nvPicPr>
-                  <pic:cNvPr id="0" name="Picture 1" descr="The Site Savvy Blog - News, trends, tips, and environmental knowledge."/>
-                  <pic:cNvPicPr>
-                    <a:picLocks noChangeAspect="1" noChangeArrowheads="1"/>
-                  </pic:cNvPicPr>
-                </pic:nvPicPr>
-                <pic:blipFill>
-                  <a:blip r:embed="rId1">
-                    <a:extLst>
-                      <a:ext uri="{28A0092B-C50C-407E-A947-70E740481C1C}">
-                        <a14:useLocalDpi xmlns:a14="http://schemas.microsoft.com/office/drawing/2010/main" val="0"/>
-                      </a:ext>
-                    </a:extLst>
-                  </a:blip>
-                  <a:srcRect/>
-                  <a:stretch>
-                    <a:fillRect/>
-                  </a:stretch>
-                </pic:blipFill>
-                <pic:spPr bwMode="auto">
-                  <a:xfrm rot="10800000" flipH="1" flipV="1">
-                    <a:off x="0" y="0"/>
-                    <a:ext cx="326004" cy="378092"/>
-                  </a:xfrm>
-                  <a:prstGeom prst="rect">
-                    <a:avLst/>
-                  </a:prstGeom>
-                  <a:noFill/>
-                  <a:ln>
-                    <a:noFill/>
-                  </a:ln>
-                </pic:spPr>
-              </pic:pic>
-            </a:graphicData>
-          </a:graphic>
-        </wp:anchor>
-      </w:drawing>
-    </w:r>
   </w:p>
 </w:hdr>
 </file>
 
 <file path=word/header2.xml><?xml version="1.0" encoding="utf-8"?>
-<w:hdr xmlns:wpc="http://schemas.microsoft.com/office/word/2010/wordprocessingCanvas" xmlns:cx="http://schemas.microsoft.com/office/drawing/2014/chartex" xmlns:cx1="http://schemas.microsoft.com/office/drawing/2015/9/8/chartex" xmlns:cx2="http://schemas.microsoft.com/office/drawing/2015/10/21/chartex" xmlns:cx3="http://schemas.microsoft.com/office/drawing/2016/5/9/chartex" xmlns:cx4="http://schemas.microsoft.com/office/drawing/2016/5/10/chartex" xmlns:cx5="http://schemas.microsoft.com/office/drawing/2016/5/11/chartex" xmlns:cx6="http://schemas.microsoft.com/office/drawing/2016/5/12/chartex" xmlns:cx7="http://schemas.microsoft.com/office/drawing/2016/5/13/chartex" xmlns:cx8="http://schemas.microsoft.com/office/drawing/2016/5/14/chartex" xmlns:mc="http://schemas.openxmlformats.org/markup-compatibility/2006" xmlns:aink="http://schemas.microsoft.com/office/drawing/2016/ink" xmlns:am3d="http://schemas.microsoft.com/office/drawing/2017/model3d" xmlns:o="urn:schemas-microsoft-com:office:office" xmlns:oel="http://schemas.microsoft.com/office/2019/extlst" xmlns:r="http://schemas.openxmlformats.org/officeDocument/2006/relationships" xmlns:m="http://schemas.openxmlformats.org/officeDocument/2006/math" xmlns:v="urn:schemas-microsoft-com:vml" xmlns:wp14="http://schemas.microsoft.com/office/word/2010/wordprocessingDrawing" xmlns:wp="http://schemas.openxmlformats.org/drawingml/2006/wordprocessingDrawing" xmlns:w10="urn:schemas-microsoft-com:office:word" xmlns:w="http://schemas.openxmlformats.org/wordprocessingml/2006/main" xmlns:w14="http://schemas.microsoft.com/office/word/2010/wordml" xmlns:w15="http://schemas.microsoft.com/office/word/2012/wordml" xmlns:w16cex="http://schemas.microsoft.com/office/word/2018/wordml/cex" xmlns:w16cid="http://schemas.microsoft.com/office/word/2016/wordml/cid" xmlns:w16="http://schemas.microsoft.com/office/word/2018/wordml" xmlns:w16du="http://schemas.microsoft.com/office/word/2023/wordml/word16du" xmlns:w16sdtdh="http://schemas.microsoft.com/office/word/2020/wordml/sdtdatahash" xmlns:w16sdtfl="http://schemas.microsoft.com/office/word/2024/wordml/sdtformatlock" xmlns:w16se="http://schemas.microsoft.com/office/word/2015/wordml/symex" xmlns:wpg="http://schemas.microsoft.com/office/word/2010/wordprocessingGroup" xmlns:wpi="http://schemas.microsoft.com/office/word/2010/wordprocessingInk" xmlns:wne="http://schemas.microsoft.com/office/word/2006/wordml" xmlns:wps="http://schemas.microsoft.com/office/word/2010/wordprocessingShape" mc:Ignorable="w14 w15 w16se w16cid w16 w16cex w16sdtdh w16sdtfl w16du wp14">
+<w:hdr xmlns:wpc="http://schemas.microsoft.com/office/word/2010/wordprocessingCanvas" xmlns:cx="http://schemas.microsoft.com/office/drawing/2014/chartex" xmlns:cx1="http://schemas.microsoft.com/office/drawing/2015/9/8/chartex" xmlns:cx2="http://schemas.microsoft.com/office/drawing/2015/10/21/chartex" xmlns:cx3="http://schemas.microsoft.com/office/drawing/2016/5/9/chartex" xmlns:cx4="http://schemas.microsoft.com/office/drawing/2016/5/10/chartex" xmlns:cx5="http://schemas.microsoft.com/office/drawing/2016/5/11/chartex" xmlns:cx6="http://schemas.microsoft.com/office/drawing/2016/5/12/chartex" xmlns:cx7="http://schemas.microsoft.com/office/drawing/2016/5/13/chartex" xmlns:cx8="http://schemas.microsoft.com/office/drawing/2016/5/14/chartex" xmlns:mc="http://schemas.openxmlformats.org/markup-compatibility/2006" xmlns:aink="http://schemas.microsoft.com/office/drawing/2016/ink" xmlns:am3d="http://schemas.microsoft.com/office/drawing/2017/model3d" xmlns:o="urn:schemas-microsoft-com:office:office" xmlns:oel="http://schemas.microsoft.com/office/2019/extlst" xmlns:r="http://schemas.openxmlformats.org/officeDocument/2006/relationships" xmlns:m="http://schemas.openxmlformats.org/officeDocument/2006/math" xmlns:v="urn:schemas-microsoft-com:vml" xmlns:wp14="http://schemas.microsoft.com/office/word/2010/wordprocessingDrawing" xmlns:wp="http://schemas.openxmlformats.org/drawingml/2006/wordprocessingDrawing" xmlns:w10="urn:schemas-microsoft-com:office:word" xmlns:w="http://schemas.openxmlformats.org/wordprocessingml/2006/main" xmlns:w14="http://schemas.microsoft.com/office/word/2010/wordml" xmlns:w15="http://schemas.microsoft.com/office/word/2012/wordml" xmlns:w16cei="http://schemas.microsoft.com/office/word/2026/wordml/cei" xmlns:w16cex="http://schemas.microsoft.com/office/word/2018/wordml/cex" xmlns:w16cid="http://schemas.microsoft.com/office/word/2016/wordml/cid" xmlns:w16="http://schemas.microsoft.com/office/word/2018/wordml" xmlns:w16du="http://schemas.microsoft.com/office/word/2023/wordml/word16du" xmlns:w16sdtdh="http://schemas.microsoft.com/office/word/2020/wordml/sdtdatahash" xmlns:w16sdtfl="http://schemas.microsoft.com/office/word/2024/wordml/sdtformatlock" xmlns:w16se="http://schemas.microsoft.com/office/word/2015/wordml/symex" xmlns:wpg="http://schemas.microsoft.com/office/word/2010/wordprocessingGroup" xmlns:wpi="http://schemas.microsoft.com/office/word/2010/wordprocessingInk" xmlns:wne="http://schemas.microsoft.com/office/word/2006/wordml" xmlns:wps="http://schemas.microsoft.com/office/word/2010/wordprocessingShape" mc:Ignorable="w14 w15 w16se w16cid w16 w16cex w16sdtdh w16sdtfl w16du wp14">
+  <w:tbl>
+    <w:tblPr>
+      <w:tblStyle w:val="TableGrid"/>
+      <w:tblW w:w="0" w:type="auto"/>
+      <w:tblBorders>
+        <w:top w:val="none" w:sz="0" w:space="0" w:color="auto"/>
+        <w:left w:val="none" w:sz="0" w:space="0" w:color="auto"/>
+        <w:bottom w:val="none" w:sz="0" w:space="0" w:color="auto"/>
+        <w:right w:val="none" w:sz="0" w:space="0" w:color="auto"/>
+        <w:insideH w:val="none" w:sz="0" w:space="0" w:color="auto"/>
+        <w:insideV w:val="none" w:sz="0" w:space="0" w:color="auto"/>
+      </w:tblBorders>
+      <w:tblLook w:val="04A0" w:firstRow="1" w:lastRow="0" w:firstColumn="1" w:lastColumn="0" w:noHBand="0" w:noVBand="1"/>
+    </w:tblPr>
+    <w:tblGrid>
+      <w:gridCol w:w="9811"/>
+      <w:gridCol w:w="729"/>
+    </w:tblGrid>
+    <w:tr>
+      <w:tc>
+        <w:tcPr>
+          <w:tcW w:w="9895" w:type="dxa"/>
+        </w:tcPr>
+        <w:p>
+          <w:pPr>
+            <w:pStyle w:val="Header"/>
+            <w:tabs>
+              <w:tab w:val="clear" w:pos="4419"/>
+              <w:tab w:val="clear" w:pos="8838"/>
+              <w:tab w:val="center" w:pos="4792"/>
+            </w:tabs>
+            <w:rPr>
+              <w:sz w:val="16"/>
+              <w:szCs w:val="16"/>
+            </w:rPr>
+          </w:pPr>
+          <w:r>
+            <w:rPr>
+              <w:sz w:val="16"/>
+              <w:szCs w:val="16"/>
+            </w:rPr>
+            <w:tab/>
+          </w:r>
+        </w:p>
+      </w:tc>
+      <w:tc>
+        <w:tcPr>
+          <w:tcW w:w="635" w:type="dxa"/>
+        </w:tcPr>
+        <w:p>
+          <w:pPr>
+            <w:pStyle w:val="Header"/>
+          </w:pPr>
+          <w:r>
+            <w:rPr>
+              <w:noProof/>
+              <w:sz w:val="16"/>
+              <w:szCs w:val="16"/>
+            </w:rPr>
+            <w:drawing>
+              <wp:inline distT="0" distB="0" distL="0" distR="0" wp14:anchorId="3EF34A36" wp14:editId="1672CA9E">
+                <wp:extent cx="326004" cy="378092"/>
+                <wp:effectExtent l="0" t="0" r="0" b="3175"/>
+                <wp:docPr id="1688505105" name="Picture 1" descr="The Site Savvy Blog - News, trends, tips, and environmental knowledge."/>
+                <wp:cNvGraphicFramePr>
+                  <a:graphicFrameLocks xmlns:a="http://schemas.openxmlformats.org/drawingml/2006/main" noChangeAspect="1"/>
+                </wp:cNvGraphicFramePr>
+                <a:graphic xmlns:a="http://schemas.openxmlformats.org/drawingml/2006/main">
+                  <a:graphicData uri="http://schemas.openxmlformats.org/drawingml/2006/picture">
+                    <pic:pic xmlns:pic="http://schemas.openxmlformats.org/drawingml/2006/picture">
+                      <pic:nvPicPr>
+                        <pic:cNvPr id="0" name="Picture 1" descr="The Site Savvy Blog - News, trends, tips, and environmental knowledge."/>
+                        <pic:cNvPicPr>
+                          <a:picLocks noChangeAspect="1" noChangeArrowheads="1"/>
+                        </pic:cNvPicPr>
+                      </pic:nvPicPr>
+                      <pic:blipFill>
+                        <a:blip r:embed="rId1">
+                          <a:extLst>
+                            <a:ext uri="{28A0092B-C50C-407E-A947-70E740481C1C}">
+                              <a14:useLocalDpi xmlns:a14="http://schemas.microsoft.com/office/drawing/2010/main" val="0"/>
+                            </a:ext>
+                          </a:extLst>
+                        </a:blip>
+                        <a:srcRect/>
+                        <a:stretch>
+                          <a:fillRect/>
+                        </a:stretch>
+                      </pic:blipFill>
+                      <pic:spPr bwMode="auto">
+                        <a:xfrm rot="10800000" flipH="1" flipV="1">
+                          <a:off x="0" y="0"/>
+                          <a:ext cx="326004" cy="378092"/>
+                        </a:xfrm>
+                        <a:prstGeom prst="rect">
+                          <a:avLst/>
+                        </a:prstGeom>
+                        <a:noFill/>
+                        <a:ln>
+                          <a:noFill/>
+                        </a:ln>
+                      </pic:spPr>
+                    </pic:pic>
+                  </a:graphicData>
+                </a:graphic>
+              </wp:inline>
+            </w:drawing>
+          </w:r>
+        </w:p>
+      </w:tc>
+    </w:tr>
+  </w:tbl>
+  <w:p>
+    <w:pPr>
+      <w:pStyle w:val="Header"/>
+      <w:rPr>
+        <w:sz w:val="16"/>
+        <w:szCs w:val="16"/>
+        <w:lang w:val="es-CO"/>
+      </w:rPr>
+    </w:pPr>
+  </w:p>
+</w:hdr>
+</file>
+
+<file path=word/header3.xml><?xml version="1.0" encoding="utf-8"?>
+<w:hdr xmlns:wpc="http://schemas.microsoft.com/office/word/2010/wordprocessingCanvas" xmlns:cx="http://schemas.microsoft.com/office/drawing/2014/chartex" xmlns:cx1="http://schemas.microsoft.com/office/drawing/2015/9/8/chartex" xmlns:cx2="http://schemas.microsoft.com/office/drawing/2015/10/21/chartex" xmlns:cx3="http://schemas.microsoft.com/office/drawing/2016/5/9/chartex" xmlns:cx4="http://schemas.microsoft.com/office/drawing/2016/5/10/chartex" xmlns:cx5="http://schemas.microsoft.com/office/drawing/2016/5/11/chartex" xmlns:cx6="http://schemas.microsoft.com/office/drawing/2016/5/12/chartex" xmlns:cx7="http://schemas.microsoft.com/office/drawing/2016/5/13/chartex" xmlns:cx8="http://schemas.microsoft.com/office/drawing/2016/5/14/chartex" xmlns:mc="http://schemas.openxmlformats.org/markup-compatibility/2006" xmlns:aink="http://schemas.microsoft.com/office/drawing/2016/ink" xmlns:am3d="http://schemas.microsoft.com/office/drawing/2017/model3d" xmlns:o="urn:schemas-microsoft-com:office:office" xmlns:oel="http://schemas.microsoft.com/office/2019/extlst" xmlns:r="http://schemas.openxmlformats.org/officeDocument/2006/relationships" xmlns:m="http://schemas.openxmlformats.org/officeDocument/2006/math" xmlns:v="urn:schemas-microsoft-com:vml" xmlns:wp14="http://schemas.microsoft.com/office/word/2010/wordprocessingDrawing" xmlns:wp="http://schemas.openxmlformats.org/drawingml/2006/wordprocessingDrawing" xmlns:w10="urn:schemas-microsoft-com:office:word" xmlns:w="http://schemas.openxmlformats.org/wordprocessingml/2006/main" xmlns:w14="http://schemas.microsoft.com/office/word/2010/wordml" xmlns:w15="http://schemas.microsoft.com/office/word/2012/wordml" xmlns:w16cei="http://schemas.microsoft.com/office/word/2026/wordml/cei" xmlns:w16cex="http://schemas.microsoft.com/office/word/2018/wordml/cex" xmlns:w16cid="http://schemas.microsoft.com/office/word/2016/wordml/cid" xmlns:w16="http://schemas.microsoft.com/office/word/2018/wordml" xmlns:w16du="http://schemas.microsoft.com/office/word/2023/wordml/word16du" xmlns:w16sdtdh="http://schemas.microsoft.com/office/word/2020/wordml/sdtdatahash" xmlns:w16sdtfl="http://schemas.microsoft.com/office/word/2024/wordml/sdtformatlock" xmlns:w16se="http://schemas.microsoft.com/office/word/2015/wordml/symex" xmlns:wpg="http://schemas.microsoft.com/office/word/2010/wordprocessingGroup" xmlns:wpi="http://schemas.microsoft.com/office/word/2010/wordprocessingInk" xmlns:wne="http://schemas.microsoft.com/office/word/2006/wordml" xmlns:wps="http://schemas.microsoft.com/office/word/2010/wordprocessingShape" mc:Ignorable="w14 w15 w16se w16cid w16 w16cex w16sdtdh w16sdtfl w16du wp14">
+  <w:tbl>
+    <w:tblPr>
+      <w:tblStyle w:val="TableGrid"/>
+      <w:tblW w:w="0" w:type="auto"/>
+      <w:tblBorders>
+        <w:top w:val="none" w:sz="0" w:space="0" w:color="auto"/>
+        <w:left w:val="none" w:sz="0" w:space="0" w:color="auto"/>
+        <w:bottom w:val="none" w:sz="0" w:space="0" w:color="auto"/>
+        <w:right w:val="none" w:sz="0" w:space="0" w:color="auto"/>
+        <w:insideH w:val="none" w:sz="0" w:space="0" w:color="auto"/>
+        <w:insideV w:val="none" w:sz="0" w:space="0" w:color="auto"/>
+      </w:tblBorders>
+      <w:tblLook w:val="04A0" w:firstRow="1" w:lastRow="0" w:firstColumn="1" w:lastColumn="0" w:noHBand="0" w:noVBand="1"/>
+    </w:tblPr>
+    <w:tblGrid>
+      <w:gridCol w:w="9811"/>
+      <w:gridCol w:w="729"/>
+    </w:tblGrid>
+    <w:tr>
+      <w:tc>
+        <w:tcPr>
+          <w:tcW w:w="9895" w:type="dxa"/>
+        </w:tcPr>
+        <w:p>
+          <w:pPr>
+            <w:pStyle w:val="Header"/>
+            <w:rPr>
+              <w:sz w:val="16"/>
+              <w:szCs w:val="16"/>
+            </w:rPr>
+          </w:pPr>
+          <w:r>
+            <w:rPr>
+              <w:sz w:val="16"/>
+              <w:szCs w:val="16"/>
+            </w:rPr>
+            <w:t xml:space="preserve">POLICY – </w:t>
+          </w:r>
+          <w:r>
+            <w:rPr>
+              <w:sz w:val="16"/>
+              <w:szCs w:val="16"/>
+            </w:rPr>
+            <w:t>DevSec CI CD Hard</w:t>
+          </w:r>
+          <w:r>
+            <w:rPr>
+              <w:sz w:val="16"/>
+              <w:szCs w:val="16"/>
+            </w:rPr>
+            <w:t>ening Policy</w:t>
+          </w:r>
+        </w:p>
+      </w:tc>
+      <w:tc>
+        <w:tcPr>
+          <w:tcW w:w="635" w:type="dxa"/>
+        </w:tcPr>
+        <w:p>
+          <w:pPr>
+            <w:pStyle w:val="Header"/>
+          </w:pPr>
+          <w:r>
+            <w:rPr>
+              <w:noProof/>
+              <w:sz w:val="16"/>
+              <w:szCs w:val="16"/>
+            </w:rPr>
+            <w:drawing>
+              <wp:inline distT="0" distB="0" distL="0" distR="0" wp14:anchorId="05DAAE88" wp14:editId="31665992">
+                <wp:extent cx="326004" cy="378092"/>
+                <wp:effectExtent l="0" t="0" r="0" b="3175"/>
+                <wp:docPr id="1749360905" name="Picture 1" descr="The Site Savvy Blog - News, trends, tips, and environmental knowledge."/>
+                <wp:cNvGraphicFramePr>
+                  <a:graphicFrameLocks xmlns:a="http://schemas.openxmlformats.org/drawingml/2006/main" noChangeAspect="1"/>
+                </wp:cNvGraphicFramePr>
+                <a:graphic xmlns:a="http://schemas.openxmlformats.org/drawingml/2006/main">
+                  <a:graphicData uri="http://schemas.openxmlformats.org/drawingml/2006/picture">
+                    <pic:pic xmlns:pic="http://schemas.openxmlformats.org/drawingml/2006/picture">
+                      <pic:nvPicPr>
+                        <pic:cNvPr id="0" name="Picture 1" descr="The Site Savvy Blog - News, trends, tips, and environmental knowledge."/>
+                        <pic:cNvPicPr>
+                          <a:picLocks noChangeAspect="1" noChangeArrowheads="1"/>
+                        </pic:cNvPicPr>
+                      </pic:nvPicPr>
+                      <pic:blipFill>
+                        <a:blip r:embed="rId1">
+                          <a:extLst>
+                            <a:ext uri="{28A0092B-C50C-407E-A947-70E740481C1C}">
+                              <a14:useLocalDpi xmlns:a14="http://schemas.microsoft.com/office/drawing/2010/main" val="0"/>
+                            </a:ext>
+                          </a:extLst>
+                        </a:blip>
+                        <a:srcRect/>
+                        <a:stretch>
+                          <a:fillRect/>
+                        </a:stretch>
+                      </pic:blipFill>
+                      <pic:spPr bwMode="auto">
+                        <a:xfrm rot="10800000" flipH="1" flipV="1">
+                          <a:off x="0" y="0"/>
+                          <a:ext cx="326004" cy="378092"/>
+                        </a:xfrm>
+                        <a:prstGeom prst="rect">
+                          <a:avLst/>
+                        </a:prstGeom>
+                        <a:noFill/>
+                        <a:ln>
+                          <a:noFill/>
+                        </a:ln>
+                      </pic:spPr>
+                    </pic:pic>
+                  </a:graphicData>
+                </a:graphic>
+              </wp:inline>
+            </w:drawing>
+          </w:r>
+        </w:p>
+      </w:tc>
+    </w:tr>
+  </w:tbl>
   <w:p>
     <w:pPr>
       <w:pStyle w:val="Header"/>
@@ -5805,314 +6277,133 @@
         <w:szCs w:val="16"/>
       </w:rPr>
     </w:pPr>
-    <w:r>
-      <w:rPr>
-        <w:noProof/>
-        <w:sz w:val="16"/>
-        <w:szCs w:val="16"/>
-      </w:rPr>
-      <w:drawing>
-        <wp:anchor distT="0" distB="0" distL="114300" distR="114300" simplePos="0" relativeHeight="251666432" behindDoc="0" locked="0" layoutInCell="1" allowOverlap="1" wp14:anchorId="62AB6B39" wp14:editId="653D5B26">
-          <wp:simplePos x="0" y="0"/>
-          <wp:positionH relativeFrom="column">
-            <wp:posOffset>5820465</wp:posOffset>
-          </wp:positionH>
-          <wp:positionV relativeFrom="paragraph">
-            <wp:posOffset>-19685</wp:posOffset>
-          </wp:positionV>
-          <wp:extent cx="326004" cy="378092"/>
-          <wp:effectExtent l="0" t="0" r="0" b="3175"/>
-          <wp:wrapThrough wrapText="bothSides">
-            <wp:wrapPolygon edited="0">
-              <wp:start x="21600" y="21600"/>
-              <wp:lineTo x="21600" y="908"/>
-              <wp:lineTo x="1389" y="908"/>
-              <wp:lineTo x="1389" y="18333"/>
-              <wp:lineTo x="2653" y="21600"/>
-              <wp:lineTo x="21600" y="21600"/>
-            </wp:wrapPolygon>
-          </wp:wrapThrough>
-          <wp:docPr id="2066267868" name="Picture 1" descr="The Site Savvy Blog - News, trends, tips, and environmental knowledge."/>
-          <wp:cNvGraphicFramePr>
-            <a:graphicFrameLocks xmlns:a="http://schemas.openxmlformats.org/drawingml/2006/main" noChangeAspect="1"/>
-          </wp:cNvGraphicFramePr>
-          <a:graphic xmlns:a="http://schemas.openxmlformats.org/drawingml/2006/main">
-            <a:graphicData uri="http://schemas.openxmlformats.org/drawingml/2006/picture">
-              <pic:pic xmlns:pic="http://schemas.openxmlformats.org/drawingml/2006/picture">
-                <pic:nvPicPr>
-                  <pic:cNvPr id="0" name="Picture 1" descr="The Site Savvy Blog - News, trends, tips, and environmental knowledge."/>
-                  <pic:cNvPicPr>
-                    <a:picLocks noChangeAspect="1" noChangeArrowheads="1"/>
-                  </pic:cNvPicPr>
-                </pic:nvPicPr>
-                <pic:blipFill>
-                  <a:blip r:embed="rId1">
-                    <a:extLst>
-                      <a:ext uri="{28A0092B-C50C-407E-A947-70E740481C1C}">
-                        <a14:useLocalDpi xmlns:a14="http://schemas.microsoft.com/office/drawing/2010/main" val="0"/>
-                      </a:ext>
-                    </a:extLst>
-                  </a:blip>
-                  <a:srcRect/>
-                  <a:stretch>
-                    <a:fillRect/>
-                  </a:stretch>
-                </pic:blipFill>
-                <pic:spPr bwMode="auto">
-                  <a:xfrm rot="10800000" flipH="1" flipV="1">
-                    <a:off x="0" y="0"/>
-                    <a:ext cx="326004" cy="378092"/>
-                  </a:xfrm>
-                  <a:prstGeom prst="rect">
-                    <a:avLst/>
-                  </a:prstGeom>
-                  <a:noFill/>
-                  <a:ln>
-                    <a:noFill/>
-                  </a:ln>
-                </pic:spPr>
-              </pic:pic>
-            </a:graphicData>
-          </a:graphic>
-        </wp:anchor>
-      </w:drawing>
-    </w:r>
-  </w:p>
-</w:hdr>
-</file>
-
-<file path=word/header3.xml><?xml version="1.0" encoding="utf-8"?>
-<w:hdr xmlns:wpc="http://schemas.microsoft.com/office/word/2010/wordprocessingCanvas" xmlns:cx="http://schemas.microsoft.com/office/drawing/2014/chartex" xmlns:cx1="http://schemas.microsoft.com/office/drawing/2015/9/8/chartex" xmlns:cx2="http://schemas.microsoft.com/office/drawing/2015/10/21/chartex" xmlns:cx3="http://schemas.microsoft.com/office/drawing/2016/5/9/chartex" xmlns:cx4="http://schemas.microsoft.com/office/drawing/2016/5/10/chartex" xmlns:cx5="http://schemas.microsoft.com/office/drawing/2016/5/11/chartex" xmlns:cx6="http://schemas.microsoft.com/office/drawing/2016/5/12/chartex" xmlns:cx7="http://schemas.microsoft.com/office/drawing/2016/5/13/chartex" xmlns:cx8="http://schemas.microsoft.com/office/drawing/2016/5/14/chartex" xmlns:mc="http://schemas.openxmlformats.org/markup-compatibility/2006" xmlns:aink="http://schemas.microsoft.com/office/drawing/2016/ink" xmlns:am3d="http://schemas.microsoft.com/office/drawing/2017/model3d" xmlns:o="urn:schemas-microsoft-com:office:office" xmlns:oel="http://schemas.microsoft.com/office/2019/extlst" xmlns:r="http://schemas.openxmlformats.org/officeDocument/2006/relationships" xmlns:m="http://schemas.openxmlformats.org/officeDocument/2006/math" xmlns:v="urn:schemas-microsoft-com:vml" xmlns:wp14="http://schemas.microsoft.com/office/word/2010/wordprocessingDrawing" xmlns:wp="http://schemas.openxmlformats.org/drawingml/2006/wordprocessingDrawing" xmlns:w10="urn:schemas-microsoft-com:office:word" xmlns:w="http://schemas.openxmlformats.org/wordprocessingml/2006/main" xmlns:w14="http://schemas.microsoft.com/office/word/2010/wordml" xmlns:w15="http://schemas.microsoft.com/office/word/2012/wordml" xmlns:w16cex="http://schemas.microsoft.com/office/word/2018/wordml/cex" xmlns:w16cid="http://schemas.microsoft.com/office/word/2016/wordml/cid" xmlns:w16="http://schemas.microsoft.com/office/word/2018/wordml" xmlns:w16du="http://schemas.microsoft.com/office/word/2023/wordml/word16du" xmlns:w16sdtdh="http://schemas.microsoft.com/office/word/2020/wordml/sdtdatahash" xmlns:w16sdtfl="http://schemas.microsoft.com/office/word/2024/wordml/sdtformatlock" xmlns:w16se="http://schemas.microsoft.com/office/word/2015/wordml/symex" xmlns:wpg="http://schemas.microsoft.com/office/word/2010/wordprocessingGroup" xmlns:wpi="http://schemas.microsoft.com/office/word/2010/wordprocessingInk" xmlns:wne="http://schemas.microsoft.com/office/word/2006/wordml" xmlns:wps="http://schemas.microsoft.com/office/word/2010/wordprocessingShape" mc:Ignorable="w14 w15 w16se w16cid w16 w16cex w16sdtdh w16sdtfl w16du wp14">
-  <w:p>
-    <w:pPr>
-      <w:pStyle w:val="Header"/>
-      <w:rPr>
-        <w:sz w:val="16"/>
-        <w:szCs w:val="16"/>
-      </w:rPr>
-    </w:pPr>
-    <w:r>
-      <w:rPr>
-        <w:noProof/>
-        <w:sz w:val="16"/>
-        <w:szCs w:val="16"/>
-      </w:rPr>
-      <w:drawing>
-        <wp:anchor distT="0" distB="0" distL="114300" distR="114300" simplePos="0" relativeHeight="251675648" behindDoc="0" locked="0" layoutInCell="1" allowOverlap="1" wp14:anchorId="3FE753E3" wp14:editId="2889F6FF">
-          <wp:simplePos x="0" y="0"/>
-          <wp:positionH relativeFrom="column">
-            <wp:posOffset>5820465</wp:posOffset>
-          </wp:positionH>
-          <wp:positionV relativeFrom="paragraph">
-            <wp:posOffset>-19685</wp:posOffset>
-          </wp:positionV>
-          <wp:extent cx="326004" cy="378092"/>
-          <wp:effectExtent l="0" t="0" r="0" b="3175"/>
-          <wp:wrapThrough wrapText="bothSides">
-            <wp:wrapPolygon edited="0">
-              <wp:start x="21600" y="21600"/>
-              <wp:lineTo x="21600" y="908"/>
-              <wp:lineTo x="1389" y="908"/>
-              <wp:lineTo x="1389" y="18333"/>
-              <wp:lineTo x="2653" y="21600"/>
-              <wp:lineTo x="21600" y="21600"/>
-            </wp:wrapPolygon>
-          </wp:wrapThrough>
-          <wp:docPr id="2005970719" name="Picture 1" descr="The Site Savvy Blog - News, trends, tips, and environmental knowledge."/>
-          <wp:cNvGraphicFramePr>
-            <a:graphicFrameLocks xmlns:a="http://schemas.openxmlformats.org/drawingml/2006/main" noChangeAspect="1"/>
-          </wp:cNvGraphicFramePr>
-          <a:graphic xmlns:a="http://schemas.openxmlformats.org/drawingml/2006/main">
-            <a:graphicData uri="http://schemas.openxmlformats.org/drawingml/2006/picture">
-              <pic:pic xmlns:pic="http://schemas.openxmlformats.org/drawingml/2006/picture">
-                <pic:nvPicPr>
-                  <pic:cNvPr id="0" name="Picture 1" descr="The Site Savvy Blog - News, trends, tips, and environmental knowledge."/>
-                  <pic:cNvPicPr>
-                    <a:picLocks noChangeAspect="1" noChangeArrowheads="1"/>
-                  </pic:cNvPicPr>
-                </pic:nvPicPr>
-                <pic:blipFill>
-                  <a:blip r:embed="rId1">
-                    <a:extLst>
-                      <a:ext uri="{28A0092B-C50C-407E-A947-70E740481C1C}">
-                        <a14:useLocalDpi xmlns:a14="http://schemas.microsoft.com/office/drawing/2010/main" val="0"/>
-                      </a:ext>
-                    </a:extLst>
-                  </a:blip>
-                  <a:srcRect/>
-                  <a:stretch>
-                    <a:fillRect/>
-                  </a:stretch>
-                </pic:blipFill>
-                <pic:spPr bwMode="auto">
-                  <a:xfrm rot="10800000" flipH="1" flipV="1">
-                    <a:off x="0" y="0"/>
-                    <a:ext cx="326004" cy="378092"/>
-                  </a:xfrm>
-                  <a:prstGeom prst="rect">
-                    <a:avLst/>
-                  </a:prstGeom>
-                  <a:noFill/>
-                  <a:ln>
-                    <a:noFill/>
-                  </a:ln>
-                </pic:spPr>
-              </pic:pic>
-            </a:graphicData>
-          </a:graphic>
-        </wp:anchor>
-      </w:drawing>
-    </w:r>
-    <w:r>
-      <w:rPr>
-        <w:sz w:val="16"/>
-        <w:szCs w:val="16"/>
-      </w:rPr>
-      <w:t>POLICY</w:t>
-    </w:r>
-    <w:r>
-      <w:rPr>
-        <w:sz w:val="16"/>
-        <w:szCs w:val="16"/>
-      </w:rPr>
-      <w:t xml:space="preserve"> –</w:t>
-    </w:r>
-    <w:r>
-      <w:rPr>
-        <w:sz w:val="16"/>
-        <w:szCs w:val="16"/>
-      </w:rPr>
-      <w:t xml:space="preserve"> </w:t>
-    </w:r>
-    <w:r>
-      <w:rPr>
-        <w:sz w:val="16"/>
-        <w:szCs w:val="16"/>
-      </w:rPr>
-      <w:t>DevSec CI CD Hardening Policy</w:t>
-    </w:r>
   </w:p>
 </w:hdr>
 </file>
 
 <file path=word/header4.xml><?xml version="1.0" encoding="utf-8"?>
-<w:hdr xmlns:wpc="http://schemas.microsoft.com/office/word/2010/wordprocessingCanvas" xmlns:cx="http://schemas.microsoft.com/office/drawing/2014/chartex" xmlns:cx1="http://schemas.microsoft.com/office/drawing/2015/9/8/chartex" xmlns:cx2="http://schemas.microsoft.com/office/drawing/2015/10/21/chartex" xmlns:cx3="http://schemas.microsoft.com/office/drawing/2016/5/9/chartex" xmlns:cx4="http://schemas.microsoft.com/office/drawing/2016/5/10/chartex" xmlns:cx5="http://schemas.microsoft.com/office/drawing/2016/5/11/chartex" xmlns:cx6="http://schemas.microsoft.com/office/drawing/2016/5/12/chartex" xmlns:cx7="http://schemas.microsoft.com/office/drawing/2016/5/13/chartex" xmlns:cx8="http://schemas.microsoft.com/office/drawing/2016/5/14/chartex" xmlns:mc="http://schemas.openxmlformats.org/markup-compatibility/2006" xmlns:aink="http://schemas.microsoft.com/office/drawing/2016/ink" xmlns:am3d="http://schemas.microsoft.com/office/drawing/2017/model3d" xmlns:o="urn:schemas-microsoft-com:office:office" xmlns:oel="http://schemas.microsoft.com/office/2019/extlst" xmlns:r="http://schemas.openxmlformats.org/officeDocument/2006/relationships" xmlns:m="http://schemas.openxmlformats.org/officeDocument/2006/math" xmlns:v="urn:schemas-microsoft-com:vml" xmlns:wp14="http://schemas.microsoft.com/office/word/2010/wordprocessingDrawing" xmlns:wp="http://schemas.openxmlformats.org/drawingml/2006/wordprocessingDrawing" xmlns:w10="urn:schemas-microsoft-com:office:word" xmlns:w="http://schemas.openxmlformats.org/wordprocessingml/2006/main" xmlns:w14="http://schemas.microsoft.com/office/word/2010/wordml" xmlns:w15="http://schemas.microsoft.com/office/word/2012/wordml" xmlns:w16cex="http://schemas.microsoft.com/office/word/2018/wordml/cex" xmlns:w16cid="http://schemas.microsoft.com/office/word/2016/wordml/cid" xmlns:w16="http://schemas.microsoft.com/office/word/2018/wordml" xmlns:w16du="http://schemas.microsoft.com/office/word/2023/wordml/word16du" xmlns:w16sdtdh="http://schemas.microsoft.com/office/word/2020/wordml/sdtdatahash" xmlns:w16sdtfl="http://schemas.microsoft.com/office/word/2024/wordml/sdtformatlock" xmlns:w16se="http://schemas.microsoft.com/office/word/2015/wordml/symex" xmlns:wpg="http://schemas.microsoft.com/office/word/2010/wordprocessingGroup" xmlns:wpi="http://schemas.microsoft.com/office/word/2010/wordprocessingInk" xmlns:wne="http://schemas.microsoft.com/office/word/2006/wordml" xmlns:wps="http://schemas.microsoft.com/office/word/2010/wordprocessingShape" mc:Ignorable="w14 w15 w16se w16cid w16 w16cex w16sdtdh w16sdtfl w16du wp14">
-  <w:p>
-    <w:pPr>
-      <w:pStyle w:val="Header"/>
-      <w:rPr>
-        <w:sz w:val="16"/>
-        <w:szCs w:val="16"/>
-      </w:rPr>
-    </w:pPr>
-    <w:r>
-      <w:rPr>
-        <w:noProof/>
-        <w:sz w:val="16"/>
-        <w:szCs w:val="16"/>
-      </w:rPr>
-      <w:drawing>
-        <wp:anchor distT="0" distB="0" distL="114300" distR="114300" simplePos="0" relativeHeight="251669504" behindDoc="0" locked="0" layoutInCell="1" allowOverlap="1" wp14:anchorId="71DE6B8B" wp14:editId="7CD0974C">
-          <wp:simplePos x="0" y="0"/>
-          <wp:positionH relativeFrom="column">
-            <wp:posOffset>5820465</wp:posOffset>
-          </wp:positionH>
-          <wp:positionV relativeFrom="paragraph">
-            <wp:posOffset>-19685</wp:posOffset>
-          </wp:positionV>
-          <wp:extent cx="326004" cy="378092"/>
-          <wp:effectExtent l="0" t="0" r="0" b="3175"/>
-          <wp:wrapThrough wrapText="bothSides">
-            <wp:wrapPolygon edited="0">
-              <wp:start x="21600" y="21600"/>
-              <wp:lineTo x="21600" y="908"/>
-              <wp:lineTo x="1389" y="908"/>
-              <wp:lineTo x="1389" y="18333"/>
-              <wp:lineTo x="2653" y="21600"/>
-              <wp:lineTo x="21600" y="21600"/>
-            </wp:wrapPolygon>
-          </wp:wrapThrough>
-          <wp:docPr id="739307350" name="Picture 1" descr="The Site Savvy Blog - News, trends, tips, and environmental knowledge."/>
-          <wp:cNvGraphicFramePr>
-            <a:graphicFrameLocks xmlns:a="http://schemas.openxmlformats.org/drawingml/2006/main" noChangeAspect="1"/>
-          </wp:cNvGraphicFramePr>
-          <a:graphic xmlns:a="http://schemas.openxmlformats.org/drawingml/2006/main">
-            <a:graphicData uri="http://schemas.openxmlformats.org/drawingml/2006/picture">
-              <pic:pic xmlns:pic="http://schemas.openxmlformats.org/drawingml/2006/picture">
-                <pic:nvPicPr>
-                  <pic:cNvPr id="0" name="Picture 1" descr="The Site Savvy Blog - News, trends, tips, and environmental knowledge."/>
-                  <pic:cNvPicPr>
-                    <a:picLocks noChangeAspect="1" noChangeArrowheads="1"/>
-                  </pic:cNvPicPr>
-                </pic:nvPicPr>
-                <pic:blipFill>
-                  <a:blip r:embed="rId1">
-                    <a:extLst>
-                      <a:ext uri="{28A0092B-C50C-407E-A947-70E740481C1C}">
-                        <a14:useLocalDpi xmlns:a14="http://schemas.microsoft.com/office/drawing/2010/main" val="0"/>
-                      </a:ext>
-                    </a:extLst>
-                  </a:blip>
-                  <a:srcRect/>
-                  <a:stretch>
-                    <a:fillRect/>
-                  </a:stretch>
-                </pic:blipFill>
-                <pic:spPr bwMode="auto">
-                  <a:xfrm rot="10800000" flipH="1" flipV="1">
-                    <a:off x="0" y="0"/>
-                    <a:ext cx="326004" cy="378092"/>
-                  </a:xfrm>
-                  <a:prstGeom prst="rect">
-                    <a:avLst/>
-                  </a:prstGeom>
-                  <a:noFill/>
-                  <a:ln>
-                    <a:noFill/>
-                  </a:ln>
-                </pic:spPr>
-              </pic:pic>
-            </a:graphicData>
-          </a:graphic>
-        </wp:anchor>
-      </w:drawing>
-    </w:r>
-    <w:r>
-      <w:rPr>
-        <w:sz w:val="16"/>
-        <w:szCs w:val="16"/>
-      </w:rPr>
-      <w:t>POLICY</w:t>
-    </w:r>
-    <w:r>
-      <w:rPr>
-        <w:sz w:val="16"/>
-        <w:szCs w:val="16"/>
-      </w:rPr>
-      <w:t xml:space="preserve"> </w:t>
-    </w:r>
-    <w:r>
-      <w:rPr>
-        <w:sz w:val="16"/>
-        <w:szCs w:val="16"/>
-      </w:rPr>
-      <w:t>–</w:t>
-    </w:r>
-    <w:r>
-      <w:rPr>
-        <w:sz w:val="16"/>
-        <w:szCs w:val="16"/>
-      </w:rPr>
-      <w:t xml:space="preserve"> </w:t>
-    </w:r>
-    <w:r>
-      <w:rPr>
-        <w:sz w:val="16"/>
-        <w:szCs w:val="16"/>
-      </w:rPr>
-      <w:t>Approval Signatures</w:t>
-    </w:r>
-  </w:p>
+<w:hdr xmlns:wpc="http://schemas.microsoft.com/office/word/2010/wordprocessingCanvas" xmlns:cx="http://schemas.microsoft.com/office/drawing/2014/chartex" xmlns:cx1="http://schemas.microsoft.com/office/drawing/2015/9/8/chartex" xmlns:cx2="http://schemas.microsoft.com/office/drawing/2015/10/21/chartex" xmlns:cx3="http://schemas.microsoft.com/office/drawing/2016/5/9/chartex" xmlns:cx4="http://schemas.microsoft.com/office/drawing/2016/5/10/chartex" xmlns:cx5="http://schemas.microsoft.com/office/drawing/2016/5/11/chartex" xmlns:cx6="http://schemas.microsoft.com/office/drawing/2016/5/12/chartex" xmlns:cx7="http://schemas.microsoft.com/office/drawing/2016/5/13/chartex" xmlns:cx8="http://schemas.microsoft.com/office/drawing/2016/5/14/chartex" xmlns:mc="http://schemas.openxmlformats.org/markup-compatibility/2006" xmlns:aink="http://schemas.microsoft.com/office/drawing/2016/ink" xmlns:am3d="http://schemas.microsoft.com/office/drawing/2017/model3d" xmlns:o="urn:schemas-microsoft-com:office:office" xmlns:oel="http://schemas.microsoft.com/office/2019/extlst" xmlns:r="http://schemas.openxmlformats.org/officeDocument/2006/relationships" xmlns:m="http://schemas.openxmlformats.org/officeDocument/2006/math" xmlns:v="urn:schemas-microsoft-com:vml" xmlns:wp14="http://schemas.microsoft.com/office/word/2010/wordprocessingDrawing" xmlns:wp="http://schemas.openxmlformats.org/drawingml/2006/wordprocessingDrawing" xmlns:w10="urn:schemas-microsoft-com:office:word" xmlns:w="http://schemas.openxmlformats.org/wordprocessingml/2006/main" xmlns:w14="http://schemas.microsoft.com/office/word/2010/wordml" xmlns:w15="http://schemas.microsoft.com/office/word/2012/wordml" xmlns:w16cei="http://schemas.microsoft.com/office/word/2026/wordml/cei" xmlns:w16cex="http://schemas.microsoft.com/office/word/2018/wordml/cex" xmlns:w16cid="http://schemas.microsoft.com/office/word/2016/wordml/cid" xmlns:w16="http://schemas.microsoft.com/office/word/2018/wordml" xmlns:w16du="http://schemas.microsoft.com/office/word/2023/wordml/word16du" xmlns:w16sdtdh="http://schemas.microsoft.com/office/word/2020/wordml/sdtdatahash" xmlns:w16sdtfl="http://schemas.microsoft.com/office/word/2024/wordml/sdtformatlock" xmlns:w16se="http://schemas.microsoft.com/office/word/2015/wordml/symex" xmlns:wpg="http://schemas.microsoft.com/office/word/2010/wordprocessingGroup" xmlns:wpi="http://schemas.microsoft.com/office/word/2010/wordprocessingInk" xmlns:wne="http://schemas.microsoft.com/office/word/2006/wordml" xmlns:wps="http://schemas.microsoft.com/office/word/2010/wordprocessingShape" mc:Ignorable="w14 w15 w16se w16cid w16 w16cex w16sdtdh w16sdtfl w16du wp14">
+  <w:tbl>
+    <w:tblPr>
+      <w:tblStyle w:val="TableGrid"/>
+      <w:tblW w:w="0" w:type="auto"/>
+      <w:tblBorders>
+        <w:top w:val="none" w:sz="0" w:space="0" w:color="auto"/>
+        <w:left w:val="none" w:sz="0" w:space="0" w:color="auto"/>
+        <w:bottom w:val="none" w:sz="0" w:space="0" w:color="auto"/>
+        <w:right w:val="none" w:sz="0" w:space="0" w:color="auto"/>
+        <w:insideH w:val="none" w:sz="0" w:space="0" w:color="auto"/>
+        <w:insideV w:val="none" w:sz="0" w:space="0" w:color="auto"/>
+      </w:tblBorders>
+      <w:tblLook w:val="04A0" w:firstRow="1" w:lastRow="0" w:firstColumn="1" w:lastColumn="0" w:noHBand="0" w:noVBand="1"/>
+    </w:tblPr>
+    <w:tblGrid>
+      <w:gridCol w:w="9811"/>
+      <w:gridCol w:w="729"/>
+    </w:tblGrid>
+    <w:tr>
+      <w:tc>
+        <w:tcPr>
+          <w:tcW w:w="9895" w:type="dxa"/>
+        </w:tcPr>
+        <w:p>
+          <w:pPr>
+            <w:pStyle w:val="Header"/>
+            <w:rPr>
+              <w:sz w:val="16"/>
+              <w:szCs w:val="16"/>
+            </w:rPr>
+          </w:pPr>
+          <w:r>
+            <w:rPr>
+              <w:sz w:val="16"/>
+              <w:szCs w:val="16"/>
+            </w:rPr>
+            <w:t>POLICY –</w:t>
+          </w:r>
+          <w:r>
+            <w:rPr>
+              <w:sz w:val="16"/>
+              <w:szCs w:val="16"/>
+            </w:rPr>
+            <w:t xml:space="preserve"> </w:t>
+          </w:r>
+          <w:r>
+            <w:rPr>
+              <w:sz w:val="16"/>
+              <w:szCs w:val="16"/>
+            </w:rPr>
+            <w:t>Approval Signatures</w:t>
+          </w:r>
+        </w:p>
+      </w:tc>
+      <w:tc>
+        <w:tcPr>
+          <w:tcW w:w="635" w:type="dxa"/>
+        </w:tcPr>
+        <w:p>
+          <w:pPr>
+            <w:pStyle w:val="Header"/>
+          </w:pPr>
+          <w:r>
+            <w:rPr>
+              <w:noProof/>
+              <w:sz w:val="16"/>
+              <w:szCs w:val="16"/>
+            </w:rPr>
+            <w:drawing>
+              <wp:inline distT="0" distB="0" distL="0" distR="0" wp14:anchorId="04B1EC92" wp14:editId="38CD43ED">
+                <wp:extent cx="326004" cy="378092"/>
+                <wp:effectExtent l="0" t="0" r="0" b="3175"/>
+                <wp:docPr id="2032996711" name="Picture 1" descr="The Site Savvy Blog - News, trends, tips, and environmental knowledge."/>
+                <wp:cNvGraphicFramePr>
+                  <a:graphicFrameLocks xmlns:a="http://schemas.openxmlformats.org/drawingml/2006/main" noChangeAspect="1"/>
+                </wp:cNvGraphicFramePr>
+                <a:graphic xmlns:a="http://schemas.openxmlformats.org/drawingml/2006/main">
+                  <a:graphicData uri="http://schemas.openxmlformats.org/drawingml/2006/picture">
+                    <pic:pic xmlns:pic="http://schemas.openxmlformats.org/drawingml/2006/picture">
+                      <pic:nvPicPr>
+                        <pic:cNvPr id="0" name="Picture 1" descr="The Site Savvy Blog - News, trends, tips, and environmental knowledge."/>
+                        <pic:cNvPicPr>
+                          <a:picLocks noChangeAspect="1" noChangeArrowheads="1"/>
+                        </pic:cNvPicPr>
+                      </pic:nvPicPr>
+                      <pic:blipFill>
+                        <a:blip r:embed="rId1">
+                          <a:extLst>
+                            <a:ext uri="{28A0092B-C50C-407E-A947-70E740481C1C}">
+                              <a14:useLocalDpi xmlns:a14="http://schemas.microsoft.com/office/drawing/2010/main" val="0"/>
+                            </a:ext>
+                          </a:extLst>
+                        </a:blip>
+                        <a:srcRect/>
+                        <a:stretch>
+                          <a:fillRect/>
+                        </a:stretch>
+                      </pic:blipFill>
+                      <pic:spPr bwMode="auto">
+                        <a:xfrm rot="10800000" flipH="1" flipV="1">
+                          <a:off x="0" y="0"/>
+                          <a:ext cx="326004" cy="378092"/>
+                        </a:xfrm>
+                        <a:prstGeom prst="rect">
+                          <a:avLst/>
+                        </a:prstGeom>
+                        <a:noFill/>
+                        <a:ln>
+                          <a:noFill/>
+                        </a:ln>
+                      </pic:spPr>
+                    </pic:pic>
+                  </a:graphicData>
+                </a:graphic>
+              </wp:inline>
+            </w:drawing>
+          </w:r>
+        </w:p>
+      </w:tc>
+    </w:tr>
+  </w:tbl>
   <w:p>
     <w:pPr>
       <w:pStyle w:val="Header"/>
@@ -6126,7 +6417,7 @@
 </file>
 
 <file path=word/numbering.xml><?xml version="1.0" encoding="utf-8"?>
-<w:numbering xmlns:wpc="http://schemas.microsoft.com/office/word/2010/wordprocessingCanvas" xmlns:cx="http://schemas.microsoft.com/office/drawing/2014/chartex" xmlns:cx1="http://schemas.microsoft.com/office/drawing/2015/9/8/chartex" xmlns:cx2="http://schemas.microsoft.com/office/drawing/2015/10/21/chartex" xmlns:cx3="http://schemas.microsoft.com/office/drawing/2016/5/9/chartex" xmlns:cx4="http://schemas.microsoft.com/office/drawing/2016/5/10/chartex" xmlns:cx5="http://schemas.microsoft.com/office/drawing/2016/5/11/chartex" xmlns:cx6="http://schemas.microsoft.com/office/drawing/2016/5/12/chartex" xmlns:cx7="http://schemas.microsoft.com/office/drawing/2016/5/13/chartex" xmlns:cx8="http://schemas.microsoft.com/office/drawing/2016/5/14/chartex" xmlns:mc="http://schemas.openxmlformats.org/markup-compatibility/2006" xmlns:aink="http://schemas.microsoft.com/office/drawing/2016/ink" xmlns:am3d="http://schemas.microsoft.com/office/drawing/2017/model3d" xmlns:o="urn:schemas-microsoft-com:office:office" xmlns:oel="http://schemas.microsoft.com/office/2019/extlst" xmlns:r="http://schemas.openxmlformats.org/officeDocument/2006/relationships" xmlns:m="http://schemas.openxmlformats.org/officeDocument/2006/math" xmlns:v="urn:schemas-microsoft-com:vml" xmlns:wp14="http://schemas.microsoft.com/office/word/2010/wordprocessingDrawing" xmlns:wp="http://schemas.openxmlformats.org/drawingml/2006/wordprocessingDrawing" xmlns:w10="urn:schemas-microsoft-com:office:word" xmlns:w="http://schemas.openxmlformats.org/wordprocessingml/2006/main" xmlns:w14="http://schemas.microsoft.com/office/word/2010/wordml" xmlns:w15="http://schemas.microsoft.com/office/word/2012/wordml" xmlns:w16cex="http://schemas.microsoft.com/office/word/2018/wordml/cex" xmlns:w16cid="http://schemas.microsoft.com/office/word/2016/wordml/cid" xmlns:w16="http://schemas.microsoft.com/office/word/2018/wordml" xmlns:w16du="http://schemas.microsoft.com/office/word/2023/wordml/word16du" xmlns:w16sdtdh="http://schemas.microsoft.com/office/word/2020/wordml/sdtdatahash" xmlns:w16sdtfl="http://schemas.microsoft.com/office/word/2024/wordml/sdtformatlock" xmlns:w16se="http://schemas.microsoft.com/office/word/2015/wordml/symex" xmlns:wpg="http://schemas.microsoft.com/office/word/2010/wordprocessingGroup" xmlns:wpi="http://schemas.microsoft.com/office/word/2010/wordprocessingInk" xmlns:wne="http://schemas.microsoft.com/office/word/2006/wordml" xmlns:wps="http://schemas.microsoft.com/office/word/2010/wordprocessingShape" mc:Ignorable="w14 w15 w16se w16cid w16 w16cex w16sdtdh w16sdtfl w16du wp14">
+<w:numbering xmlns:wpc="http://schemas.microsoft.com/office/word/2010/wordprocessingCanvas" xmlns:cx="http://schemas.microsoft.com/office/drawing/2014/chartex" xmlns:cx1="http://schemas.microsoft.com/office/drawing/2015/9/8/chartex" xmlns:cx2="http://schemas.microsoft.com/office/drawing/2015/10/21/chartex" xmlns:cx3="http://schemas.microsoft.com/office/drawing/2016/5/9/chartex" xmlns:cx4="http://schemas.microsoft.com/office/drawing/2016/5/10/chartex" xmlns:cx5="http://schemas.microsoft.com/office/drawing/2016/5/11/chartex" xmlns:cx6="http://schemas.microsoft.com/office/drawing/2016/5/12/chartex" xmlns:cx7="http://schemas.microsoft.com/office/drawing/2016/5/13/chartex" xmlns:cx8="http://schemas.microsoft.com/office/drawing/2016/5/14/chartex" xmlns:mc="http://schemas.openxmlformats.org/markup-compatibility/2006" xmlns:aink="http://schemas.microsoft.com/office/drawing/2016/ink" xmlns:am3d="http://schemas.microsoft.com/office/drawing/2017/model3d" xmlns:o="urn:schemas-microsoft-com:office:office" xmlns:oel="http://schemas.microsoft.com/office/2019/extlst" xmlns:r="http://schemas.openxmlformats.org/officeDocument/2006/relationships" xmlns:m="http://schemas.openxmlformats.org/officeDocument/2006/math" xmlns:v="urn:schemas-microsoft-com:vml" xmlns:wp14="http://schemas.microsoft.com/office/word/2010/wordprocessingDrawing" xmlns:wp="http://schemas.openxmlformats.org/drawingml/2006/wordprocessingDrawing" xmlns:w10="urn:schemas-microsoft-com:office:word" xmlns:w="http://schemas.openxmlformats.org/wordprocessingml/2006/main" xmlns:w14="http://schemas.microsoft.com/office/word/2010/wordml" xmlns:w15="http://schemas.microsoft.com/office/word/2012/wordml" xmlns:w16cei="http://schemas.microsoft.com/office/word/2026/wordml/cei" xmlns:w16cex="http://schemas.microsoft.com/office/word/2018/wordml/cex" xmlns:w16cid="http://schemas.microsoft.com/office/word/2016/wordml/cid" xmlns:w16="http://schemas.microsoft.com/office/word/2018/wordml" xmlns:w16du="http://schemas.microsoft.com/office/word/2023/wordml/word16du" xmlns:w16sdtdh="http://schemas.microsoft.com/office/word/2020/wordml/sdtdatahash" xmlns:w16sdtfl="http://schemas.microsoft.com/office/word/2024/wordml/sdtformatlock" xmlns:w16se="http://schemas.microsoft.com/office/word/2015/wordml/symex" xmlns:wpg="http://schemas.microsoft.com/office/word/2010/wordprocessingGroup" xmlns:wpi="http://schemas.microsoft.com/office/word/2010/wordprocessingInk" xmlns:wne="http://schemas.microsoft.com/office/word/2006/wordml" xmlns:wps="http://schemas.microsoft.com/office/word/2010/wordprocessingShape" mc:Ignorable="w14 w15 w16se w16cid w16 w16cex w16sdtdh w16sdtfl w16du wp14">
   <w:abstractNum w:abstractNumId="0" w15:restartNumberingAfterBreak="0">
     <w:nsid w:val="0C7173E4"/>
     <w:multiLevelType w:val="hybridMultilevel"/>
@@ -6219,119 +6510,6 @@
     </w:lvl>
   </w:abstractNum>
   <w:abstractNum w:abstractNumId="1" w15:restartNumberingAfterBreak="0">
-    <w:nsid w:val="107928DD"/>
-    <w:multiLevelType w:val="hybridMultilevel"/>
-    <w:tmpl w:val="BD6698DC"/>
-    <w:lvl w:ilvl="0" w:tplc="04090001">
-      <w:start w:val="1"/>
-      <w:numFmt w:val="bullet"/>
-      <w:lvlText w:val=""/>
-      <w:lvlJc w:val="left"/>
-      <w:pPr>
-        <w:ind w:left="720" w:hanging="360"/>
-      </w:pPr>
-      <w:rPr>
-        <w:rFonts w:ascii="Symbol" w:hAnsi="Symbol" w:hint="default"/>
-      </w:rPr>
-    </w:lvl>
-    <w:lvl w:ilvl="1" w:tplc="04090003" w:tentative="1">
-      <w:start w:val="1"/>
-      <w:numFmt w:val="bullet"/>
-      <w:lvlText w:val="o"/>
-      <w:lvlJc w:val="left"/>
-      <w:pPr>
-        <w:ind w:left="1440" w:hanging="360"/>
-      </w:pPr>
-      <w:rPr>
-        <w:rFonts w:ascii="Courier New" w:hAnsi="Courier New" w:cs="Courier New" w:hint="default"/>
-      </w:rPr>
-    </w:lvl>
-    <w:lvl w:ilvl="2" w:tplc="04090005" w:tentative="1">
-      <w:start w:val="1"/>
-      <w:numFmt w:val="bullet"/>
-      <w:lvlText w:val=""/>
-      <w:lvlJc w:val="left"/>
-      <w:pPr>
-        <w:ind w:left="2160" w:hanging="360"/>
-      </w:pPr>
-      <w:rPr>
-        <w:rFonts w:ascii="Wingdings" w:hAnsi="Wingdings" w:hint="default"/>
-      </w:rPr>
-    </w:lvl>
-    <w:lvl w:ilvl="3" w:tplc="04090001" w:tentative="1">
-      <w:start w:val="1"/>
-      <w:numFmt w:val="bullet"/>
-      <w:lvlText w:val=""/>
-      <w:lvlJc w:val="left"/>
-      <w:pPr>
-        <w:ind w:left="2880" w:hanging="360"/>
-      </w:pPr>
-      <w:rPr>
-        <w:rFonts w:ascii="Symbol" w:hAnsi="Symbol" w:hint="default"/>
-      </w:rPr>
-    </w:lvl>
-    <w:lvl w:ilvl="4" w:tplc="04090003" w:tentative="1">
-      <w:start w:val="1"/>
-      <w:numFmt w:val="bullet"/>
-      <w:lvlText w:val="o"/>
-      <w:lvlJc w:val="left"/>
-      <w:pPr>
-        <w:ind w:left="3600" w:hanging="360"/>
-      </w:pPr>
-      <w:rPr>
-        <w:rFonts w:ascii="Courier New" w:hAnsi="Courier New" w:cs="Courier New" w:hint="default"/>
-      </w:rPr>
-    </w:lvl>
-    <w:lvl w:ilvl="5" w:tplc="04090005" w:tentative="1">
-      <w:start w:val="1"/>
-      <w:numFmt w:val="bullet"/>
-      <w:lvlText w:val=""/>
-      <w:lvlJc w:val="left"/>
-      <w:pPr>
-        <w:ind w:left="4320" w:hanging="360"/>
-      </w:pPr>
-      <w:rPr>
-        <w:rFonts w:ascii="Wingdings" w:hAnsi="Wingdings" w:hint="default"/>
-      </w:rPr>
-    </w:lvl>
-    <w:lvl w:ilvl="6" w:tplc="04090001" w:tentative="1">
-      <w:start w:val="1"/>
-      <w:numFmt w:val="bullet"/>
-      <w:lvlText w:val=""/>
-      <w:lvlJc w:val="left"/>
-      <w:pPr>
-        <w:ind w:left="5040" w:hanging="360"/>
-      </w:pPr>
-      <w:rPr>
-        <w:rFonts w:ascii="Symbol" w:hAnsi="Symbol" w:hint="default"/>
-      </w:rPr>
-    </w:lvl>
-    <w:lvl w:ilvl="7" w:tplc="04090003" w:tentative="1">
-      <w:start w:val="1"/>
-      <w:numFmt w:val="bullet"/>
-      <w:lvlText w:val="o"/>
-      <w:lvlJc w:val="left"/>
-      <w:pPr>
-        <w:ind w:left="5760" w:hanging="360"/>
-      </w:pPr>
-      <w:rPr>
-        <w:rFonts w:ascii="Courier New" w:hAnsi="Courier New" w:cs="Courier New" w:hint="default"/>
-      </w:rPr>
-    </w:lvl>
-    <w:lvl w:ilvl="8" w:tplc="04090005" w:tentative="1">
-      <w:start w:val="1"/>
-      <w:numFmt w:val="bullet"/>
-      <w:lvlText w:val=""/>
-      <w:lvlJc w:val="left"/>
-      <w:pPr>
-        <w:ind w:left="6480" w:hanging="360"/>
-      </w:pPr>
-      <w:rPr>
-        <w:rFonts w:ascii="Wingdings" w:hAnsi="Wingdings" w:hint="default"/>
-      </w:rPr>
-    </w:lvl>
-  </w:abstractNum>
-  <w:abstractNum w:abstractNumId="2" w15:restartNumberingAfterBreak="0">
     <w:nsid w:val="15244CAF"/>
     <w:multiLevelType w:val="hybridMultilevel"/>
     <w:tmpl w:val="4F98EAD2"/>
@@ -6422,7 +6600,7 @@
       </w:pPr>
     </w:lvl>
   </w:abstractNum>
-  <w:abstractNum w:abstractNumId="3" w15:restartNumberingAfterBreak="0">
+  <w:abstractNum w:abstractNumId="2" w15:restartNumberingAfterBreak="0">
     <w:nsid w:val="1C977F7A"/>
     <w:multiLevelType w:val="hybridMultilevel"/>
     <w:tmpl w:val="71926C2A"/>
@@ -6535,7 +6713,7 @@
       </w:rPr>
     </w:lvl>
   </w:abstractNum>
-  <w:abstractNum w:abstractNumId="4" w15:restartNumberingAfterBreak="0">
+  <w:abstractNum w:abstractNumId="3" w15:restartNumberingAfterBreak="0">
     <w:nsid w:val="1D5C12BF"/>
     <w:multiLevelType w:val="hybridMultilevel"/>
     <w:tmpl w:val="ED963A4A"/>
@@ -6626,7 +6804,7 @@
       </w:pPr>
     </w:lvl>
   </w:abstractNum>
-  <w:abstractNum w:abstractNumId="5" w15:restartNumberingAfterBreak="0">
+  <w:abstractNum w:abstractNumId="4" w15:restartNumberingAfterBreak="0">
     <w:nsid w:val="1FA954EA"/>
     <w:multiLevelType w:val="hybridMultilevel"/>
     <w:tmpl w:val="B52E15D0"/>
@@ -6717,7 +6895,7 @@
       </w:pPr>
     </w:lvl>
   </w:abstractNum>
-  <w:abstractNum w:abstractNumId="6" w15:restartNumberingAfterBreak="0">
+  <w:abstractNum w:abstractNumId="5" w15:restartNumberingAfterBreak="0">
     <w:nsid w:val="20CB564A"/>
     <w:multiLevelType w:val="hybridMultilevel"/>
     <w:tmpl w:val="E354D238"/>
@@ -6808,7 +6986,7 @@
       </w:pPr>
     </w:lvl>
   </w:abstractNum>
-  <w:abstractNum w:abstractNumId="7" w15:restartNumberingAfterBreak="0">
+  <w:abstractNum w:abstractNumId="6" w15:restartNumberingAfterBreak="0">
     <w:nsid w:val="27273C86"/>
     <w:multiLevelType w:val="multilevel"/>
     <w:tmpl w:val="B9BCDED8"/>
@@ -6906,7 +7084,7 @@
       </w:pPr>
     </w:lvl>
   </w:abstractNum>
-  <w:abstractNum w:abstractNumId="8" w15:restartNumberingAfterBreak="0">
+  <w:abstractNum w:abstractNumId="7" w15:restartNumberingAfterBreak="0">
     <w:nsid w:val="29EF6E58"/>
     <w:multiLevelType w:val="hybridMultilevel"/>
     <w:tmpl w:val="7132068A"/>
@@ -7019,7 +7197,7 @@
       </w:rPr>
     </w:lvl>
   </w:abstractNum>
-  <w:abstractNum w:abstractNumId="9" w15:restartNumberingAfterBreak="0">
+  <w:abstractNum w:abstractNumId="8" w15:restartNumberingAfterBreak="0">
     <w:nsid w:val="2A3F7C4E"/>
     <w:multiLevelType w:val="hybridMultilevel"/>
     <w:tmpl w:val="3EF48A80"/>
@@ -7132,7 +7310,7 @@
       </w:rPr>
     </w:lvl>
   </w:abstractNum>
-  <w:abstractNum w:abstractNumId="10" w15:restartNumberingAfterBreak="0">
+  <w:abstractNum w:abstractNumId="9" w15:restartNumberingAfterBreak="0">
     <w:nsid w:val="2EA771BC"/>
     <w:multiLevelType w:val="hybridMultilevel"/>
     <w:tmpl w:val="044674F4"/>
@@ -7221,7 +7399,7 @@
       </w:pPr>
     </w:lvl>
   </w:abstractNum>
-  <w:abstractNum w:abstractNumId="11" w15:restartNumberingAfterBreak="0">
+  <w:abstractNum w:abstractNumId="10" w15:restartNumberingAfterBreak="0">
     <w:nsid w:val="34D64688"/>
     <w:multiLevelType w:val="hybridMultilevel"/>
     <w:tmpl w:val="931E65CE"/>
@@ -7310,7 +7488,7 @@
       </w:pPr>
     </w:lvl>
   </w:abstractNum>
-  <w:abstractNum w:abstractNumId="12" w15:restartNumberingAfterBreak="0">
+  <w:abstractNum w:abstractNumId="11" w15:restartNumberingAfterBreak="0">
     <w:nsid w:val="37D7788E"/>
     <w:multiLevelType w:val="hybridMultilevel"/>
     <w:tmpl w:val="527A739C"/>
@@ -7423,7 +7601,7 @@
       </w:rPr>
     </w:lvl>
   </w:abstractNum>
-  <w:abstractNum w:abstractNumId="13" w15:restartNumberingAfterBreak="0">
+  <w:abstractNum w:abstractNumId="12" w15:restartNumberingAfterBreak="0">
     <w:nsid w:val="445945FF"/>
     <w:multiLevelType w:val="hybridMultilevel"/>
     <w:tmpl w:val="704C968E"/>
@@ -7514,7 +7692,7 @@
       </w:pPr>
     </w:lvl>
   </w:abstractNum>
-  <w:abstractNum w:abstractNumId="14" w15:restartNumberingAfterBreak="0">
+  <w:abstractNum w:abstractNumId="13" w15:restartNumberingAfterBreak="0">
     <w:nsid w:val="5C822FE4"/>
     <w:multiLevelType w:val="hybridMultilevel"/>
     <w:tmpl w:val="FA0C2DC8"/>
@@ -7627,7 +7805,7 @@
       </w:rPr>
     </w:lvl>
   </w:abstractNum>
-  <w:abstractNum w:abstractNumId="15" w15:restartNumberingAfterBreak="0">
+  <w:abstractNum w:abstractNumId="14" w15:restartNumberingAfterBreak="0">
     <w:nsid w:val="5CD93586"/>
     <w:multiLevelType w:val="hybridMultilevel"/>
     <w:tmpl w:val="16BA2172"/>
@@ -7740,7 +7918,7 @@
       </w:rPr>
     </w:lvl>
   </w:abstractNum>
-  <w:abstractNum w:abstractNumId="16" w15:restartNumberingAfterBreak="0">
+  <w:abstractNum w:abstractNumId="15" w15:restartNumberingAfterBreak="0">
     <w:nsid w:val="60764717"/>
     <w:multiLevelType w:val="hybridMultilevel"/>
     <w:tmpl w:val="AFC46098"/>
@@ -7831,7 +8009,7 @@
       </w:pPr>
     </w:lvl>
   </w:abstractNum>
-  <w:abstractNum w:abstractNumId="17" w15:restartNumberingAfterBreak="0">
+  <w:abstractNum w:abstractNumId="16" w15:restartNumberingAfterBreak="0">
     <w:nsid w:val="650F469B"/>
     <w:multiLevelType w:val="hybridMultilevel"/>
     <w:tmpl w:val="310AB5D8"/>
@@ -7922,7 +8100,7 @@
       </w:pPr>
     </w:lvl>
   </w:abstractNum>
-  <w:abstractNum w:abstractNumId="18" w15:restartNumberingAfterBreak="0">
+  <w:abstractNum w:abstractNumId="17" w15:restartNumberingAfterBreak="0">
     <w:nsid w:val="673D6D12"/>
     <w:multiLevelType w:val="multilevel"/>
     <w:tmpl w:val="24120F3E"/>
@@ -8035,7 +8213,7 @@
       </w:rPr>
     </w:lvl>
   </w:abstractNum>
-  <w:abstractNum w:abstractNumId="19" w15:restartNumberingAfterBreak="0">
+  <w:abstractNum w:abstractNumId="18" w15:restartNumberingAfterBreak="0">
     <w:nsid w:val="75480D31"/>
     <w:multiLevelType w:val="hybridMultilevel"/>
     <w:tmpl w:val="EEB40D14"/>
@@ -8126,7 +8304,7 @@
       </w:pPr>
     </w:lvl>
   </w:abstractNum>
-  <w:abstractNum w:abstractNumId="20" w15:restartNumberingAfterBreak="0">
+  <w:abstractNum w:abstractNumId="19" w15:restartNumberingAfterBreak="0">
     <w:nsid w:val="763F1865"/>
     <w:multiLevelType w:val="hybridMultilevel"/>
     <w:tmpl w:val="C214F9EE"/>
@@ -8217,7 +8395,7 @@
       </w:pPr>
     </w:lvl>
   </w:abstractNum>
-  <w:abstractNum w:abstractNumId="21" w15:restartNumberingAfterBreak="0">
+  <w:abstractNum w:abstractNumId="20" w15:restartNumberingAfterBreak="0">
     <w:nsid w:val="7ED92D86"/>
     <w:multiLevelType w:val="hybridMultilevel"/>
     <w:tmpl w:val="22383626"/>
@@ -8308,7 +8486,7 @@
       </w:pPr>
     </w:lvl>
   </w:abstractNum>
-  <w:abstractNum w:abstractNumId="22" w15:restartNumberingAfterBreak="0">
+  <w:abstractNum w:abstractNumId="21" w15:restartNumberingAfterBreak="0">
     <w:nsid w:val="7F8A1DB9"/>
     <w:multiLevelType w:val="hybridMultilevel"/>
     <w:tmpl w:val="B68A698C"/>
@@ -8400,73 +8578,70 @@
     </w:lvl>
   </w:abstractNum>
   <w:num w:numId="1" w16cid:durableId="1892114746">
-    <w:abstractNumId w:val="7"/>
+    <w:abstractNumId w:val="6"/>
   </w:num>
   <w:num w:numId="2" w16cid:durableId="2140874696">
+    <w:abstractNumId w:val="13"/>
+  </w:num>
+  <w:num w:numId="3" w16cid:durableId="221723370">
     <w:abstractNumId w:val="14"/>
   </w:num>
-  <w:num w:numId="3" w16cid:durableId="221723370">
-    <w:abstractNumId w:val="15"/>
-  </w:num>
   <w:num w:numId="4" w16cid:durableId="1562593782">
-    <w:abstractNumId w:val="9"/>
+    <w:abstractNumId w:val="8"/>
   </w:num>
   <w:num w:numId="5" w16cid:durableId="1659727706">
-    <w:abstractNumId w:val="11"/>
+    <w:abstractNumId w:val="10"/>
   </w:num>
   <w:num w:numId="6" w16cid:durableId="672145141">
-    <w:abstractNumId w:val="4"/>
+    <w:abstractNumId w:val="3"/>
   </w:num>
   <w:num w:numId="7" w16cid:durableId="1069885794">
-    <w:abstractNumId w:val="19"/>
+    <w:abstractNumId w:val="18"/>
   </w:num>
   <w:num w:numId="8" w16cid:durableId="232391577">
-    <w:abstractNumId w:val="10"/>
+    <w:abstractNumId w:val="9"/>
   </w:num>
   <w:num w:numId="9" w16cid:durableId="142703922">
     <w:abstractNumId w:val="0"/>
   </w:num>
   <w:num w:numId="10" w16cid:durableId="591162208">
-    <w:abstractNumId w:val="18"/>
+    <w:abstractNumId w:val="17"/>
   </w:num>
   <w:num w:numId="11" w16cid:durableId="309554352">
+    <w:abstractNumId w:val="19"/>
+  </w:num>
+  <w:num w:numId="12" w16cid:durableId="1169296955">
+    <w:abstractNumId w:val="21"/>
+  </w:num>
+  <w:num w:numId="13" w16cid:durableId="1417895371">
+    <w:abstractNumId w:val="12"/>
+  </w:num>
+  <w:num w:numId="14" w16cid:durableId="616716407">
     <w:abstractNumId w:val="20"/>
   </w:num>
-  <w:num w:numId="12" w16cid:durableId="1169296955">
-    <w:abstractNumId w:val="22"/>
+  <w:num w:numId="15" w16cid:durableId="464546260">
+    <w:abstractNumId w:val="4"/>
   </w:num>
-  <w:num w:numId="13" w16cid:durableId="1417895371">
-    <w:abstractNumId w:val="13"/>
+  <w:num w:numId="16" w16cid:durableId="1889106262">
+    <w:abstractNumId w:val="7"/>
   </w:num>
-  <w:num w:numId="14" w16cid:durableId="616716407">
-    <w:abstractNumId w:val="21"/>
+  <w:num w:numId="17" w16cid:durableId="1883858149">
+    <w:abstractNumId w:val="5"/>
   </w:num>
-  <w:num w:numId="15" w16cid:durableId="1310591573">
+  <w:num w:numId="18" w16cid:durableId="950816471">
     <w:abstractNumId w:val="1"/>
   </w:num>
-  <w:num w:numId="16" w16cid:durableId="464546260">
-    <w:abstractNumId w:val="5"/>
-  </w:num>
-  <w:num w:numId="17" w16cid:durableId="1889106262">
-    <w:abstractNumId w:val="8"/>
-  </w:num>
-  <w:num w:numId="18" w16cid:durableId="1883858149">
-    <w:abstractNumId w:val="6"/>
-  </w:num>
-  <w:num w:numId="19" w16cid:durableId="950816471">
+  <w:num w:numId="19" w16cid:durableId="1152676521">
     <w:abstractNumId w:val="2"/>
   </w:num>
-  <w:num w:numId="20" w16cid:durableId="1152676521">
-    <w:abstractNumId w:val="3"/>
+  <w:num w:numId="20" w16cid:durableId="1938781819">
+    <w:abstractNumId w:val="15"/>
   </w:num>
-  <w:num w:numId="21" w16cid:durableId="1938781819">
+  <w:num w:numId="21" w16cid:durableId="808592372">
     <w:abstractNumId w:val="16"/>
   </w:num>
-  <w:num w:numId="22" w16cid:durableId="808592372">
-    <w:abstractNumId w:val="17"/>
-  </w:num>
-  <w:num w:numId="23" w16cid:durableId="1448504018">
-    <w:abstractNumId w:val="12"/>
+  <w:num w:numId="22" w16cid:durableId="1448504018">
+    <w:abstractNumId w:val="11"/>
   </w:num>
   <w:numIdMacAtCleanup w:val="1"/>
 </w:numbering>
@@ -8872,7 +9047,7 @@
   <w:style w:type="paragraph" w:default="1" w:styleId="Normal">
     <w:name w:val="Normal"/>
     <w:qFormat/>
-    <w:rsid w:val="00D17922"/>
+    <w:rsid w:val="004A2F63"/>
   </w:style>
   <w:style w:type="paragraph" w:styleId="Heading1">
     <w:name w:val="heading 1"/>
@@ -8882,10 +9057,11 @@
     <w:autoRedefine/>
     <w:uiPriority w:val="9"/>
     <w:qFormat/>
-    <w:rsid w:val="00BE5C94"/>
+    <w:rsid w:val="0030019A"/>
     <w:pPr>
       <w:keepNext/>
       <w:keepLines/>
+      <w:pageBreakBefore/>
       <w:numPr>
         <w:numId w:val="1"/>
       </w:numPr>
@@ -8893,7 +9069,6 @@
         <w:bottom w:val="single" w:sz="8" w:space="1" w:color="4F7ABA"/>
       </w:pBdr>
       <w:spacing w:before="60" w:after="300"/>
-      <w:ind w:right="-562"/>
       <w:outlineLvl w:val="0"/>
     </w:pPr>
     <w:rPr>
@@ -8914,7 +9089,7 @@
     <w:uiPriority w:val="9"/>
     <w:unhideWhenUsed/>
     <w:qFormat/>
-    <w:rsid w:val="00741061"/>
+    <w:rsid w:val="0030019A"/>
     <w:pPr>
       <w:keepNext/>
       <w:keepLines/>
@@ -8942,7 +9117,7 @@
     <w:uiPriority w:val="9"/>
     <w:unhideWhenUsed/>
     <w:qFormat/>
-    <w:rsid w:val="00741061"/>
+    <w:rsid w:val="0030019A"/>
     <w:pPr>
       <w:keepNext/>
       <w:keepLines/>
@@ -9148,7 +9323,7 @@
     <w:basedOn w:val="DefaultParagraphFont"/>
     <w:link w:val="Heading1"/>
     <w:uiPriority w:val="9"/>
-    <w:rsid w:val="00BE5C94"/>
+    <w:rsid w:val="0030019A"/>
     <w:rPr>
       <w:rFonts w:eastAsiaTheme="majorEastAsia" w:cstheme="majorBidi"/>
       <w:b/>
@@ -9163,7 +9338,7 @@
     <w:basedOn w:val="DefaultParagraphFont"/>
     <w:link w:val="Heading2"/>
     <w:uiPriority w:val="9"/>
-    <w:rsid w:val="00741061"/>
+    <w:rsid w:val="0030019A"/>
     <w:rPr>
       <w:rFonts w:eastAsiaTheme="majorEastAsia" w:cstheme="majorBidi"/>
       <w:b/>
@@ -9177,7 +9352,7 @@
     <w:basedOn w:val="DefaultParagraphFont"/>
     <w:link w:val="Heading3"/>
     <w:uiPriority w:val="9"/>
-    <w:rsid w:val="00741061"/>
+    <w:rsid w:val="0030019A"/>
     <w:rPr>
       <w:rFonts w:eastAsiaTheme="majorEastAsia" w:cstheme="majorBidi"/>
       <w:color w:val="4F7ABA"/>
@@ -9484,11 +9659,12 @@
     <w:link w:val="ZTERSTitleChar"/>
     <w:autoRedefine/>
     <w:qFormat/>
-    <w:rsid w:val="003C6066"/>
+    <w:rsid w:val="0030019A"/>
     <w:pPr>
       <w:pBdr>
         <w:left w:val="single" w:sz="48" w:space="10" w:color="4F7ABA"/>
       </w:pBdr>
+      <w:ind w:left="720" w:right="720"/>
     </w:pPr>
     <w:rPr>
       <w:rFonts w:ascii="Segoe UI" w:hAnsi="Segoe UI"/>
@@ -9502,7 +9678,7 @@
     <w:name w:val="ZTERS Title Char"/>
     <w:basedOn w:val="DefaultParagraphFont"/>
     <w:link w:val="ZTERSTitle"/>
-    <w:rsid w:val="003C6066"/>
+    <w:rsid w:val="0030019A"/>
     <w:rPr>
       <w:rFonts w:ascii="Segoe UI" w:hAnsi="Segoe UI"/>
       <w:b/>
@@ -9572,18 +9748,15 @@
     <w:uiPriority w:val="39"/>
     <w:unhideWhenUsed/>
     <w:qFormat/>
-    <w:rsid w:val="00DC4CEF"/>
+    <w:rsid w:val="0030019A"/>
     <w:pPr>
       <w:numPr>
         <w:numId w:val="0"/>
       </w:numPr>
-      <w:spacing w:before="240" w:after="0"/>
       <w:outlineLvl w:val="9"/>
     </w:pPr>
     <w:rPr>
       <w:rFonts w:asciiTheme="majorHAnsi" w:hAnsiTheme="majorHAnsi"/>
-      <w:b w:val="0"/>
-      <w:color w:val="0F4761" w:themeColor="accent1" w:themeShade="BF"/>
       <w:kern w:val="0"/>
       <w:sz w:val="32"/>
       <w:szCs w:val="32"/>
@@ -9597,16 +9770,14 @@
     <w:autoRedefine/>
     <w:uiPriority w:val="39"/>
     <w:unhideWhenUsed/>
-    <w:rsid w:val="003F572E"/>
+    <w:rsid w:val="0030019A"/>
     <w:pPr>
-      <w:tabs>
-        <w:tab w:val="left" w:pos="440"/>
-        <w:tab w:val="right" w:leader="dot" w:pos="8828"/>
-      </w:tabs>
       <w:spacing w:after="120" w:line="240" w:lineRule="auto"/>
       <w:ind w:left="288" w:hanging="288"/>
     </w:pPr>
     <w:rPr>
+      <w:b/>
+      <w:caps/>
       <w:noProof/>
     </w:rPr>
   </w:style>
@@ -9617,12 +9788,8 @@
     <w:autoRedefine/>
     <w:uiPriority w:val="39"/>
     <w:unhideWhenUsed/>
-    <w:rsid w:val="00650792"/>
+    <w:rsid w:val="0030019A"/>
     <w:pPr>
-      <w:tabs>
-        <w:tab w:val="left" w:pos="960"/>
-        <w:tab w:val="right" w:leader="dot" w:pos="8828"/>
-      </w:tabs>
       <w:spacing w:after="100"/>
       <w:ind w:left="648" w:hanging="432"/>
     </w:pPr>
@@ -9634,7 +9801,7 @@
     <w:autoRedefine/>
     <w:uiPriority w:val="39"/>
     <w:unhideWhenUsed/>
-    <w:rsid w:val="00DC4CEF"/>
+    <w:rsid w:val="0030019A"/>
     <w:pPr>
       <w:spacing w:after="100"/>
       <w:ind w:left="440"/>
@@ -9659,7 +9826,7 @@
     <w:basedOn w:val="DefaultParagraphFont"/>
     <w:uiPriority w:val="22"/>
     <w:qFormat/>
-    <w:rsid w:val="00297C76"/>
+    <w:rsid w:val="004A2F63"/>
     <w:rPr>
       <w:b/>
       <w:bCs/>

</xml_diff>